<commit_message>
Remove AiDPix/Dosing references from public artifacts.
Neutralize docs, demos and npm examples; rename legacy tools/fixtures; drop internal skins from git; add confidentiality policy to CLAUDE.md. Publish gulp-mu-css 2.4.1 and gulp-mu-ft 0.1.3.
</commit_message>
<xml_diff>
--- a/gulp-mu-css/docs/microCSS-de.docx
+++ b/gulp-mu-css/docs/microCSS-de.docx
@@ -136,7 +136,7 @@
           <w:sz w:val="24"/>
           <w:szCs w:val="24"/>
         </w:rPr>
-        <w:t>Version 2.3.1</w:t>
+        <w:t>Version 2.4.1</w:t>
       </w:r>
     </w:p>
     <w:p>
@@ -215,7 +215,7 @@
             </w:rPr>
             <w:fldChar w:fldCharType="separate"/>
           </w:r>
-          <w:hyperlink w:anchor="__RefHeading___Toc4040_2565116786" w:tooltip="1 Einführung">
+          <w:hyperlink w:anchor="__RefHeading___Toc4040_2286783217" w:tooltip="1 Einführung">
             <w:r>
               <w:rPr>
                 <w:rStyle w:val="Verzeichnissprung"/>
@@ -235,7 +235,7 @@
             </w:tabs>
             <w:rPr/>
           </w:pPr>
-          <w:hyperlink w:anchor="__RefHeading___Toc4042_2565116786" w:tooltip="1.1 Werkzeuge und Kosten">
+          <w:hyperlink w:anchor="__RefHeading___Toc4042_2286783217" w:tooltip="1.1 Werkzeuge und Kosten">
             <w:r>
               <w:rPr>
                 <w:rStyle w:val="Verzeichnissprung"/>
@@ -255,7 +255,7 @@
             </w:tabs>
             <w:rPr/>
           </w:pPr>
-          <w:hyperlink w:anchor="__RefHeading___Toc4044_2565116786" w:tooltip="1.2 Draft-Workflow (Affinity + Watch)">
+          <w:hyperlink w:anchor="__RefHeading___Toc4044_2286783217" w:tooltip="1.2 Draft-Workflow (Affinity + Watch)">
             <w:r>
               <w:rPr>
                 <w:rStyle w:val="Verzeichnissprung"/>
@@ -275,7 +275,7 @@
             </w:tabs>
             <w:rPr/>
           </w:pPr>
-          <w:hyperlink w:anchor="__RefHeading___Toc4046_2565116786" w:tooltip="1.3 Einordnung: Warum µCSS?">
+          <w:hyperlink w:anchor="__RefHeading___Toc4046_2286783217" w:tooltip="1.3 Einordnung: Warum µCSS?">
             <w:r>
               <w:rPr>
                 <w:rStyle w:val="Verzeichnissprung"/>
@@ -295,7 +295,7 @@
             </w:tabs>
             <w:rPr/>
           </w:pPr>
-          <w:hyperlink w:anchor="__RefHeading___Toc4048_2565116786" w:tooltip="2 Installation und Start">
+          <w:hyperlink w:anchor="__RefHeading___Toc4048_2286783217" w:tooltip="2 Installation und Start">
             <w:r>
               <w:rPr>
                 <w:rStyle w:val="Verzeichnissprung"/>
@@ -315,7 +315,7 @@
             </w:tabs>
             <w:rPr/>
           </w:pPr>
-          <w:hyperlink w:anchor="__RefHeading___Toc4050_2565116786" w:tooltip="3 Anwendungsfälle">
+          <w:hyperlink w:anchor="__RefHeading___Toc4050_2286783217" w:tooltip="3 Anwendungsfälle">
             <w:r>
               <w:rPr>
                 <w:rStyle w:val="Verzeichnissprung"/>
@@ -335,7 +335,7 @@
             </w:tabs>
             <w:rPr/>
           </w:pPr>
-          <w:hyperlink w:anchor="__RefHeading___Toc4052_2565116786" w:tooltip="3.1 Benannte Eigenschaften (Variablen)">
+          <w:hyperlink w:anchor="__RefHeading___Toc4052_2286783217" w:tooltip="3.1 Benannte Eigenschaften (Variablen)">
             <w:r>
               <w:rPr>
                 <w:rStyle w:val="Verzeichnissprung"/>
@@ -355,7 +355,7 @@
             </w:tabs>
             <w:rPr/>
           </w:pPr>
-          <w:hyperlink w:anchor="__RefHeading___Toc4054_2565116786" w:tooltip="3.2 Berechnungen und Ausdrücke">
+          <w:hyperlink w:anchor="__RefHeading___Toc4054_2286783217" w:tooltip="3.2 Berechnungen und Ausdrücke">
             <w:r>
               <w:rPr>
                 <w:rStyle w:val="Verzeichnissprung"/>
@@ -375,7 +375,7 @@
             </w:tabs>
             <w:rPr/>
           </w:pPr>
-          <w:hyperlink w:anchor="__RefHeading___Toc4056_2565116786" w:tooltip="3.3 Mehrere Layouts über Skin-Manifeste">
+          <w:hyperlink w:anchor="__RefHeading___Toc4056_2286783217" w:tooltip="3.3 Mehrere Layouts über Skin-Manifeste">
             <w:r>
               <w:rPr>
                 <w:rStyle w:val="Verzeichnissprung"/>
@@ -395,7 +395,7 @@
             </w:tabs>
             <w:rPr/>
           </w:pPr>
-          <w:hyperlink w:anchor="__RefHeading___Toc4058_2565116786" w:tooltip="3.4 Automatische Sprite-Generierung">
+          <w:hyperlink w:anchor="__RefHeading___Toc4058_2286783217" w:tooltip="3.4 Automatische Sprite-Generierung">
             <w:r>
               <w:rPr>
                 <w:rStyle w:val="Verzeichnissprung"/>
@@ -415,7 +415,7 @@
             </w:tabs>
             <w:rPr/>
           </w:pPr>
-          <w:hyperlink w:anchor="__RefHeading___Toc4060_2565116786" w:tooltip="3.5 Bilder vorladen (Preload)">
+          <w:hyperlink w:anchor="__RefHeading___Toc4060_2286783217" w:tooltip="3.5 Bilder vorladen (Preload)">
             <w:r>
               <w:rPr>
                 <w:rStyle w:val="Verzeichnissprung"/>
@@ -435,7 +435,7 @@
             </w:tabs>
             <w:rPr/>
           </w:pPr>
-          <w:hyperlink w:anchor="__RefHeading___Toc4062_2565116786" w:tooltip="3.6 Cursor mit Hotspot und Fallback">
+          <w:hyperlink w:anchor="__RefHeading___Toc4062_2286783217" w:tooltip="3.6 Cursor mit Hotspot und Fallback">
             <w:r>
               <w:rPr>
                 <w:rStyle w:val="Verzeichnissprung"/>
@@ -455,7 +455,7 @@
             </w:tabs>
             <w:rPr/>
           </w:pPr>
-          <w:hyperlink w:anchor="__RefHeading___Toc4064_2565116786" w:tooltip="3.7 Automatische Bilderzeugung (media-Steps)">
+          <w:hyperlink w:anchor="__RefHeading___Toc4064_2286783217" w:tooltip="3.7 Automatische Bilderzeugung (media-Steps)">
             <w:r>
               <w:rPr>
                 <w:rStyle w:val="Verzeichnissprung"/>
@@ -475,7 +475,7 @@
             </w:tabs>
             <w:rPr/>
           </w:pPr>
-          <w:hyperlink w:anchor="__RefHeading___Toc4066_2565116786" w:tooltip="4 microPS (µPS) — Bildgeneratoren">
+          <w:hyperlink w:anchor="__RefHeading___Toc4066_2286783217" w:tooltip="4 microPS (µPS) — Bildgeneratoren">
             <w:r>
               <w:rPr>
                 <w:rStyle w:val="Verzeichnissprung"/>
@@ -495,7 +495,7 @@
             </w:tabs>
             <w:rPr/>
           </w:pPr>
-          <w:hyperlink w:anchor="__RefHeading___Toc4068_2565116786" w:tooltip="4.1 API-Übersicht">
+          <w:hyperlink w:anchor="__RefHeading___Toc4068_2286783217" w:tooltip="4.1 API-Übersicht">
             <w:r>
               <w:rPr>
                 <w:rStyle w:val="Verzeichnissprung"/>
@@ -515,7 +515,7 @@
             </w:tabs>
             <w:rPr/>
           </w:pPr>
-          <w:hyperlink w:anchor="__RefHeading___Toc4070_2565116786" w:tooltip="4.2 ButtonAndIconCreator">
+          <w:hyperlink w:anchor="__RefHeading___Toc4070_2286783217" w:tooltip="4.2 ButtonAndIconCreator">
             <w:r>
               <w:rPr>
                 <w:rStyle w:val="Verzeichnissprung"/>
@@ -535,7 +535,7 @@
             </w:tabs>
             <w:rPr/>
           </w:pPr>
-          <w:hyperlink w:anchor="__RefHeading___Toc4072_2565116786" w:tooltip="4.2.1 CreateByTopLayerSets — ein Bild pro Gruppe">
+          <w:hyperlink w:anchor="__RefHeading___Toc4072_2286783217" w:tooltip="4.2.1 CreateByTopLayerSets — ein Bild pro Gruppe">
             <w:r>
               <w:rPr>
                 <w:rStyle w:val="Verzeichnissprung"/>
@@ -555,7 +555,7 @@
             </w:tabs>
             <w:rPr/>
           </w:pPr>
-          <w:hyperlink w:anchor="__RefHeading___Toc4074_2565116786" w:tooltip="4.3 AppIconMaker">
+          <w:hyperlink w:anchor="__RefHeading___Toc4074_2286783217" w:tooltip="4.3 AppIconMaker">
             <w:r>
               <w:rPr>
                 <w:rStyle w:val="Verzeichnissprung"/>
@@ -575,7 +575,7 @@
             </w:tabs>
             <w:rPr/>
           </w:pPr>
-          <w:hyperlink w:anchor="__RefHeading___Toc4076_2565116786" w:tooltip="4.4 SpriteAtlas und TileSheet">
+          <w:hyperlink w:anchor="__RefHeading___Toc4076_2286783217" w:tooltip="4.4 SpriteAtlas und TileSheet">
             <w:r>
               <w:rPr>
                 <w:rStyle w:val="Verzeichnissprung"/>
@@ -595,7 +595,7 @@
             </w:tabs>
             <w:rPr/>
           </w:pPr>
-          <w:hyperlink w:anchor="__RefHeading___Toc4078_2565116786" w:tooltip="4.5 SequenceStrip und DSD-Format">
+          <w:hyperlink w:anchor="__RefHeading___Toc4078_2286783217" w:tooltip="4.5 SequenceStrip und DSD-Format">
             <w:r>
               <w:rPr>
                 <w:rStyle w:val="Verzeichnissprung"/>
@@ -615,7 +615,7 @@
             </w:tabs>
             <w:rPr/>
           </w:pPr>
-          <w:hyperlink w:anchor="__RefHeading___Toc4080_2565116786" w:tooltip="4.5.1 DSD erzeugen (`CreateDsdFromImages`)">
+          <w:hyperlink w:anchor="__RefHeading___Toc4080_2286783217" w:tooltip="4.5.1 DSD erzeugen (`CreateDsdFromImages`)">
             <w:r>
               <w:rPr>
                 <w:rStyle w:val="Verzeichnissprung"/>
@@ -635,7 +635,7 @@
             </w:tabs>
             <w:rPr/>
           </w:pPr>
-          <w:hyperlink w:anchor="__RefHeading___Toc4082_2565116786" w:tooltip="4.5.2 PSD-Sequenzgruppen">
+          <w:hyperlink w:anchor="__RefHeading___Toc4082_2286783217" w:tooltip="4.5.2 PSD-Sequenzgruppen">
             <w:r>
               <w:rPr>
                 <w:rStyle w:val="Verzeichnissprung"/>
@@ -655,7 +655,7 @@
             </w:tabs>
             <w:rPr/>
           </w:pPr>
-          <w:hyperlink w:anchor="__RefHeading___Toc4084_2565116786" w:tooltip="4.6 Raster-Modell, I/O und Arbeitsblatt">
+          <w:hyperlink w:anchor="__RefHeading___Toc4084_2286783217" w:tooltip="4.6 Raster-Modell, I/O und Arbeitsblatt">
             <w:r>
               <w:rPr>
                 <w:rStyle w:val="Verzeichnissprung"/>
@@ -675,7 +675,7 @@
             </w:tabs>
             <w:rPr/>
           </w:pPr>
-          <w:hyperlink w:anchor="__RefHeading___Toc4086_2565116786" w:tooltip="4.7 Bildanpassungen und Masken">
+          <w:hyperlink w:anchor="__RefHeading___Toc4086_2286783217" w:tooltip="4.7 Bildanpassungen und Masken">
             <w:r>
               <w:rPr>
                 <w:rStyle w:val="Verzeichnissprung"/>
@@ -695,7 +695,7 @@
             </w:tabs>
             <w:rPr/>
           </w:pPr>
-          <w:hyperlink w:anchor="__RefHeading___Toc4088_2565116786" w:tooltip="4.7.1 Masken">
+          <w:hyperlink w:anchor="__RefHeading___Toc4088_2286783217" w:tooltip="4.7.1 Masken">
             <w:r>
               <w:rPr>
                 <w:rStyle w:val="Verzeichnissprung"/>
@@ -715,7 +715,7 @@
             </w:tabs>
             <w:rPr/>
           </w:pPr>
-          <w:hyperlink w:anchor="__RefHeading___Toc4090_2565116786" w:tooltip="4.7.2 Auswahl-Engine">
+          <w:hyperlink w:anchor="__RefHeading___Toc4090_2286783217" w:tooltip="4.7.2 Auswahl-Engine">
             <w:r>
               <w:rPr>
                 <w:rStyle w:val="Verzeichnissprung"/>
@@ -735,7 +735,7 @@
             </w:tabs>
             <w:rPr/>
           </w:pPr>
-          <w:hyperlink w:anchor="__RefHeading___Toc4092_2565116786" w:tooltip="4.7.3 ApplyGamma">
+          <w:hyperlink w:anchor="__RefHeading___Toc4092_2286783217" w:tooltip="4.7.3 ApplyGamma">
             <w:r>
               <w:rPr>
                 <w:rStyle w:val="Verzeichnissprung"/>
@@ -755,7 +755,7 @@
             </w:tabs>
             <w:rPr/>
           </w:pPr>
-          <w:hyperlink w:anchor="__RefHeading___Toc4094_2565116786" w:tooltip="4.7.4 ApplyBrightnessContrast">
+          <w:hyperlink w:anchor="__RefHeading___Toc4094_2286783217" w:tooltip="4.7.4 ApplyBrightnessContrast">
             <w:r>
               <w:rPr>
                 <w:rStyle w:val="Verzeichnissprung"/>
@@ -775,7 +775,7 @@
             </w:tabs>
             <w:rPr/>
           </w:pPr>
-          <w:hyperlink w:anchor="__RefHeading___Toc4096_2565116786" w:tooltip="4.7.5 ApplyHueSaturation">
+          <w:hyperlink w:anchor="__RefHeading___Toc4096_2286783217" w:tooltip="4.7.5 ApplyHueSaturation">
             <w:r>
               <w:rPr>
                 <w:rStyle w:val="Verzeichnissprung"/>
@@ -795,7 +795,7 @@
             </w:tabs>
             <w:rPr/>
           </w:pPr>
-          <w:hyperlink w:anchor="__RefHeading___Toc4098_2565116786" w:tooltip="4.7.6 ApplyAdjustmentStack">
+          <w:hyperlink w:anchor="__RefHeading___Toc4098_2286783217" w:tooltip="4.7.6 ApplyAdjustmentStack">
             <w:r>
               <w:rPr>
                 <w:rStyle w:val="Verzeichnissprung"/>
@@ -815,7 +815,7 @@
             </w:tabs>
             <w:rPr/>
           </w:pPr>
-          <w:hyperlink w:anchor="__RefHeading___Toc4100_2565116786" w:tooltip="4.8 Raster-Transformationen">
+          <w:hyperlink w:anchor="__RefHeading___Toc4100_2286783217" w:tooltip="4.8 Raster-Transformationen">
             <w:r>
               <w:rPr>
                 <w:rStyle w:val="Verzeichnissprung"/>
@@ -835,7 +835,7 @@
             </w:tabs>
             <w:rPr/>
           </w:pPr>
-          <w:hyperlink w:anchor="__RefHeading___Toc4102_2565116786" w:tooltip="4.9 ExtendScript-Einstieg (`MuPsDoc`)">
+          <w:hyperlink w:anchor="__RefHeading___Toc4102_2286783217" w:tooltip="4.9 ExtendScript-Einstieg (`MuPsDoc`)">
             <w:r>
               <w:rPr>
                 <w:rStyle w:val="Verzeichnissprung"/>
@@ -855,7 +855,7 @@
             </w:tabs>
             <w:rPr/>
           </w:pPr>
-          <w:hyperlink w:anchor="__RefHeading___Toc4104_2565116786" w:tooltip="4.10 PSD-Compositor und Ebenenzusammenführung">
+          <w:hyperlink w:anchor="__RefHeading___Toc4104_2286783217" w:tooltip="4.10 PSD-Compositor und Ebenenzusammenführung">
             <w:r>
               <w:rPr>
                 <w:rStyle w:val="Verzeichnissprung"/>
@@ -875,7 +875,7 @@
             </w:tabs>
             <w:rPr/>
           </w:pPr>
-          <w:hyperlink w:anchor="__RefHeading___Toc4106_2565116786" w:tooltip="4.10.1 Nachgebildete Fülloptionen">
+          <w:hyperlink w:anchor="__RefHeading___Toc4106_2286783217" w:tooltip="4.10.1 Nachgebildete Fülloptionen">
             <w:r>
               <w:rPr>
                 <w:rStyle w:val="Verzeichnissprung"/>
@@ -895,7 +895,7 @@
             </w:tabs>
             <w:rPr/>
           </w:pPr>
-          <w:hyperlink w:anchor="__RefHeading___Toc4108_2565116786" w:tooltip="4.10.2 Stilübertragung vs. Ebenenverknüpfung">
+          <w:hyperlink w:anchor="__RefHeading___Toc4108_2286783217" w:tooltip="4.10.2 Stilübertragung vs. Ebenenverknüpfung">
             <w:r>
               <w:rPr>
                 <w:rStyle w:val="Verzeichnissprung"/>
@@ -915,7 +915,7 @@
             </w:tabs>
             <w:rPr/>
           </w:pPr>
-          <w:hyperlink w:anchor="__RefHeading___Toc4110_2565116786" w:tooltip="4.10.3 Deckkraft-Modell (drei getrennte Stellschrauben)">
+          <w:hyperlink w:anchor="__RefHeading___Toc4110_2286783217" w:tooltip="4.10.3 Deckkraft-Modell (drei getrennte Stellschrauben)">
             <w:r>
               <w:rPr>
                 <w:rStyle w:val="Verzeichnissprung"/>
@@ -935,7 +935,7 @@
             </w:tabs>
             <w:rPr/>
           </w:pPr>
-          <w:hyperlink w:anchor="__RefHeading___Toc4112_2565116786" w:tooltip="4.10.4 Referenz-PSD und Adobe-Ground-Truth">
+          <w:hyperlink w:anchor="__RefHeading___Toc4112_2286783217" w:tooltip="4.10.4 Referenz-PSD und Adobe-Ground-Truth">
             <w:r>
               <w:rPr>
                 <w:rStyle w:val="Verzeichnissprung"/>
@@ -955,7 +955,7 @@
             </w:tabs>
             <w:rPr/>
           </w:pPr>
-          <w:hyperlink w:anchor="__RefHeading___Toc4114_2565116786" w:tooltip="4.10.5 Werkzeuge (µPS-Entwicklung)">
+          <w:hyperlink w:anchor="__RefHeading___Toc4114_2286783217" w:tooltip="4.10.5 Werkzeuge (µPS-Entwicklung)">
             <w:r>
               <w:rPr>
                 <w:rStyle w:val="Verzeichnissprung"/>
@@ -975,7 +975,7 @@
             </w:tabs>
             <w:rPr/>
           </w:pPr>
-          <w:hyperlink w:anchor="__RefHeading___Toc4116_2565116786" w:tooltip="4.11 Draft-Workflow (Affinity + Watch)">
+          <w:hyperlink w:anchor="__RefHeading___Toc4116_2286783217" w:tooltip="4.11 Draft-Workflow (Affinity + Watch)">
             <w:r>
               <w:rPr>
                 <w:rStyle w:val="Verzeichnissprung"/>
@@ -995,7 +995,7 @@
             </w:tabs>
             <w:rPr/>
           </w:pPr>
-          <w:hyperlink w:anchor="__RefHeading___Toc4118_2565116786" w:tooltip="4.11.1 Zwischenschritte raw → final (`outputBase`)">
+          <w:hyperlink w:anchor="__RefHeading___Toc4118_2286783217" w:tooltip="4.11.1 Zwischenschritte raw → final (`outputBase`)">
             <w:r>
               <w:rPr>
                 <w:rStyle w:val="Verzeichnissprung"/>
@@ -1015,7 +1015,7 @@
             </w:tabs>
             <w:rPr/>
           </w:pPr>
-          <w:hyperlink w:anchor="__RefHeading___Toc4120_2565116786" w:tooltip="5 microAU (µAU) — Sound-Atlas">
+          <w:hyperlink w:anchor="__RefHeading___Toc4120_2286783217" w:tooltip="5 microAU (µAU) — Sound-Atlas">
             <w:r>
               <w:rPr>
                 <w:rStyle w:val="Verzeichnissprung"/>
@@ -1035,7 +1035,7 @@
             </w:tabs>
             <w:rPr/>
           </w:pPr>
-          <w:hyperlink w:anchor="__RefHeading___Toc4122_2565116786" w:tooltip="5.1 API-Übersicht">
+          <w:hyperlink w:anchor="__RefHeading___Toc4122_2286783217" w:tooltip="5.1 API-Übersicht">
             <w:r>
               <w:rPr>
                 <w:rStyle w:val="Verzeichnissprung"/>
@@ -1055,7 +1055,7 @@
             </w:tabs>
             <w:rPr/>
           </w:pPr>
-          <w:hyperlink w:anchor="__RefHeading___Toc4124_2565116786" w:tooltip="5.2 SoundAtlasMaker">
+          <w:hyperlink w:anchor="__RefHeading___Toc4124_2286783217" w:tooltip="5.2 SoundAtlasMaker">
             <w:r>
               <w:rPr>
                 <w:rStyle w:val="Verzeichnissprung"/>
@@ -1075,7 +1075,7 @@
             </w:tabs>
             <w:rPr/>
           </w:pPr>
-          <w:hyperlink w:anchor="__RefHeading___Toc4126_2565116786" w:tooltip="5.2.1 Loop-Punkte im Dateinamen">
+          <w:hyperlink w:anchor="__RefHeading___Toc4126_2286783217" w:tooltip="5.2.1 Loop-Punkte im Dateinamen">
             <w:r>
               <w:rPr>
                 <w:rStyle w:val="Verzeichnissprung"/>
@@ -1095,7 +1095,7 @@
             </w:tabs>
             <w:rPr/>
           </w:pPr>
-          <w:hyperlink w:anchor="__RefHeading___Toc4128_2565116786" w:tooltip="5.2.2 JSON-Format">
+          <w:hyperlink w:anchor="__RefHeading___Toc4128_2286783217" w:tooltip="5.2.2 JSON-Format">
             <w:r>
               <w:rPr>
                 <w:rStyle w:val="Verzeichnissprung"/>
@@ -1115,7 +1115,7 @@
             </w:tabs>
             <w:rPr/>
           </w:pPr>
-          <w:hyperlink w:anchor="__RefHeading___Toc4130_2565116786" w:tooltip="5.2.3 MP3-Eingaben">
+          <w:hyperlink w:anchor="__RefHeading___Toc4130_2286783217" w:tooltip="5.2.3 MP3-Eingaben">
             <w:r>
               <w:rPr>
                 <w:rStyle w:val="Verzeichnissprung"/>
@@ -1135,7 +1135,7 @@
             </w:tabs>
             <w:rPr/>
           </w:pPr>
-          <w:hyperlink w:anchor="__RefHeading___Toc4132_2565116786" w:tooltip="5.3 Anbindung an µCSS (Manifest `sounds`)">
+          <w:hyperlink w:anchor="__RefHeading___Toc4132_2286783217" w:tooltip="5.3 Anbindung an µCSS (Manifest `sounds`)">
             <w:r>
               <w:rPr>
                 <w:rStyle w:val="Verzeichnissprung"/>
@@ -1155,7 +1155,7 @@
             </w:tabs>
             <w:rPr/>
           </w:pPr>
-          <w:hyperlink w:anchor="__RefHeading___Toc4134_2565116786" w:tooltip="6 microFT (µFT) — Icon-Font">
+          <w:hyperlink w:anchor="__RefHeading___Toc4134_2286783217" w:tooltip="6 microFT (µFT) — Icon-Font">
             <w:r>
               <w:rPr>
                 <w:rStyle w:val="Verzeichnissprung"/>
@@ -1175,7 +1175,7 @@
             </w:tabs>
             <w:rPr/>
           </w:pPr>
-          <w:hyperlink w:anchor="__RefHeading___Toc4136_2565116786" w:tooltip="6.1 Glyphen-Benennung">
+          <w:hyperlink w:anchor="__RefHeading___Toc4136_2286783217" w:tooltip="6.1 Glyphen-Benennung">
             <w:r>
               <w:rPr>
                 <w:rStyle w:val="Verzeichnissprung"/>
@@ -1195,7 +1195,7 @@
             </w:tabs>
             <w:rPr/>
           </w:pPr>
-          <w:hyperlink w:anchor="__RefHeading___Toc4138_2565116786" w:tooltip="6.2 FontGenerator">
+          <w:hyperlink w:anchor="__RefHeading___Toc4138_2286783217" w:tooltip="6.2 FontGenerator">
             <w:r>
               <w:rPr>
                 <w:rStyle w:val="Verzeichnissprung"/>
@@ -1215,7 +1215,7 @@
             </w:tabs>
             <w:rPr/>
           </w:pPr>
-          <w:hyperlink w:anchor="__RefHeading___Toc4140_2565116786" w:tooltip="6.3 API-Bausteine">
+          <w:hyperlink w:anchor="__RefHeading___Toc4140_2286783217" w:tooltip="6.3 API-Bausteine">
             <w:r>
               <w:rPr>
                 <w:rStyle w:val="Verzeichnissprung"/>
@@ -1235,7 +1235,7 @@
             </w:tabs>
             <w:rPr/>
           </w:pPr>
-          <w:hyperlink w:anchor="__RefHeading___Toc4142_2565116786" w:tooltip="6.4 Anbindung an µCSS">
+          <w:hyperlink w:anchor="__RefHeading___Toc4142_2286783217" w:tooltip="6.4 Anbindung an µCSS">
             <w:r>
               <w:rPr>
                 <w:rStyle w:val="Verzeichnissprung"/>
@@ -1255,7 +1255,7 @@
             </w:tabs>
             <w:rPr/>
           </w:pPr>
-          <w:hyperlink w:anchor="__RefHeading___Toc4144_2565116786" w:tooltip="7 Vue und Komponenten-Co-Location">
+          <w:hyperlink w:anchor="__RefHeading___Toc4144_2286783217" w:tooltip="7 Vue und Komponenten-Co-Location">
             <w:r>
               <w:rPr>
                 <w:rStyle w:val="Verzeichnissprung"/>
@@ -1275,7 +1275,7 @@
             </w:tabs>
             <w:rPr/>
           </w:pPr>
-          <w:hyperlink w:anchor="__RefHeading___Toc4146_2565116786" w:tooltip="7.1 Ablauf">
+          <w:hyperlink w:anchor="__RefHeading___Toc4146_2286783217" w:tooltip="7.1 Ablauf">
             <w:r>
               <w:rPr>
                 <w:rStyle w:val="Verzeichnissprung"/>
@@ -1295,7 +1295,7 @@
             </w:tabs>
             <w:rPr/>
           </w:pPr>
-          <w:hyperlink w:anchor="__RefHeading___Toc4148_2565116786" w:tooltip="7.2 Namespaces und globale State-Klassen">
+          <w:hyperlink w:anchor="__RefHeading___Toc4148_2286783217" w:tooltip="7.2 Namespaces und globale State-Klassen">
             <w:r>
               <w:rPr>
                 <w:rStyle w:val="Verzeichnissprung"/>
@@ -1315,7 +1315,7 @@
             </w:tabs>
             <w:rPr/>
           </w:pPr>
-          <w:hyperlink w:anchor="__RefHeading___Toc4150_2565116786" w:tooltip="7.3 Bestehende Vue-SFCs migrieren">
+          <w:hyperlink w:anchor="__RefHeading___Toc4150_2286783217" w:tooltip="7.3 Bestehende Vue-SFCs migrieren">
             <w:r>
               <w:rPr>
                 <w:rStyle w:val="Verzeichnissprung"/>
@@ -1335,7 +1335,7 @@
             </w:tabs>
             <w:rPr/>
           </w:pPr>
-          <w:hyperlink w:anchor="__RefHeading___Toc4152_2565116786" w:tooltip="8 Grundideen von µCSS">
+          <w:hyperlink w:anchor="__RefHeading___Toc4152_2286783217" w:tooltip="8 Grundideen von µCSS">
             <w:r>
               <w:rPr>
                 <w:rStyle w:val="Verzeichnissprung"/>
@@ -1355,7 +1355,7 @@
             </w:tabs>
             <w:rPr/>
           </w:pPr>
-          <w:hyperlink w:anchor="__RefHeading___Toc4154_2565116786" w:tooltip="8.1 Das .µ.css-Format">
+          <w:hyperlink w:anchor="__RefHeading___Toc4154_2286783217" w:tooltip="8.1 Das .µ.css-Format">
             <w:r>
               <w:rPr>
                 <w:rStyle w:val="Verzeichnissprung"/>
@@ -1375,7 +1375,7 @@
             </w:tabs>
             <w:rPr/>
           </w:pPr>
-          <w:hyperlink w:anchor="__RefHeading___Toc4156_2565116786" w:tooltip="8.2 Werte-Interpolation µ(Ausdruck)">
+          <w:hyperlink w:anchor="__RefHeading___Toc4156_2286783217" w:tooltip="8.2 Werte-Interpolation µ(Ausdruck)">
             <w:r>
               <w:rPr>
                 <w:rStyle w:val="Verzeichnissprung"/>
@@ -1395,7 +1395,7 @@
             </w:tabs>
             <w:rPr/>
           </w:pPr>
-          <w:hyperlink w:anchor="__RefHeading___Toc4158_2565116786" w:tooltip="8.3 Direktiven -µ: Ausdruck">
+          <w:hyperlink w:anchor="__RefHeading___Toc4158_2286783217" w:tooltip="8.3 Direktiven -µ: Ausdruck">
             <w:r>
               <w:rPr>
                 <w:rStyle w:val="Verzeichnissprung"/>
@@ -1415,7 +1415,7 @@
             </w:tabs>
             <w:rPr/>
           </w:pPr>
-          <w:hyperlink w:anchor="__RefHeading___Toc4160_2565116786" w:tooltip="8.4 Das Skin-Manifest">
+          <w:hyperlink w:anchor="__RefHeading___Toc4160_2286783217" w:tooltip="8.4 Das Skin-Manifest">
             <w:r>
               <w:rPr>
                 <w:rStyle w:val="Verzeichnissprung"/>
@@ -1435,7 +1435,7 @@
             </w:tabs>
             <w:rPr/>
           </w:pPr>
-          <w:hyperlink w:anchor="__RefHeading___Toc4162_2565116786" w:tooltip="8.5 JavaScript ohne Ersatzzeichen">
+          <w:hyperlink w:anchor="__RefHeading___Toc4162_2286783217" w:tooltip="8.5 JavaScript ohne Ersatzzeichen">
             <w:r>
               <w:rPr>
                 <w:rStyle w:val="Verzeichnissprung"/>
@@ -1455,7 +1455,7 @@
             </w:tabs>
             <w:rPr/>
           </w:pPr>
-          <w:hyperlink w:anchor="__RefHeading___Toc4164_2565116786" w:tooltip="9 Build-Ablauf und Gulp-Integration">
+          <w:hyperlink w:anchor="__RefHeading___Toc4164_2286783217" w:tooltip="9 Build-Ablauf und Gulp-Integration">
             <w:r>
               <w:rPr>
                 <w:rStyle w:val="Verzeichnissprung"/>
@@ -1475,7 +1475,7 @@
             </w:tabs>
             <w:rPr/>
           </w:pPr>
-          <w:hyperlink w:anchor="__RefHeading___Toc4166_2565116786" w:tooltip="9.1 Verzeichniskonventionen">
+          <w:hyperlink w:anchor="__RefHeading___Toc4166_2286783217" w:tooltip="9.1 Verzeichniskonventionen">
             <w:r>
               <w:rPr>
                 <w:rStyle w:val="Verzeichnissprung"/>
@@ -1495,7 +1495,7 @@
             </w:tabs>
             <w:rPr/>
           </w:pPr>
-          <w:hyperlink w:anchor="__RefHeading___Toc4168_2565116786" w:tooltip="9.2 Kompilierungs-Ablauf">
+          <w:hyperlink w:anchor="__RefHeading___Toc4168_2286783217" w:tooltip="9.2 Kompilierungs-Ablauf">
             <w:r>
               <w:rPr>
                 <w:rStyle w:val="Verzeichnissprung"/>
@@ -1515,7 +1515,7 @@
             </w:tabs>
             <w:rPr/>
           </w:pPr>
-          <w:hyperlink w:anchor="__RefHeading___Toc4170_2565116786" w:tooltip="9.3 Inkrementeller Build und Cache">
+          <w:hyperlink w:anchor="__RefHeading___Toc4170_2286783217" w:tooltip="9.3 Inkrementeller Build und Cache">
             <w:r>
               <w:rPr>
                 <w:rStyle w:val="Verzeichnissprung"/>
@@ -1535,7 +1535,7 @@
             </w:tabs>
             <w:rPr/>
           </w:pPr>
-          <w:hyperlink w:anchor="__RefHeading___Toc4172_2565116786" w:tooltip="9.4 Gulp-Tasks und Watch">
+          <w:hyperlink w:anchor="__RefHeading___Toc4172_2286783217" w:tooltip="9.4 Gulp-Tasks und Watch">
             <w:r>
               <w:rPr>
                 <w:rStyle w:val="Verzeichnissprung"/>
@@ -1555,7 +1555,7 @@
             </w:tabs>
             <w:rPr/>
           </w:pPr>
-          <w:hyperlink w:anchor="__RefHeading___Toc4174_2565116786" w:tooltip="10 Manifest-Referenz (DefineSkin)">
+          <w:hyperlink w:anchor="__RefHeading___Toc4174_2286783217" w:tooltip="10 Manifest-Referenz (DefineSkin)">
             <w:r>
               <w:rPr>
                 <w:rStyle w:val="Verzeichnissprung"/>
@@ -1575,7 +1575,7 @@
             </w:tabs>
             <w:rPr/>
           </w:pPr>
-          <w:hyperlink w:anchor="__RefHeading___Toc4176_2565116786" w:tooltip="10.1 vars">
+          <w:hyperlink w:anchor="__RefHeading___Toc4176_2286783217" w:tooltip="10.1 vars">
             <w:r>
               <w:rPr>
                 <w:rStyle w:val="Verzeichnissprung"/>
@@ -1595,7 +1595,7 @@
             </w:tabs>
             <w:rPr/>
           </w:pPr>
-          <w:hyperlink w:anchor="__RefHeading___Toc4178_2565116786" w:tooltip="10.2 helpers">
+          <w:hyperlink w:anchor="__RefHeading___Toc4178_2286783217" w:tooltip="10.2 helpers">
             <w:r>
               <w:rPr>
                 <w:rStyle w:val="Verzeichnissprung"/>
@@ -1615,7 +1615,7 @@
             </w:tabs>
             <w:rPr/>
           </w:pPr>
-          <w:hyperlink w:anchor="__RefHeading___Toc4180_2565116786" w:tooltip="10.3 cursors">
+          <w:hyperlink w:anchor="__RefHeading___Toc4180_2286783217" w:tooltip="10.3 cursors">
             <w:r>
               <w:rPr>
                 <w:rStyle w:val="Verzeichnissprung"/>
@@ -1635,7 +1635,7 @@
             </w:tabs>
             <w:rPr/>
           </w:pPr>
-          <w:hyperlink w:anchor="__RefHeading___Toc4182_2565116786" w:tooltip="10.4 media">
+          <w:hyperlink w:anchor="__RefHeading___Toc4182_2286783217" w:tooltip="10.4 media">
             <w:r>
               <w:rPr>
                 <w:rStyle w:val="Verzeichnissprung"/>
@@ -1655,7 +1655,7 @@
             </w:tabs>
             <w:rPr/>
           </w:pPr>
-          <w:hyperlink w:anchor="__RefHeading___Toc4184_2565116786" w:tooltip="10.5 imageFormat">
+          <w:hyperlink w:anchor="__RefHeading___Toc4184_2286783217" w:tooltip="10.5 imageFormat">
             <w:r>
               <w:rPr>
                 <w:rStyle w:val="Verzeichnissprung"/>
@@ -1675,7 +1675,7 @@
             </w:tabs>
             <w:rPr/>
           </w:pPr>
-          <w:hyperlink w:anchor="__RefHeading___Toc4186_2565116786" w:tooltip="10.6 sprites">
+          <w:hyperlink w:anchor="__RefHeading___Toc4186_2286783217" w:tooltip="10.6 sprites">
             <w:r>
               <w:rPr>
                 <w:rStyle w:val="Verzeichnissprung"/>
@@ -1695,7 +1695,7 @@
             </w:tabs>
             <w:rPr/>
           </w:pPr>
-          <w:hyperlink w:anchor="__RefHeading___Toc4188_2565116786" w:tooltip="10.7 sounds">
+          <w:hyperlink w:anchor="__RefHeading___Toc4188_2286783217" w:tooltip="10.7 sounds">
             <w:r>
               <w:rPr>
                 <w:rStyle w:val="Verzeichnissprung"/>
@@ -1715,7 +1715,7 @@
             </w:tabs>
             <w:rPr/>
           </w:pPr>
-          <w:hyperlink w:anchor="__RefHeading___Toc4190_2565116786" w:tooltip="10.8 files">
+          <w:hyperlink w:anchor="__RefHeading___Toc4190_2286783217" w:tooltip="10.8 files">
             <w:r>
               <w:rPr>
                 <w:rStyle w:val="Verzeichnissprung"/>
@@ -1735,7 +1735,7 @@
             </w:tabs>
             <w:rPr/>
           </w:pPr>
-          <w:hyperlink w:anchor="__RefHeading___Toc4192_2565116786" w:tooltip="11 µ-Auswertungskontext (Referenz)">
+          <w:hyperlink w:anchor="__RefHeading___Toc4192_2286783217" w:tooltip="11 µ-Auswertungskontext (Referenz)">
             <w:r>
               <w:rPr>
                 <w:rStyle w:val="Verzeichnissprung"/>
@@ -1755,7 +1755,7 @@
             </w:tabs>
             <w:rPr/>
           </w:pPr>
-          <w:hyperlink w:anchor="__RefHeading___Toc4194_2565116786" w:tooltip="11.1 Das $-Objekt">
+          <w:hyperlink w:anchor="__RefHeading___Toc4194_2286783217" w:tooltip="11.1 Das $-Objekt">
             <w:r>
               <w:rPr>
                 <w:rStyle w:val="Verzeichnissprung"/>
@@ -1775,7 +1775,7 @@
             </w:tabs>
             <w:rPr/>
           </w:pPr>
-          <w:hyperlink w:anchor="__RefHeading___Toc4196_2565116786" w:tooltip="11.2 Farb- und Wert-Funktionen">
+          <w:hyperlink w:anchor="__RefHeading___Toc4196_2286783217" w:tooltip="11.2 Farb- und Wert-Funktionen">
             <w:r>
               <w:rPr>
                 <w:rStyle w:val="Verzeichnissprung"/>
@@ -1795,7 +1795,7 @@
             </w:tabs>
             <w:rPr/>
           </w:pPr>
-          <w:hyperlink w:anchor="__RefHeading___Toc4198_2565116786" w:tooltip="11.3 Regel- und Dokument-Methoden">
+          <w:hyperlink w:anchor="__RefHeading___Toc4198_2286783217" w:tooltip="11.3 Regel- und Dokument-Methoden">
             <w:r>
               <w:rPr>
                 <w:rStyle w:val="Verzeichnissprung"/>
@@ -1815,7 +1815,7 @@
             </w:tabs>
             <w:rPr/>
           </w:pPr>
-          <w:hyperlink w:anchor="__RefHeading___Toc4200_2565116786" w:tooltip="11.4 Sprite()">
+          <w:hyperlink w:anchor="__RefHeading___Toc4200_2286783217" w:tooltip="11.4 Sprite()">
             <w:r>
               <w:rPr>
                 <w:rStyle w:val="Verzeichnissprung"/>
@@ -1835,7 +1835,7 @@
             </w:tabs>
             <w:rPr/>
           </w:pPr>
-          <w:hyperlink w:anchor="__RefHeading___Toc4202_2565116786" w:tooltip="11.5 Cursor()">
+          <w:hyperlink w:anchor="__RefHeading___Toc4202_2286783217" w:tooltip="11.5 Cursor()">
             <w:r>
               <w:rPr>
                 <w:rStyle w:val="Verzeichnissprung"/>
@@ -1855,7 +1855,7 @@
             </w:tabs>
             <w:rPr/>
           </w:pPr>
-          <w:hyperlink w:anchor="__RefHeading___Toc4204_2565116786" w:tooltip="11.6 Helper-Funktionen und this-Bindung">
+          <w:hyperlink w:anchor="__RefHeading___Toc4204_2286783217" w:tooltip="11.6 Helper-Funktionen und this-Bindung">
             <w:r>
               <w:rPr>
                 <w:rStyle w:val="Verzeichnissprung"/>
@@ -1875,7 +1875,7 @@
             </w:tabs>
             <w:rPr/>
           </w:pPr>
-          <w:hyperlink w:anchor="__RefHeading___Toc4206_2565116786" w:tooltip="11.7 afterWork-Hooks">
+          <w:hyperlink w:anchor="__RefHeading___Toc4206_2286783217" w:tooltip="11.7 afterWork-Hooks">
             <w:r>
               <w:rPr>
                 <w:rStyle w:val="Verzeichnissprung"/>
@@ -1895,7 +1895,7 @@
             </w:tabs>
             <w:rPr/>
           </w:pPr>
-          <w:hyperlink w:anchor="__RefHeading___Toc4208_2565116786" w:tooltip="12 Arbeiten mit Farben">
+          <w:hyperlink w:anchor="__RefHeading___Toc4208_2286783217" w:tooltip="12 Arbeiten mit Farben">
             <w:r>
               <w:rPr>
                 <w:rStyle w:val="Verzeichnissprung"/>
@@ -1915,7 +1915,7 @@
             </w:tabs>
             <w:rPr/>
           </w:pPr>
-          <w:hyperlink w:anchor="__RefHeading___Toc4210_2565116786" w:tooltip="12.1 Farben definieren">
+          <w:hyperlink w:anchor="__RefHeading___Toc4210_2286783217" w:tooltip="12.1 Farben definieren">
             <w:r>
               <w:rPr>
                 <w:rStyle w:val="Verzeichnissprung"/>
@@ -1935,7 +1935,7 @@
             </w:tabs>
             <w:rPr/>
           </w:pPr>
-          <w:hyperlink w:anchor="__RefHeading___Toc4212_2565116786" w:tooltip="12.2 Alpha-Werte">
+          <w:hyperlink w:anchor="__RefHeading___Toc4212_2286783217" w:tooltip="12.2 Alpha-Werte">
             <w:r>
               <w:rPr>
                 <w:rStyle w:val="Verzeichnissprung"/>
@@ -1955,7 +1955,7 @@
             </w:tabs>
             <w:rPr/>
           </w:pPr>
-          <w:hyperlink w:anchor="__RefHeading___Toc4214_2565116786" w:tooltip="12.3 Farbberechnungen">
+          <w:hyperlink w:anchor="__RefHeading___Toc4214_2286783217" w:tooltip="12.3 Farbberechnungen">
             <w:r>
               <w:rPr>
                 <w:rStyle w:val="Verzeichnissprung"/>
@@ -1975,7 +1975,7 @@
             </w:tabs>
             <w:rPr/>
           </w:pPr>
-          <w:hyperlink w:anchor="__RefHeading___Toc4216_2565116786" w:tooltip="13 Node-API">
+          <w:hyperlink w:anchor="__RefHeading___Toc4216_2286783217" w:tooltip="13 Node-API">
             <w:r>
               <w:rPr>
                 <w:rStyle w:val="Verzeichnissprung"/>
@@ -1995,7 +1995,7 @@
             </w:tabs>
             <w:rPr/>
           </w:pPr>
-          <w:hyperlink w:anchor="__RefHeading___Toc4218_2565116786" w:tooltip="14 Fehlerdiagnostik">
+          <w:hyperlink w:anchor="__RefHeading___Toc4218_2286783217" w:tooltip="14 Fehlerdiagnostik">
             <w:r>
               <w:rPr>
                 <w:rStyle w:val="Verzeichnissprung"/>
@@ -2015,7 +2015,7 @@
             </w:tabs>
             <w:rPr/>
           </w:pPr>
-          <w:hyperlink w:anchor="__RefHeading___Toc4220_2565116786" w:tooltip="15 Migration von µCSS">
+          <w:hyperlink w:anchor="__RefHeading___Toc4220_2286783217" w:tooltip="15 Migration von µCSS">
             <w:r>
               <w:rPr>
                 <w:rStyle w:val="Verzeichnissprung"/>
@@ -2035,7 +2035,7 @@
             </w:tabs>
             <w:rPr/>
           </w:pPr>
-          <w:hyperlink w:anchor="__RefHeading___Toc4222_2565116786" w:tooltip="16 Versionshistorie">
+          <w:hyperlink w:anchor="__RefHeading___Toc4222_2286783217" w:tooltip="16 Versionshistorie">
             <w:r>
               <w:rPr>
                 <w:rStyle w:val="Verzeichnissprung"/>
@@ -2055,7 +2055,7 @@
             </w:tabs>
             <w:rPr/>
           </w:pPr>
-          <w:hyperlink w:anchor="__RefHeading___Toc4224_2565116786" w:tooltip="17 Rechtliches">
+          <w:hyperlink w:anchor="__RefHeading___Toc4224_2286783217" w:tooltip="17 Rechtliches">
             <w:r>
               <w:rPr>
                 <w:rStyle w:val="Verzeichnissprung"/>
@@ -2075,7 +2075,7 @@
             </w:tabs>
             <w:rPr/>
           </w:pPr>
-          <w:hyperlink w:anchor="__RefHeading___Toc4226_2565116786" w:tooltip="17.1 MIT-Lizenz (Originaltext)">
+          <w:hyperlink w:anchor="__RefHeading___Toc4226_2286783217" w:tooltip="17.1 MIT-Lizenz (Originaltext)">
             <w:r>
               <w:rPr>
                 <w:rStyle w:val="Verzeichnissprung"/>
@@ -2095,7 +2095,7 @@
             </w:tabs>
             <w:rPr/>
           </w:pPr>
-          <w:hyperlink w:anchor="__RefHeading___Toc4228_2565116786" w:tooltip="17.2 Marken">
+          <w:hyperlink w:anchor="__RefHeading___Toc4228_2286783217" w:tooltip="17.2 Marken">
             <w:r>
               <w:rPr>
                 <w:rStyle w:val="Verzeichnissprung"/>
@@ -2115,7 +2115,7 @@
             </w:tabs>
             <w:rPr/>
           </w:pPr>
-          <w:hyperlink w:anchor="__RefHeading___Toc4230_2565116786" w:tooltip="17.3 Verwendete Bibliotheken">
+          <w:hyperlink w:anchor="__RefHeading___Toc4230_2286783217" w:tooltip="17.3 Verwendete Bibliotheken">
             <w:r>
               <w:rPr>
                 <w:rStyle w:val="Verzeichnissprung"/>
@@ -2166,7 +2166,7 @@
         <w:outlineLvl w:val="0"/>
         <w:rPr/>
       </w:pPr>
-      <w:bookmarkStart w:id="0" w:name="__RefHeading___Toc4040_2565116786"/>
+      <w:bookmarkStart w:id="0" w:name="__RefHeading___Toc4040_2286783217"/>
       <w:bookmarkEnd w:id="0"/>
       <w:r>
         <w:rPr/>
@@ -2547,7 +2547,7 @@
         <w:outlineLvl w:val="1"/>
         <w:rPr/>
       </w:pPr>
-      <w:bookmarkStart w:id="1" w:name="__RefHeading___Toc4042_2565116786"/>
+      <w:bookmarkStart w:id="1" w:name="__RefHeading___Toc4042_2286783217"/>
       <w:bookmarkEnd w:id="1"/>
       <w:r>
         <w:rPr/>
@@ -2622,7 +2622,7 @@
         <w:outlineLvl w:val="1"/>
         <w:rPr/>
       </w:pPr>
-      <w:bookmarkStart w:id="2" w:name="__RefHeading___Toc4044_2565116786"/>
+      <w:bookmarkStart w:id="2" w:name="__RefHeading___Toc4044_2286783217"/>
       <w:bookmarkEnd w:id="2"/>
       <w:r>
         <w:rPr/>
@@ -3168,7 +3168,7 @@
         <w:outlineLvl w:val="1"/>
         <w:rPr/>
       </w:pPr>
-      <w:bookmarkStart w:id="3" w:name="__RefHeading___Toc4046_2565116786"/>
+      <w:bookmarkStart w:id="3" w:name="__RefHeading___Toc4046_2286783217"/>
       <w:bookmarkEnd w:id="3"/>
       <w:r>
         <w:rPr/>
@@ -3817,7 +3817,7 @@
         <w:outlineLvl w:val="0"/>
         <w:rPr/>
       </w:pPr>
-      <w:bookmarkStart w:id="4" w:name="__RefHeading___Toc4048_2565116786"/>
+      <w:bookmarkStart w:id="4" w:name="__RefHeading___Toc4048_2286783217"/>
       <w:bookmarkEnd w:id="4"/>
       <w:r>
         <w:rPr/>
@@ -4143,7 +4143,7 @@
         <w:outlineLvl w:val="0"/>
         <w:rPr/>
       </w:pPr>
-      <w:bookmarkStart w:id="5" w:name="__RefHeading___Toc4050_2565116786"/>
+      <w:bookmarkStart w:id="5" w:name="__RefHeading___Toc4050_2286783217"/>
       <w:bookmarkEnd w:id="5"/>
       <w:r>
         <w:rPr/>
@@ -4173,7 +4173,7 @@
         <w:outlineLvl w:val="1"/>
         <w:rPr/>
       </w:pPr>
-      <w:bookmarkStart w:id="6" w:name="__RefHeading___Toc4052_2565116786"/>
+      <w:bookmarkStart w:id="6" w:name="__RefHeading___Toc4052_2286783217"/>
       <w:bookmarkEnd w:id="6"/>
       <w:r>
         <w:rPr/>
@@ -4830,7 +4830,7 @@
         <w:outlineLvl w:val="1"/>
         <w:rPr/>
       </w:pPr>
-      <w:bookmarkStart w:id="7" w:name="__RefHeading___Toc4054_2565116786"/>
+      <w:bookmarkStart w:id="7" w:name="__RefHeading___Toc4054_2286783217"/>
       <w:bookmarkEnd w:id="7"/>
       <w:r>
         <w:rPr/>
@@ -5208,7 +5208,7 @@
         <w:outlineLvl w:val="1"/>
         <w:rPr/>
       </w:pPr>
-      <w:bookmarkStart w:id="8" w:name="__RefHeading___Toc4056_2565116786"/>
+      <w:bookmarkStart w:id="8" w:name="__RefHeading___Toc4056_2286783217"/>
       <w:bookmarkEnd w:id="8"/>
       <w:r>
         <w:rPr/>
@@ -5526,7 +5526,7 @@
         <w:outlineLvl w:val="1"/>
         <w:rPr/>
       </w:pPr>
-      <w:bookmarkStart w:id="9" w:name="__RefHeading___Toc4058_2565116786"/>
+      <w:bookmarkStart w:id="9" w:name="__RefHeading___Toc4058_2286783217"/>
       <w:bookmarkEnd w:id="9"/>
       <w:r>
         <w:rPr/>
@@ -6158,7 +6158,7 @@
         <w:outlineLvl w:val="1"/>
         <w:rPr/>
       </w:pPr>
-      <w:bookmarkStart w:id="10" w:name="__RefHeading___Toc4060_2565116786"/>
+      <w:bookmarkStart w:id="10" w:name="__RefHeading___Toc4060_2286783217"/>
       <w:bookmarkEnd w:id="10"/>
       <w:r>
         <w:rPr/>
@@ -6334,7 +6334,7 @@
         <w:outlineLvl w:val="1"/>
         <w:rPr/>
       </w:pPr>
-      <w:bookmarkStart w:id="11" w:name="__RefHeading___Toc4062_2565116786"/>
+      <w:bookmarkStart w:id="11" w:name="__RefHeading___Toc4062_2286783217"/>
       <w:bookmarkEnd w:id="11"/>
       <w:r>
         <w:rPr/>
@@ -6699,7 +6699,7 @@
         <w:outlineLvl w:val="1"/>
         <w:rPr/>
       </w:pPr>
-      <w:bookmarkStart w:id="12" w:name="__RefHeading___Toc4064_2565116786"/>
+      <w:bookmarkStart w:id="12" w:name="__RefHeading___Toc4064_2286783217"/>
       <w:bookmarkEnd w:id="12"/>
       <w:r>
         <w:rPr/>
@@ -7433,7 +7433,7 @@
         <w:outlineLvl w:val="0"/>
         <w:rPr/>
       </w:pPr>
-      <w:bookmarkStart w:id="13" w:name="__RefHeading___Toc4066_2565116786"/>
+      <w:bookmarkStart w:id="13" w:name="__RefHeading___Toc4066_2286783217"/>
       <w:bookmarkEnd w:id="13"/>
       <w:r>
         <w:rPr/>
@@ -7595,7 +7595,7 @@
         <w:outlineLvl w:val="1"/>
         <w:rPr/>
       </w:pPr>
-      <w:bookmarkStart w:id="14" w:name="__RefHeading___Toc4068_2565116786"/>
+      <w:bookmarkStart w:id="14" w:name="__RefHeading___Toc4068_2286783217"/>
       <w:bookmarkEnd w:id="14"/>
       <w:r>
         <w:rPr/>
@@ -8907,7 +8907,7 @@
         <w:outlineLvl w:val="1"/>
         <w:rPr/>
       </w:pPr>
-      <w:bookmarkStart w:id="15" w:name="__RefHeading___Toc4070_2565116786"/>
+      <w:bookmarkStart w:id="15" w:name="__RefHeading___Toc4070_2286783217"/>
       <w:bookmarkEnd w:id="15"/>
       <w:r>
         <w:rPr/>
@@ -10029,7 +10029,7 @@
         <w:outlineLvl w:val="2"/>
         <w:rPr/>
       </w:pPr>
-      <w:bookmarkStart w:id="16" w:name="__RefHeading___Toc4072_2565116786"/>
+      <w:bookmarkStart w:id="16" w:name="__RefHeading___Toc4072_2286783217"/>
       <w:bookmarkEnd w:id="16"/>
       <w:r>
         <w:rPr/>
@@ -10268,7 +10268,7 @@
         <w:outlineLvl w:val="1"/>
         <w:rPr/>
       </w:pPr>
-      <w:bookmarkStart w:id="17" w:name="__RefHeading___Toc4074_2565116786"/>
+      <w:bookmarkStart w:id="17" w:name="__RefHeading___Toc4074_2286783217"/>
       <w:bookmarkEnd w:id="17"/>
       <w:r>
         <w:rPr/>
@@ -10428,7 +10428,7 @@
           <w:sz w:val="18"/>
           <w:szCs w:val="18"/>
         </w:rPr>
-        <w:t>appName: "AiDPix",</w:t>
+        <w:t>appName: "MyApp",</w:t>
       </w:r>
     </w:p>
     <w:p>
@@ -10894,7 +10894,7 @@
         <w:outlineLvl w:val="1"/>
         <w:rPr/>
       </w:pPr>
-      <w:bookmarkStart w:id="18" w:name="__RefHeading___Toc4076_2565116786"/>
+      <w:bookmarkStart w:id="18" w:name="__RefHeading___Toc4076_2286783217"/>
       <w:bookmarkEnd w:id="18"/>
       <w:r>
         <w:rPr/>
@@ -10959,7 +10959,7 @@
         <w:outlineLvl w:val="1"/>
         <w:rPr/>
       </w:pPr>
-      <w:bookmarkStart w:id="19" w:name="__RefHeading___Toc4078_2565116786"/>
+      <w:bookmarkStart w:id="19" w:name="__RefHeading___Toc4078_2286783217"/>
       <w:bookmarkEnd w:id="19"/>
       <w:r>
         <w:rPr/>
@@ -11368,7 +11368,7 @@
         <w:outlineLvl w:val="2"/>
         <w:rPr/>
       </w:pPr>
-      <w:bookmarkStart w:id="20" w:name="__RefHeading___Toc4080_2565116786"/>
+      <w:bookmarkStart w:id="20" w:name="__RefHeading___Toc4080_2286783217"/>
       <w:bookmarkEnd w:id="20"/>
       <w:r>
         <w:rPr/>
@@ -11666,7 +11666,7 @@
         <w:outlineLvl w:val="2"/>
         <w:rPr/>
       </w:pPr>
-      <w:bookmarkStart w:id="21" w:name="__RefHeading___Toc4082_2565116786"/>
+      <w:bookmarkStart w:id="21" w:name="__RefHeading___Toc4082_2286783217"/>
       <w:bookmarkEnd w:id="21"/>
       <w:r>
         <w:rPr/>
@@ -11830,7 +11830,7 @@
         <w:outlineLvl w:val="1"/>
         <w:rPr/>
       </w:pPr>
-      <w:bookmarkStart w:id="22" w:name="__RefHeading___Toc4084_2565116786"/>
+      <w:bookmarkStart w:id="22" w:name="__RefHeading___Toc4084_2286783217"/>
       <w:bookmarkEnd w:id="22"/>
       <w:r>
         <w:rPr/>
@@ -12764,7 +12764,7 @@
         <w:outlineLvl w:val="1"/>
         <w:rPr/>
       </w:pPr>
-      <w:bookmarkStart w:id="23" w:name="__RefHeading___Toc4086_2565116786"/>
+      <w:bookmarkStart w:id="23" w:name="__RefHeading___Toc4086_2286783217"/>
       <w:bookmarkEnd w:id="23"/>
       <w:r>
         <w:rPr/>
@@ -12816,7 +12816,7 @@
         <w:outlineLvl w:val="2"/>
         <w:rPr/>
       </w:pPr>
-      <w:bookmarkStart w:id="24" w:name="__RefHeading___Toc4088_2565116786"/>
+      <w:bookmarkStart w:id="24" w:name="__RefHeading___Toc4088_2286783217"/>
       <w:bookmarkEnd w:id="24"/>
       <w:r>
         <w:rPr/>
@@ -13139,7 +13139,7 @@
         <w:outlineLvl w:val="2"/>
         <w:rPr/>
       </w:pPr>
-      <w:bookmarkStart w:id="25" w:name="__RefHeading___Toc4090_2565116786"/>
+      <w:bookmarkStart w:id="25" w:name="__RefHeading___Toc4090_2286783217"/>
       <w:bookmarkEnd w:id="25"/>
       <w:r>
         <w:rPr/>
@@ -13780,7 +13780,7 @@
         <w:outlineLvl w:val="2"/>
         <w:rPr/>
       </w:pPr>
-      <w:bookmarkStart w:id="26" w:name="__RefHeading___Toc4092_2565116786"/>
+      <w:bookmarkStart w:id="26" w:name="__RefHeading___Toc4092_2286783217"/>
       <w:bookmarkEnd w:id="26"/>
       <w:r>
         <w:rPr/>
@@ -14254,7 +14254,7 @@
         <w:outlineLvl w:val="2"/>
         <w:rPr/>
       </w:pPr>
-      <w:bookmarkStart w:id="27" w:name="__RefHeading___Toc4094_2565116786"/>
+      <w:bookmarkStart w:id="27" w:name="__RefHeading___Toc4094_2286783217"/>
       <w:bookmarkEnd w:id="27"/>
       <w:r>
         <w:rPr/>
@@ -14629,7 +14629,7 @@
         <w:outlineLvl w:val="2"/>
         <w:rPr/>
       </w:pPr>
-      <w:bookmarkStart w:id="28" w:name="__RefHeading___Toc4096_2565116786"/>
+      <w:bookmarkStart w:id="28" w:name="__RefHeading___Toc4096_2286783217"/>
       <w:bookmarkEnd w:id="28"/>
       <w:r>
         <w:rPr/>
@@ -15020,7 +15020,7 @@
         <w:outlineLvl w:val="2"/>
         <w:rPr/>
       </w:pPr>
-      <w:bookmarkStart w:id="29" w:name="__RefHeading___Toc4098_2565116786"/>
+      <w:bookmarkStart w:id="29" w:name="__RefHeading___Toc4098_2286783217"/>
       <w:bookmarkEnd w:id="29"/>
       <w:r>
         <w:rPr/>
@@ -15417,7 +15417,7 @@
         <w:outlineLvl w:val="1"/>
         <w:rPr/>
       </w:pPr>
-      <w:bookmarkStart w:id="30" w:name="__RefHeading___Toc4100_2565116786"/>
+      <w:bookmarkStart w:id="30" w:name="__RefHeading___Toc4100_2286783217"/>
       <w:bookmarkEnd w:id="30"/>
       <w:r>
         <w:rPr/>
@@ -16473,7 +16473,7 @@
         <w:outlineLvl w:val="1"/>
         <w:rPr/>
       </w:pPr>
-      <w:bookmarkStart w:id="31" w:name="__RefHeading___Toc4102_2565116786"/>
+      <w:bookmarkStart w:id="31" w:name="__RefHeading___Toc4102_2286783217"/>
       <w:bookmarkEnd w:id="31"/>
       <w:r>
         <w:rPr/>
@@ -17676,7 +17676,7 @@
         <w:outlineLvl w:val="1"/>
         <w:rPr/>
       </w:pPr>
-      <w:bookmarkStart w:id="32" w:name="__RefHeading___Toc4104_2565116786"/>
+      <w:bookmarkStart w:id="32" w:name="__RefHeading___Toc4104_2286783217"/>
       <w:bookmarkEnd w:id="32"/>
       <w:r>
         <w:rPr/>
@@ -17805,7 +17805,7 @@
         <w:outlineLvl w:val="2"/>
         <w:rPr/>
       </w:pPr>
-      <w:bookmarkStart w:id="33" w:name="__RefHeading___Toc4106_2565116786"/>
+      <w:bookmarkStart w:id="33" w:name="__RefHeading___Toc4106_2286783217"/>
       <w:bookmarkEnd w:id="33"/>
       <w:r>
         <w:rPr/>
@@ -18008,7 +18008,7 @@
         <w:outlineLvl w:val="2"/>
         <w:rPr/>
       </w:pPr>
-      <w:bookmarkStart w:id="34" w:name="__RefHeading___Toc4108_2565116786"/>
+      <w:bookmarkStart w:id="34" w:name="__RefHeading___Toc4108_2286783217"/>
       <w:bookmarkEnd w:id="34"/>
       <w:r>
         <w:rPr/>
@@ -18073,7 +18073,7 @@
         <w:outlineLvl w:val="2"/>
         <w:rPr/>
       </w:pPr>
-      <w:bookmarkStart w:id="35" w:name="__RefHeading___Toc4110_2565116786"/>
+      <w:bookmarkStart w:id="35" w:name="__RefHeading___Toc4110_2286783217"/>
       <w:bookmarkEnd w:id="35"/>
       <w:r>
         <w:rPr/>
@@ -18506,7 +18506,7 @@
         <w:outlineLvl w:val="2"/>
         <w:rPr/>
       </w:pPr>
-      <w:bookmarkStart w:id="36" w:name="__RefHeading___Toc4112_2565116786"/>
+      <w:bookmarkStart w:id="36" w:name="__RefHeading___Toc4112_2286783217"/>
       <w:bookmarkEnd w:id="36"/>
       <w:r>
         <w:rPr/>
@@ -19019,7 +19019,7 @@
         <w:outlineLvl w:val="2"/>
         <w:rPr/>
       </w:pPr>
-      <w:bookmarkStart w:id="37" w:name="__RefHeading___Toc4114_2565116786"/>
+      <w:bookmarkStart w:id="37" w:name="__RefHeading___Toc4114_2286783217"/>
       <w:bookmarkEnd w:id="37"/>
       <w:r>
         <w:rPr/>
@@ -19122,7 +19122,7 @@
         <w:outlineLvl w:val="1"/>
         <w:rPr/>
       </w:pPr>
-      <w:bookmarkStart w:id="38" w:name="__RefHeading___Toc4116_2565116786"/>
+      <w:bookmarkStart w:id="38" w:name="__RefHeading___Toc4116_2286783217"/>
       <w:bookmarkEnd w:id="38"/>
       <w:r>
         <w:rPr/>
@@ -19413,7 +19413,7 @@
         <w:outlineLvl w:val="2"/>
         <w:rPr/>
       </w:pPr>
-      <w:bookmarkStart w:id="39" w:name="__RefHeading___Toc4118_2565116786"/>
+      <w:bookmarkStart w:id="39" w:name="__RefHeading___Toc4118_2286783217"/>
       <w:bookmarkEnd w:id="39"/>
       <w:r>
         <w:rPr/>
@@ -19675,7 +19675,7 @@
         <w:outlineLvl w:val="0"/>
         <w:rPr/>
       </w:pPr>
-      <w:bookmarkStart w:id="40" w:name="__RefHeading___Toc4120_2565116786"/>
+      <w:bookmarkStart w:id="40" w:name="__RefHeading___Toc4120_2286783217"/>
       <w:bookmarkEnd w:id="40"/>
       <w:r>
         <w:rPr/>
@@ -19821,7 +19821,7 @@
         <w:outlineLvl w:val="1"/>
         <w:rPr/>
       </w:pPr>
-      <w:bookmarkStart w:id="41" w:name="__RefHeading___Toc4122_2565116786"/>
+      <w:bookmarkStart w:id="41" w:name="__RefHeading___Toc4122_2286783217"/>
       <w:bookmarkEnd w:id="41"/>
       <w:r>
         <w:rPr/>
@@ -20106,7 +20106,7 @@
         <w:outlineLvl w:val="1"/>
         <w:rPr/>
       </w:pPr>
-      <w:bookmarkStart w:id="42" w:name="__RefHeading___Toc4124_2565116786"/>
+      <w:bookmarkStart w:id="42" w:name="__RefHeading___Toc4124_2286783217"/>
       <w:bookmarkEnd w:id="42"/>
       <w:r>
         <w:rPr/>
@@ -21139,7 +21139,7 @@
         <w:outlineLvl w:val="2"/>
         <w:rPr/>
       </w:pPr>
-      <w:bookmarkStart w:id="43" w:name="__RefHeading___Toc4126_2565116786"/>
+      <w:bookmarkStart w:id="43" w:name="__RefHeading___Toc4126_2286783217"/>
       <w:bookmarkEnd w:id="43"/>
       <w:r>
         <w:rPr/>
@@ -21204,7 +21204,7 @@
         <w:outlineLvl w:val="2"/>
         <w:rPr/>
       </w:pPr>
-      <w:bookmarkStart w:id="44" w:name="__RefHeading___Toc4128_2565116786"/>
+      <w:bookmarkStart w:id="44" w:name="__RefHeading___Toc4128_2286783217"/>
       <w:bookmarkEnd w:id="44"/>
       <w:r>
         <w:rPr/>
@@ -21298,7 +21298,7 @@
         <w:outlineLvl w:val="2"/>
         <w:rPr/>
       </w:pPr>
-      <w:bookmarkStart w:id="45" w:name="__RefHeading___Toc4130_2565116786"/>
+      <w:bookmarkStart w:id="45" w:name="__RefHeading___Toc4130_2286783217"/>
       <w:bookmarkEnd w:id="45"/>
       <w:r>
         <w:rPr/>
@@ -21365,7 +21365,7 @@
         <w:outlineLvl w:val="1"/>
         <w:rPr/>
       </w:pPr>
-      <w:bookmarkStart w:id="46" w:name="__RefHeading___Toc4132_2565116786"/>
+      <w:bookmarkStart w:id="46" w:name="__RefHeading___Toc4132_2286783217"/>
       <w:bookmarkEnd w:id="46"/>
       <w:r>
         <w:rPr/>
@@ -21704,7 +21704,7 @@
         <w:outlineLvl w:val="0"/>
         <w:rPr/>
       </w:pPr>
-      <w:bookmarkStart w:id="47" w:name="__RefHeading___Toc4134_2565116786"/>
+      <w:bookmarkStart w:id="47" w:name="__RefHeading___Toc4134_2286783217"/>
       <w:bookmarkEnd w:id="47"/>
       <w:r>
         <w:rPr/>
@@ -21840,7 +21840,7 @@
         <w:outlineLvl w:val="1"/>
         <w:rPr/>
       </w:pPr>
-      <w:bookmarkStart w:id="48" w:name="__RefHeading___Toc4136_2565116786"/>
+      <w:bookmarkStart w:id="48" w:name="__RefHeading___Toc4136_2286783217"/>
       <w:bookmarkEnd w:id="48"/>
       <w:r>
         <w:rPr/>
@@ -21994,7 +21994,7 @@
         <w:outlineLvl w:val="1"/>
         <w:rPr/>
       </w:pPr>
-      <w:bookmarkStart w:id="49" w:name="__RefHeading___Toc4138_2565116786"/>
+      <w:bookmarkStart w:id="49" w:name="__RefHeading___Toc4138_2286783217"/>
       <w:bookmarkEnd w:id="49"/>
       <w:r>
         <w:rPr/>
@@ -22070,7 +22070,7 @@
           <w:sz w:val="18"/>
           <w:szCs w:val="18"/>
         </w:rPr>
-        <w:t>fontName: "DosingSymbol",</w:t>
+        <w:t>fontName: "AppSymbol",</w:t>
       </w:r>
     </w:p>
     <w:p>
@@ -22315,7 +22315,7 @@
           <w:szCs w:val="18"/>
           <w:shd w:fill="F2F2F2" w:val="clear"/>
         </w:rPr>
-        <w:t>DosingSymbol.css</w:t>
+        <w:t>AppSymbol.css</w:t>
       </w:r>
       <w:r>
         <w:rPr/>
@@ -22341,7 +22341,7 @@
           <w:szCs w:val="18"/>
           <w:shd w:fill="F2F2F2" w:val="clear"/>
         </w:rPr>
-        <w:t>DosingSymbol.json</w:t>
+        <w:t>AppSymbol.json</w:t>
       </w:r>
       <w:r>
         <w:rPr/>
@@ -22354,7 +22354,7 @@
           <w:szCs w:val="18"/>
           <w:shd w:fill="F2F2F2" w:val="clear"/>
         </w:rPr>
-        <w:t>DosingSymbol.html</w:t>
+        <w:t>AppSymbol.html</w:t>
       </w:r>
       <w:r>
         <w:rPr/>
@@ -23444,7 +23444,7 @@
         <w:outlineLvl w:val="1"/>
         <w:rPr/>
       </w:pPr>
-      <w:bookmarkStart w:id="50" w:name="__RefHeading___Toc4140_2565116786"/>
+      <w:bookmarkStart w:id="50" w:name="__RefHeading___Toc4140_2286783217"/>
       <w:bookmarkEnd w:id="50"/>
       <w:r>
         <w:rPr/>
@@ -23807,7 +23807,7 @@
         <w:outlineLvl w:val="1"/>
         <w:rPr/>
       </w:pPr>
-      <w:bookmarkStart w:id="51" w:name="__RefHeading___Toc4142_2565116786"/>
+      <w:bookmarkStart w:id="51" w:name="__RefHeading___Toc4142_2286783217"/>
       <w:bookmarkEnd w:id="51"/>
       <w:r>
         <w:rPr/>
@@ -23999,7 +23999,7 @@
         <w:outlineLvl w:val="0"/>
         <w:rPr/>
       </w:pPr>
-      <w:bookmarkStart w:id="52" w:name="__RefHeading___Toc4144_2565116786"/>
+      <w:bookmarkStart w:id="52" w:name="__RefHeading___Toc4144_2286783217"/>
       <w:bookmarkEnd w:id="52"/>
       <w:r>
         <w:rPr/>
@@ -24128,7 +24128,7 @@
         <w:outlineLvl w:val="1"/>
         <w:rPr/>
       </w:pPr>
-      <w:bookmarkStart w:id="53" w:name="__RefHeading___Toc4146_2565116786"/>
+      <w:bookmarkStart w:id="53" w:name="__RefHeading___Toc4146_2286783217"/>
       <w:bookmarkEnd w:id="53"/>
       <w:r>
         <w:rPr/>
@@ -24423,7 +24423,7 @@
         <w:outlineLvl w:val="1"/>
         <w:rPr/>
       </w:pPr>
-      <w:bookmarkStart w:id="54" w:name="__RefHeading___Toc4148_2565116786"/>
+      <w:bookmarkStart w:id="54" w:name="__RefHeading___Toc4148_2286783217"/>
       <w:bookmarkEnd w:id="54"/>
       <w:r>
         <w:rPr/>
@@ -24578,7 +24578,7 @@
         <w:outlineLvl w:val="1"/>
         <w:rPr/>
       </w:pPr>
-      <w:bookmarkStart w:id="55" w:name="__RefHeading___Toc4150_2565116786"/>
+      <w:bookmarkStart w:id="55" w:name="__RefHeading___Toc4150_2286783217"/>
       <w:bookmarkEnd w:id="55"/>
       <w:r>
         <w:rPr/>
@@ -24824,7 +24824,7 @@
         <w:outlineLvl w:val="0"/>
         <w:rPr/>
       </w:pPr>
-      <w:bookmarkStart w:id="56" w:name="__RefHeading___Toc4152_2565116786"/>
+      <w:bookmarkStart w:id="56" w:name="__RefHeading___Toc4152_2286783217"/>
       <w:bookmarkEnd w:id="56"/>
       <w:r>
         <w:rPr/>
@@ -24842,7 +24842,7 @@
         <w:outlineLvl w:val="1"/>
         <w:rPr/>
       </w:pPr>
-      <w:bookmarkStart w:id="57" w:name="__RefHeading___Toc4154_2565116786"/>
+      <w:bookmarkStart w:id="57" w:name="__RefHeading___Toc4154_2286783217"/>
       <w:bookmarkEnd w:id="57"/>
       <w:r>
         <w:rPr/>
@@ -25049,7 +25049,7 @@
         <w:outlineLvl w:val="1"/>
         <w:rPr/>
       </w:pPr>
-      <w:bookmarkStart w:id="58" w:name="__RefHeading___Toc4156_2565116786"/>
+      <w:bookmarkStart w:id="58" w:name="__RefHeading___Toc4156_2286783217"/>
       <w:bookmarkEnd w:id="58"/>
       <w:r>
         <w:rPr/>
@@ -25335,7 +25335,7 @@
         <w:outlineLvl w:val="1"/>
         <w:rPr/>
       </w:pPr>
-      <w:bookmarkStart w:id="59" w:name="__RefHeading___Toc4158_2565116786"/>
+      <w:bookmarkStart w:id="59" w:name="__RefHeading___Toc4158_2286783217"/>
       <w:bookmarkEnd w:id="59"/>
       <w:r>
         <w:rPr/>
@@ -25417,7 +25417,7 @@
           <w:sz w:val="18"/>
           <w:szCs w:val="18"/>
         </w:rPr>
-        <w:t>-µ: Sprite("imgs/logos/dosing_logo.png");</w:t>
+        <w:t>-µ: Sprite("imgs/logos/company_logo.png");</w:t>
       </w:r>
     </w:p>
     <w:p>
@@ -25608,7 +25608,7 @@
         <w:outlineLvl w:val="1"/>
         <w:rPr/>
       </w:pPr>
-      <w:bookmarkStart w:id="60" w:name="__RefHeading___Toc4160_2565116786"/>
+      <w:bookmarkStart w:id="60" w:name="__RefHeading___Toc4160_2286783217"/>
       <w:bookmarkEnd w:id="60"/>
       <w:r>
         <w:rPr/>
@@ -26280,7 +26280,7 @@
         <w:outlineLvl w:val="1"/>
         <w:rPr/>
       </w:pPr>
-      <w:bookmarkStart w:id="61" w:name="__RefHeading___Toc4162_2565116786"/>
+      <w:bookmarkStart w:id="61" w:name="__RefHeading___Toc4162_2286783217"/>
       <w:bookmarkEnd w:id="61"/>
       <w:r>
         <w:rPr/>
@@ -26491,7 +26491,7 @@
         <w:outlineLvl w:val="0"/>
         <w:rPr/>
       </w:pPr>
-      <w:bookmarkStart w:id="62" w:name="__RefHeading___Toc4164_2565116786"/>
+      <w:bookmarkStart w:id="62" w:name="__RefHeading___Toc4164_2286783217"/>
       <w:bookmarkEnd w:id="62"/>
       <w:r>
         <w:rPr/>
@@ -26534,7 +26534,7 @@
         <w:outlineLvl w:val="1"/>
         <w:rPr/>
       </w:pPr>
-      <w:bookmarkStart w:id="63" w:name="__RefHeading___Toc4166_2565116786"/>
+      <w:bookmarkStart w:id="63" w:name="__RefHeading___Toc4166_2286783217"/>
       <w:bookmarkEnd w:id="63"/>
       <w:r>
         <w:rPr/>
@@ -26934,7 +26934,7 @@
         <w:outlineLvl w:val="1"/>
         <w:rPr/>
       </w:pPr>
-      <w:bookmarkStart w:id="64" w:name="__RefHeading___Toc4168_2565116786"/>
+      <w:bookmarkStart w:id="64" w:name="__RefHeading___Toc4168_2286783217"/>
       <w:bookmarkEnd w:id="64"/>
       <w:r>
         <w:rPr/>
@@ -27137,7 +27137,7 @@
         <w:outlineLvl w:val="1"/>
         <w:rPr/>
       </w:pPr>
-      <w:bookmarkStart w:id="65" w:name="__RefHeading___Toc4170_2565116786"/>
+      <w:bookmarkStart w:id="65" w:name="__RefHeading___Toc4170_2286783217"/>
       <w:bookmarkEnd w:id="65"/>
       <w:r>
         <w:rPr/>
@@ -27393,7 +27393,7 @@
         <w:outlineLvl w:val="1"/>
         <w:rPr/>
       </w:pPr>
-      <w:bookmarkStart w:id="66" w:name="__RefHeading___Toc4172_2565116786"/>
+      <w:bookmarkStart w:id="66" w:name="__RefHeading___Toc4172_2286783217"/>
       <w:bookmarkEnd w:id="66"/>
       <w:r>
         <w:rPr/>
@@ -27778,7 +27778,7 @@
         <w:outlineLvl w:val="0"/>
         <w:rPr/>
       </w:pPr>
-      <w:bookmarkStart w:id="67" w:name="__RefHeading___Toc4174_2565116786"/>
+      <w:bookmarkStart w:id="67" w:name="__RefHeading___Toc4174_2286783217"/>
       <w:bookmarkEnd w:id="67"/>
       <w:r>
         <w:rPr/>
@@ -27817,7 +27817,7 @@
         <w:outlineLvl w:val="1"/>
         <w:rPr/>
       </w:pPr>
-      <w:bookmarkStart w:id="68" w:name="__RefHeading___Toc4176_2565116786"/>
+      <w:bookmarkStart w:id="68" w:name="__RefHeading___Toc4176_2286783217"/>
       <w:bookmarkEnd w:id="68"/>
       <w:r>
         <w:rPr/>
@@ -27915,7 +27915,7 @@
         <w:outlineLvl w:val="1"/>
         <w:rPr/>
       </w:pPr>
-      <w:bookmarkStart w:id="69" w:name="__RefHeading___Toc4178_2565116786"/>
+      <w:bookmarkStart w:id="69" w:name="__RefHeading___Toc4178_2286783217"/>
       <w:bookmarkEnd w:id="69"/>
       <w:r>
         <w:rPr/>
@@ -28032,7 +28032,7 @@
         <w:outlineLvl w:val="1"/>
         <w:rPr/>
       </w:pPr>
-      <w:bookmarkStart w:id="70" w:name="__RefHeading___Toc4180_2565116786"/>
+      <w:bookmarkStart w:id="70" w:name="__RefHeading___Toc4180_2286783217"/>
       <w:bookmarkEnd w:id="70"/>
       <w:r>
         <w:rPr/>
@@ -28649,7 +28649,7 @@
         <w:outlineLvl w:val="1"/>
         <w:rPr/>
       </w:pPr>
-      <w:bookmarkStart w:id="71" w:name="__RefHeading___Toc4182_2565116786"/>
+      <w:bookmarkStart w:id="71" w:name="__RefHeading___Toc4182_2286783217"/>
       <w:bookmarkEnd w:id="71"/>
       <w:r>
         <w:rPr/>
@@ -29673,7 +29673,7 @@
         <w:outlineLvl w:val="1"/>
         <w:rPr/>
       </w:pPr>
-      <w:bookmarkStart w:id="72" w:name="__RefHeading___Toc4184_2565116786"/>
+      <w:bookmarkStart w:id="72" w:name="__RefHeading___Toc4184_2286783217"/>
       <w:bookmarkEnd w:id="72"/>
       <w:r>
         <w:rPr/>
@@ -30046,7 +30046,7 @@
         <w:outlineLvl w:val="1"/>
         <w:rPr/>
       </w:pPr>
-      <w:bookmarkStart w:id="73" w:name="__RefHeading___Toc4186_2565116786"/>
+      <w:bookmarkStart w:id="73" w:name="__RefHeading___Toc4186_2286783217"/>
       <w:bookmarkEnd w:id="73"/>
       <w:r>
         <w:rPr/>
@@ -31068,7 +31068,7 @@
         <w:outlineLvl w:val="1"/>
         <w:rPr/>
       </w:pPr>
-      <w:bookmarkStart w:id="74" w:name="__RefHeading___Toc4188_2565116786"/>
+      <w:bookmarkStart w:id="74" w:name="__RefHeading___Toc4188_2286783217"/>
       <w:bookmarkEnd w:id="74"/>
       <w:r>
         <w:rPr/>
@@ -31665,7 +31665,7 @@
         <w:outlineLvl w:val="1"/>
         <w:rPr/>
       </w:pPr>
-      <w:bookmarkStart w:id="75" w:name="__RefHeading___Toc4190_2565116786"/>
+      <w:bookmarkStart w:id="75" w:name="__RefHeading___Toc4190_2286783217"/>
       <w:bookmarkEnd w:id="75"/>
       <w:r>
         <w:rPr/>
@@ -31829,7 +31829,7 @@
         <w:outlineLvl w:val="0"/>
         <w:rPr/>
       </w:pPr>
-      <w:bookmarkStart w:id="76" w:name="__RefHeading___Toc4192_2565116786"/>
+      <w:bookmarkStart w:id="76" w:name="__RefHeading___Toc4192_2286783217"/>
       <w:bookmarkEnd w:id="76"/>
       <w:r>
         <w:rPr/>
@@ -31898,7 +31898,7 @@
         <w:outlineLvl w:val="1"/>
         <w:rPr/>
       </w:pPr>
-      <w:bookmarkStart w:id="77" w:name="__RefHeading___Toc4194_2565116786"/>
+      <w:bookmarkStart w:id="77" w:name="__RefHeading___Toc4194_2286783217"/>
       <w:bookmarkEnd w:id="77"/>
       <w:r>
         <w:rPr/>
@@ -31979,7 +31979,7 @@
         <w:outlineLvl w:val="1"/>
         <w:rPr/>
       </w:pPr>
-      <w:bookmarkStart w:id="78" w:name="__RefHeading___Toc4196_2565116786"/>
+      <w:bookmarkStart w:id="78" w:name="__RefHeading___Toc4196_2286783217"/>
       <w:bookmarkEnd w:id="78"/>
       <w:r>
         <w:rPr/>
@@ -32589,7 +32589,7 @@
         <w:outlineLvl w:val="1"/>
         <w:rPr/>
       </w:pPr>
-      <w:bookmarkStart w:id="79" w:name="__RefHeading___Toc4198_2565116786"/>
+      <w:bookmarkStart w:id="79" w:name="__RefHeading___Toc4198_2286783217"/>
       <w:bookmarkEnd w:id="79"/>
       <w:r>
         <w:rPr/>
@@ -33172,7 +33172,7 @@
         <w:outlineLvl w:val="1"/>
         <w:rPr/>
       </w:pPr>
-      <w:bookmarkStart w:id="80" w:name="__RefHeading___Toc4200_2565116786"/>
+      <w:bookmarkStart w:id="80" w:name="__RefHeading___Toc4200_2286783217"/>
       <w:bookmarkEnd w:id="80"/>
       <w:r>
         <w:rPr/>
@@ -33953,7 +33953,7 @@
         <w:outlineLvl w:val="1"/>
         <w:rPr/>
       </w:pPr>
-      <w:bookmarkStart w:id="81" w:name="__RefHeading___Toc4202_2565116786"/>
+      <w:bookmarkStart w:id="81" w:name="__RefHeading___Toc4202_2286783217"/>
       <w:bookmarkEnd w:id="81"/>
       <w:r>
         <w:rPr/>
@@ -34048,7 +34048,7 @@
         <w:outlineLvl w:val="1"/>
         <w:rPr/>
       </w:pPr>
-      <w:bookmarkStart w:id="82" w:name="__RefHeading___Toc4204_2565116786"/>
+      <w:bookmarkStart w:id="82" w:name="__RefHeading___Toc4204_2286783217"/>
       <w:bookmarkEnd w:id="82"/>
       <w:r>
         <w:rPr/>
@@ -34420,7 +34420,7 @@
       </w:pPr>
       <w:r>
         <w:rPr/>
-        <w:t>Portierte Referenz-Makros des AiDPix-Projekts (</w:t>
+        <w:t>Portierte Referenz-Makros (</w:t>
       </w:r>
       <w:r>
         <w:rPr>
@@ -34494,11 +34494,11 @@
           <w:szCs w:val="18"/>
           <w:shd w:fill="F2F2F2" w:val="clear"/>
         </w:rPr>
-        <w:t>test/fixtures/aidpix-helpers.mjs</w:t>
-      </w:r>
-      <w:r>
-        <w:rPr/>
-        <w:t>.</w:t>
+        <w:t>test/fixtures/reference-macros.mjs</w:t>
+      </w:r>
+      <w:r>
+        <w:rPr/>
+        <w:t xml:space="preserve"> (Demo-/Test-Fixture, nicht Teil der npm-API).</w:t>
       </w:r>
     </w:p>
     <w:p>
@@ -34512,7 +34512,7 @@
         <w:outlineLvl w:val="1"/>
         <w:rPr/>
       </w:pPr>
-      <w:bookmarkStart w:id="83" w:name="__RefHeading___Toc4206_2565116786"/>
+      <w:bookmarkStart w:id="83" w:name="__RefHeading___Toc4206_2286783217"/>
       <w:bookmarkEnd w:id="83"/>
       <w:r>
         <w:rPr/>
@@ -35050,7 +35050,7 @@
         <w:outlineLvl w:val="0"/>
         <w:rPr/>
       </w:pPr>
-      <w:bookmarkStart w:id="84" w:name="__RefHeading___Toc4208_2565116786"/>
+      <w:bookmarkStart w:id="84" w:name="__RefHeading___Toc4208_2286783217"/>
       <w:bookmarkEnd w:id="84"/>
       <w:r>
         <w:rPr/>
@@ -35068,7 +35068,7 @@
         <w:outlineLvl w:val="1"/>
         <w:rPr/>
       </w:pPr>
-      <w:bookmarkStart w:id="85" w:name="__RefHeading___Toc4210_2565116786"/>
+      <w:bookmarkStart w:id="85" w:name="__RefHeading___Toc4210_2286783217"/>
       <w:bookmarkEnd w:id="85"/>
       <w:r>
         <w:rPr/>
@@ -35489,7 +35489,7 @@
         <w:outlineLvl w:val="1"/>
         <w:rPr/>
       </w:pPr>
-      <w:bookmarkStart w:id="86" w:name="__RefHeading___Toc4212_2565116786"/>
+      <w:bookmarkStart w:id="86" w:name="__RefHeading___Toc4212_2286783217"/>
       <w:bookmarkEnd w:id="86"/>
       <w:r>
         <w:rPr/>
@@ -35772,7 +35772,7 @@
         <w:outlineLvl w:val="1"/>
         <w:rPr/>
       </w:pPr>
-      <w:bookmarkStart w:id="87" w:name="__RefHeading___Toc4214_2565116786"/>
+      <w:bookmarkStart w:id="87" w:name="__RefHeading___Toc4214_2286783217"/>
       <w:bookmarkEnd w:id="87"/>
       <w:r>
         <w:rPr/>
@@ -36025,7 +36025,7 @@
         <w:outlineLvl w:val="0"/>
         <w:rPr/>
       </w:pPr>
-      <w:bookmarkStart w:id="88" w:name="__RefHeading___Toc4216_2565116786"/>
+      <w:bookmarkStart w:id="88" w:name="__RefHeading___Toc4216_2286783217"/>
       <w:bookmarkEnd w:id="88"/>
       <w:r>
         <w:rPr/>
@@ -37216,7 +37216,7 @@
         <w:outlineLvl w:val="0"/>
         <w:rPr/>
       </w:pPr>
-      <w:bookmarkStart w:id="89" w:name="__RefHeading___Toc4218_2565116786"/>
+      <w:bookmarkStart w:id="89" w:name="__RefHeading___Toc4218_2286783217"/>
       <w:bookmarkEnd w:id="89"/>
       <w:r>
         <w:rPr/>
@@ -37732,7 +37732,7 @@
         <w:outlineLvl w:val="0"/>
         <w:rPr/>
       </w:pPr>
-      <w:bookmarkStart w:id="90" w:name="__RefHeading___Toc4220_2565116786"/>
+      <w:bookmarkStart w:id="90" w:name="__RefHeading___Toc4220_2286783217"/>
       <w:bookmarkEnd w:id="90"/>
       <w:r>
         <w:rPr/>
@@ -38751,20 +38751,20 @@
       </w:pPr>
       <w:r>
         <w:rPr/>
-        <w:t>Der Konverter wurde am vollständigen AiDPix-Bestand validiert: Ein Vergleichswerkzeug (</w:t>
-      </w:r>
-      <w:r>
-        <w:rPr>
-          <w:rFonts w:eastAsia="Consolas" w:cs="Consolas" w:ascii="Consolas" w:hAnsi="Consolas"/>
-          <w:sz w:val="18"/>
-          <w:szCs w:val="18"/>
-          <w:shd w:fill="F2F2F2" w:val="clear"/>
-        </w:rPr>
-        <w:t>tools/compare-aidpix.mjs</w:t>
-      </w:r>
-      <w:r>
-        <w:rPr/>
-        <w:t>) baut den konvertierten Skin und vergleicht ihn regel- und property-weise gegen die alte kompilierte Ausgabe — Ergebnis: 2 951 Regeln, 0 unerwartete Differenzen (53 dokumentierte Drift-Fälle, z. B. nach dem letzten µCSS-Lauf editierte Quellen).</w:t>
+        <w:t>Der Konverter wurde an einem vollständigen Legacy-µCSS-1-Bestand validiert: Ein Vergleichswerkzeug (</w:t>
+      </w:r>
+      <w:r>
+        <w:rPr>
+          <w:rFonts w:eastAsia="Consolas" w:cs="Consolas" w:ascii="Consolas" w:hAnsi="Consolas"/>
+          <w:sz w:val="18"/>
+          <w:szCs w:val="18"/>
+          <w:shd w:fill="F2F2F2" w:val="clear"/>
+        </w:rPr>
+        <w:t>tools/compare-legacy-skin.mjs</w:t>
+      </w:r>
+      <w:r>
+        <w:rPr/>
+        <w:t>, nur Repository) baut den konvertierten Skin und vergleicht ihn regel- und property-weise gegen die alte kompilierte Ausgabe — Ergebnis: 2 951 Regeln, 0 unerwartete Differenzen (53 dokumentierte Drift-Fälle, z. B. nach dem letzten µCSS-Lauf editierte Quellen).</w:t>
       </w:r>
     </w:p>
     <w:p>
@@ -38955,7 +38955,7 @@
         <w:outlineLvl w:val="0"/>
         <w:rPr/>
       </w:pPr>
-      <w:bookmarkStart w:id="91" w:name="__RefHeading___Toc4222_2565116786"/>
+      <w:bookmarkStart w:id="91" w:name="__RefHeading___Toc4222_2286783217"/>
       <w:bookmarkEnd w:id="91"/>
       <w:r>
         <w:rPr/>
@@ -39235,7 +39235,7 @@
             </w:r>
             <w:r>
               <w:rPr/>
-              <w:t>, ohne Adobe-Abhängigkeit): Core-Pipeline (M1), Sprites &amp; Cursor (M2), Manifest &amp; Build mit inkrementellem Cache (M3), Hooks &amp; Makros (M4), AiDPix-Migration mit Konverter und Abnahmetest (M5), Handbuch (M6).</w:t>
+              <w:t>, ohne Adobe-Abhängigkeit): Core-Pipeline (M1), Sprites &amp; Cursor (M2), Manifest &amp; Build mit inkrementellem Cache (M3), Hooks &amp; Makros (M4), Legacy-Skin-Migration mit Konverter und Abnahmetest (M5), Handbuch (M6).</w:t>
             </w:r>
           </w:p>
         </w:tc>
@@ -40099,7 +40099,7 @@
         <w:outlineLvl w:val="0"/>
         <w:rPr/>
       </w:pPr>
-      <w:bookmarkStart w:id="92" w:name="__RefHeading___Toc4224_2565116786"/>
+      <w:bookmarkStart w:id="92" w:name="__RefHeading___Toc4224_2286783217"/>
       <w:bookmarkEnd w:id="92"/>
       <w:r>
         <w:rPr/>
@@ -40141,7 +40141,7 @@
         <w:outlineLvl w:val="1"/>
         <w:rPr/>
       </w:pPr>
-      <w:bookmarkStart w:id="93" w:name="__RefHeading___Toc4226_2565116786"/>
+      <w:bookmarkStart w:id="93" w:name="__RefHeading___Toc4226_2286783217"/>
       <w:bookmarkEnd w:id="93"/>
       <w:r>
         <w:rPr/>
@@ -40195,7 +40195,7 @@
         <w:outlineLvl w:val="1"/>
         <w:rPr/>
       </w:pPr>
-      <w:bookmarkStart w:id="94" w:name="__RefHeading___Toc4228_2565116786"/>
+      <w:bookmarkStart w:id="94" w:name="__RefHeading___Toc4228_2286783217"/>
       <w:bookmarkEnd w:id="94"/>
       <w:r>
         <w:rPr/>
@@ -40225,7 +40225,7 @@
         <w:outlineLvl w:val="1"/>
         <w:rPr/>
       </w:pPr>
-      <w:bookmarkStart w:id="95" w:name="__RefHeading___Toc4230_2565116786"/>
+      <w:bookmarkStart w:id="95" w:name="__RefHeading___Toc4230_2286783217"/>
       <w:bookmarkEnd w:id="95"/>
       <w:r>
         <w:rPr/>

</xml_diff>

<commit_message>
Brand: use µCSS trademark in docs; release 2.5.7 / sibling README patches.
</commit_message>
<xml_diff>
--- a/gulp-mu-css/docs/microCSS-de.docx
+++ b/gulp-mu-css/docs/microCSS-de.docx
@@ -136,7 +136,7 @@
           <w:sz w:val="24"/>
           <w:szCs w:val="24"/>
         </w:rPr>
-        <w:t>Version 2.5.5</w:t>
+        <w:t>Version 2.5.7</w:t>
       </w:r>
     </w:p>
     <w:p>
@@ -151,7 +151,7 @@
           <w:sz w:val="24"/>
           <w:szCs w:val="24"/>
         </w:rPr>
-        <w:t>2026-06-19</w:t>
+        <w:t>2026-06-20</w:t>
       </w:r>
     </w:p>
     <w:p>
@@ -215,7 +215,7 @@
             </w:rPr>
             <w:fldChar w:fldCharType="separate"/>
           </w:r>
-          <w:hyperlink w:anchor="__RefHeading___Toc5076_3385418132" w:tooltip="1 Einführung">
+          <w:hyperlink w:anchor="__RefHeading___Toc5076_1482924693" w:tooltip="1 Einführung">
             <w:r>
               <w:rPr>
                 <w:rStyle w:val="Verzeichnissprung"/>
@@ -235,7 +235,7 @@
             </w:tabs>
             <w:rPr/>
           </w:pPr>
-          <w:hyperlink w:anchor="__RefHeading___Toc5078_3385418132" w:tooltip="1.1 Werkzeuge und Kosten">
+          <w:hyperlink w:anchor="__RefHeading___Toc5078_1482924693" w:tooltip="1.1 Werkzeuge und Kosten">
             <w:r>
               <w:rPr>
                 <w:rStyle w:val="Verzeichnissprung"/>
@@ -255,7 +255,7 @@
             </w:tabs>
             <w:rPr/>
           </w:pPr>
-          <w:hyperlink w:anchor="__RefHeading___Toc5080_3385418132" w:tooltip="1.2 Draft-Workflow (Authoring + Watch)">
+          <w:hyperlink w:anchor="__RefHeading___Toc5080_1482924693" w:tooltip="1.2 Draft-Workflow (Authoring + Watch)">
             <w:r>
               <w:rPr>
                 <w:rStyle w:val="Verzeichnissprung"/>
@@ -275,7 +275,7 @@
             </w:tabs>
             <w:rPr/>
           </w:pPr>
-          <w:hyperlink w:anchor="__RefHeading___Toc5082_3385418132" w:tooltip="1.2.1 Photopea (Browser, optional)">
+          <w:hyperlink w:anchor="__RefHeading___Toc5082_1482924693" w:tooltip="1.2.1 Photopea (Browser, optional)">
             <w:r>
               <w:rPr>
                 <w:rStyle w:val="Verzeichnissprung"/>
@@ -295,12 +295,12 @@
             </w:tabs>
             <w:rPr/>
           </w:pPr>
-          <w:hyperlink w:anchor="__RefHeading___Toc5084_3385418132" w:tooltip="1.3 Einordnung: Warum µCSS?">
+          <w:hyperlink w:anchor="__RefHeading___Toc5084_1482924693" w:tooltip="1.3 Einordnung: Warum µCSS™?">
             <w:r>
               <w:rPr>
                 <w:rStyle w:val="Verzeichnissprung"/>
               </w:rPr>
-              <w:t>1.3 Einordnung: Warum µCSS?</w:t>
+              <w:t>1.3 Einordnung: Warum µCSS™?</w:t>
               <w:tab/>
               <w:t>6</w:t>
             </w:r>
@@ -315,7 +315,7 @@
             </w:tabs>
             <w:rPr/>
           </w:pPr>
-          <w:hyperlink w:anchor="__RefHeading___Toc5086_3385418132" w:tooltip="2 Installation und Start">
+          <w:hyperlink w:anchor="__RefHeading___Toc5086_1482924693" w:tooltip="2 Installation und Start">
             <w:r>
               <w:rPr>
                 <w:rStyle w:val="Verzeichnissprung"/>
@@ -335,7 +335,7 @@
             </w:tabs>
             <w:rPr/>
           </w:pPr>
-          <w:hyperlink w:anchor="__RefHeading___Toc5088_3385418132" w:tooltip="3 Anwendungsfälle">
+          <w:hyperlink w:anchor="__RefHeading___Toc5088_1482924693" w:tooltip="3 Anwendungsfälle">
             <w:r>
               <w:rPr>
                 <w:rStyle w:val="Verzeichnissprung"/>
@@ -355,7 +355,7 @@
             </w:tabs>
             <w:rPr/>
           </w:pPr>
-          <w:hyperlink w:anchor="__RefHeading___Toc5090_3385418132" w:tooltip="3.1 Benannte Eigenschaften (Variablen)">
+          <w:hyperlink w:anchor="__RefHeading___Toc5090_1482924693" w:tooltip="3.1 Benannte Eigenschaften (Variablen)">
             <w:r>
               <w:rPr>
                 <w:rStyle w:val="Verzeichnissprung"/>
@@ -375,7 +375,7 @@
             </w:tabs>
             <w:rPr/>
           </w:pPr>
-          <w:hyperlink w:anchor="__RefHeading___Toc5092_3385418132" w:tooltip="3.2 Berechnungen und Ausdrücke">
+          <w:hyperlink w:anchor="__RefHeading___Toc5092_1482924693" w:tooltip="3.2 Berechnungen und Ausdrücke">
             <w:r>
               <w:rPr>
                 <w:rStyle w:val="Verzeichnissprung"/>
@@ -395,7 +395,7 @@
             </w:tabs>
             <w:rPr/>
           </w:pPr>
-          <w:hyperlink w:anchor="__RefHeading___Toc5094_3385418132" w:tooltip="3.3 Mehrere Layouts über Skin-Manifeste">
+          <w:hyperlink w:anchor="__RefHeading___Toc5094_1482924693" w:tooltip="3.3 Mehrere Layouts über Skin-Manifeste">
             <w:r>
               <w:rPr>
                 <w:rStyle w:val="Verzeichnissprung"/>
@@ -415,7 +415,7 @@
             </w:tabs>
             <w:rPr/>
           </w:pPr>
-          <w:hyperlink w:anchor="__RefHeading___Toc5096_3385418132" w:tooltip="3.4 Automatische Sprite-Generierung">
+          <w:hyperlink w:anchor="__RefHeading___Toc5096_1482924693" w:tooltip="3.4 Automatische Sprite-Generierung">
             <w:r>
               <w:rPr>
                 <w:rStyle w:val="Verzeichnissprung"/>
@@ -435,7 +435,7 @@
             </w:tabs>
             <w:rPr/>
           </w:pPr>
-          <w:hyperlink w:anchor="__RefHeading___Toc5098_3385418132" w:tooltip="3.5 Bilder vorladen (Preload)">
+          <w:hyperlink w:anchor="__RefHeading___Toc5098_1482924693" w:tooltip="3.5 Bilder vorladen (Preload)">
             <w:r>
               <w:rPr>
                 <w:rStyle w:val="Verzeichnissprung"/>
@@ -455,7 +455,7 @@
             </w:tabs>
             <w:rPr/>
           </w:pPr>
-          <w:hyperlink w:anchor="__RefHeading___Toc5100_3385418132" w:tooltip="3.6 Cursor mit Hotspot und Fallback">
+          <w:hyperlink w:anchor="__RefHeading___Toc5100_1482924693" w:tooltip="3.6 Cursor mit Hotspot und Fallback">
             <w:r>
               <w:rPr>
                 <w:rStyle w:val="Verzeichnissprung"/>
@@ -475,7 +475,7 @@
             </w:tabs>
             <w:rPr/>
           </w:pPr>
-          <w:hyperlink w:anchor="__RefHeading___Toc5102_3385418132" w:tooltip="3.7 Automatische Bilderzeugung (media-Steps)">
+          <w:hyperlink w:anchor="__RefHeading___Toc5102_1482924693" w:tooltip="3.7 Automatische Bilderzeugung (media-Steps)">
             <w:r>
               <w:rPr>
                 <w:rStyle w:val="Verzeichnissprung"/>
@@ -495,7 +495,7 @@
             </w:tabs>
             <w:rPr/>
           </w:pPr>
-          <w:hyperlink w:anchor="__RefHeading___Toc5104_3385418132" w:tooltip="3.7.1 Eigene media-Steps (Plugins)">
+          <w:hyperlink w:anchor="__RefHeading___Toc5104_1482924693" w:tooltip="3.7.1 Eigene media-Steps (Plugins)">
             <w:r>
               <w:rPr>
                 <w:rStyle w:val="Verzeichnissprung"/>
@@ -515,7 +515,7 @@
             </w:tabs>
             <w:rPr/>
           </w:pPr>
-          <w:hyperlink w:anchor="__RefHeading___Toc5106_3385418132" w:tooltip="4 microPS (µPS) — Bildgeneratoren">
+          <w:hyperlink w:anchor="__RefHeading___Toc5106_1482924693" w:tooltip="4 microPS (µPS) — Bildgeneratoren">
             <w:r>
               <w:rPr>
                 <w:rStyle w:val="Verzeichnissprung"/>
@@ -535,7 +535,7 @@
             </w:tabs>
             <w:rPr/>
           </w:pPr>
-          <w:hyperlink w:anchor="__RefHeading___Toc5108_3385418132" w:tooltip="4.1 API-Übersicht">
+          <w:hyperlink w:anchor="__RefHeading___Toc5108_1482924693" w:tooltip="4.1 API-Übersicht">
             <w:r>
               <w:rPr>
                 <w:rStyle w:val="Verzeichnissprung"/>
@@ -555,7 +555,7 @@
             </w:tabs>
             <w:rPr/>
           </w:pPr>
-          <w:hyperlink w:anchor="__RefHeading___Toc5110_3385418132" w:tooltip="4.2 ButtonAndIconCreator">
+          <w:hyperlink w:anchor="__RefHeading___Toc5110_1482924693" w:tooltip="4.2 ButtonAndIconCreator">
             <w:r>
               <w:rPr>
                 <w:rStyle w:val="Verzeichnissprung"/>
@@ -575,7 +575,7 @@
             </w:tabs>
             <w:rPr/>
           </w:pPr>
-          <w:hyperlink w:anchor="__RefHeading___Toc5112_3385418132" w:tooltip="4.2.1 CreateByTopLayerSets — ein Bild pro Gruppe">
+          <w:hyperlink w:anchor="__RefHeading___Toc5112_1482924693" w:tooltip="4.2.1 CreateByTopLayerSets — ein Bild pro Gruppe">
             <w:r>
               <w:rPr>
                 <w:rStyle w:val="Verzeichnissprung"/>
@@ -595,7 +595,7 @@
             </w:tabs>
             <w:rPr/>
           </w:pPr>
-          <w:hyperlink w:anchor="__RefHeading___Toc5114_3385418132" w:tooltip="4.3 AppIconMaker">
+          <w:hyperlink w:anchor="__RefHeading___Toc5114_1482924693" w:tooltip="4.3 AppIconMaker">
             <w:r>
               <w:rPr>
                 <w:rStyle w:val="Verzeichnissprung"/>
@@ -615,7 +615,7 @@
             </w:tabs>
             <w:rPr/>
           </w:pPr>
-          <w:hyperlink w:anchor="__RefHeading___Toc5116_3385418132" w:tooltip="4.4 SpriteAtlas und TileSheet">
+          <w:hyperlink w:anchor="__RefHeading___Toc5116_1482924693" w:tooltip="4.4 SpriteAtlas und TileSheet">
             <w:r>
               <w:rPr>
                 <w:rStyle w:val="Verzeichnissprung"/>
@@ -635,7 +635,7 @@
             </w:tabs>
             <w:rPr/>
           </w:pPr>
-          <w:hyperlink w:anchor="__RefHeading___Toc5118_3385418132" w:tooltip="4.5 SequenceStrip und DSD-Format">
+          <w:hyperlink w:anchor="__RefHeading___Toc5118_1482924693" w:tooltip="4.5 SequenceStrip und DSD-Format">
             <w:r>
               <w:rPr>
                 <w:rStyle w:val="Verzeichnissprung"/>
@@ -655,7 +655,7 @@
             </w:tabs>
             <w:rPr/>
           </w:pPr>
-          <w:hyperlink w:anchor="__RefHeading___Toc5120_3385418132" w:tooltip="4.5.1 DSD erzeugen (`CreateDsdFromImages`)">
+          <w:hyperlink w:anchor="__RefHeading___Toc5120_1482924693" w:tooltip="4.5.1 DSD erzeugen (`CreateDsdFromImages`)">
             <w:r>
               <w:rPr>
                 <w:rStyle w:val="Verzeichnissprung"/>
@@ -675,7 +675,7 @@
             </w:tabs>
             <w:rPr/>
           </w:pPr>
-          <w:hyperlink w:anchor="__RefHeading___Toc5122_3385418132" w:tooltip="4.5.2 PSD-Sequenzgruppen">
+          <w:hyperlink w:anchor="__RefHeading___Toc5122_1482924693" w:tooltip="4.5.2 PSD-Sequenzgruppen">
             <w:r>
               <w:rPr>
                 <w:rStyle w:val="Verzeichnissprung"/>
@@ -695,7 +695,7 @@
             </w:tabs>
             <w:rPr/>
           </w:pPr>
-          <w:hyperlink w:anchor="__RefHeading___Toc5124_3385418132" w:tooltip="4.6 Raster-Modell, I/O und Arbeitsblatt">
+          <w:hyperlink w:anchor="__RefHeading___Toc5124_1482924693" w:tooltip="4.6 Raster-Modell, I/O und Arbeitsblatt">
             <w:r>
               <w:rPr>
                 <w:rStyle w:val="Verzeichnissprung"/>
@@ -715,7 +715,7 @@
             </w:tabs>
             <w:rPr/>
           </w:pPr>
-          <w:hyperlink w:anchor="__RefHeading___Toc5126_3385418132" w:tooltip="4.7 Bildanpassungen und Masken">
+          <w:hyperlink w:anchor="__RefHeading___Toc5126_1482924693" w:tooltip="4.7 Bildanpassungen und Masken">
             <w:r>
               <w:rPr>
                 <w:rStyle w:val="Verzeichnissprung"/>
@@ -735,7 +735,7 @@
             </w:tabs>
             <w:rPr/>
           </w:pPr>
-          <w:hyperlink w:anchor="__RefHeading___Toc5128_3385418132" w:tooltip="4.7.1 Masken">
+          <w:hyperlink w:anchor="__RefHeading___Toc5128_1482924693" w:tooltip="4.7.1 Masken">
             <w:r>
               <w:rPr>
                 <w:rStyle w:val="Verzeichnissprung"/>
@@ -755,7 +755,7 @@
             </w:tabs>
             <w:rPr/>
           </w:pPr>
-          <w:hyperlink w:anchor="__RefHeading___Toc5130_3385418132" w:tooltip="4.7.2 Auswahl-Engine">
+          <w:hyperlink w:anchor="__RefHeading___Toc5130_1482924693" w:tooltip="4.7.2 Auswahl-Engine">
             <w:r>
               <w:rPr>
                 <w:rStyle w:val="Verzeichnissprung"/>
@@ -775,7 +775,7 @@
             </w:tabs>
             <w:rPr/>
           </w:pPr>
-          <w:hyperlink w:anchor="__RefHeading___Toc5132_3385418132" w:tooltip="4.7.3 ApplyGamma">
+          <w:hyperlink w:anchor="__RefHeading___Toc5132_1482924693" w:tooltip="4.7.3 ApplyGamma">
             <w:r>
               <w:rPr>
                 <w:rStyle w:val="Verzeichnissprung"/>
@@ -795,7 +795,7 @@
             </w:tabs>
             <w:rPr/>
           </w:pPr>
-          <w:hyperlink w:anchor="__RefHeading___Toc5134_3385418132" w:tooltip="4.7.4 ApplyBrightnessContrast">
+          <w:hyperlink w:anchor="__RefHeading___Toc5134_1482924693" w:tooltip="4.7.4 ApplyBrightnessContrast">
             <w:r>
               <w:rPr>
                 <w:rStyle w:val="Verzeichnissprung"/>
@@ -815,7 +815,7 @@
             </w:tabs>
             <w:rPr/>
           </w:pPr>
-          <w:hyperlink w:anchor="__RefHeading___Toc5136_3385418132" w:tooltip="4.7.5 ApplyHueSaturation">
+          <w:hyperlink w:anchor="__RefHeading___Toc5136_1482924693" w:tooltip="4.7.5 ApplyHueSaturation">
             <w:r>
               <w:rPr>
                 <w:rStyle w:val="Verzeichnissprung"/>
@@ -835,7 +835,7 @@
             </w:tabs>
             <w:rPr/>
           </w:pPr>
-          <w:hyperlink w:anchor="__RefHeading___Toc5138_3385418132" w:tooltip="4.7.6 ApplyAdjustmentStack">
+          <w:hyperlink w:anchor="__RefHeading___Toc5138_1482924693" w:tooltip="4.7.6 ApplyAdjustmentStack">
             <w:r>
               <w:rPr>
                 <w:rStyle w:val="Verzeichnissprung"/>
@@ -855,7 +855,7 @@
             </w:tabs>
             <w:rPr/>
           </w:pPr>
-          <w:hyperlink w:anchor="__RefHeading___Toc5140_3385418132" w:tooltip="4.8 Raster-Transformationen">
+          <w:hyperlink w:anchor="__RefHeading___Toc5140_1482924693" w:tooltip="4.8 Raster-Transformationen">
             <w:r>
               <w:rPr>
                 <w:rStyle w:val="Verzeichnissprung"/>
@@ -875,7 +875,7 @@
             </w:tabs>
             <w:rPr/>
           </w:pPr>
-          <w:hyperlink w:anchor="__RefHeading___Toc5142_3385418132" w:tooltip="4.9 ExtendScript-Einstieg (`MuPsDoc`)">
+          <w:hyperlink w:anchor="__RefHeading___Toc5142_1482924693" w:tooltip="4.9 ExtendScript-Einstieg (`MuPsDoc`)">
             <w:r>
               <w:rPr>
                 <w:rStyle w:val="Verzeichnissprung"/>
@@ -895,7 +895,7 @@
             </w:tabs>
             <w:rPr/>
           </w:pPr>
-          <w:hyperlink w:anchor="__RefHeading___Toc5144_3385418132" w:tooltip="4.10 PSD-Compositor und Ebenenzusammenführung">
+          <w:hyperlink w:anchor="__RefHeading___Toc5144_1482924693" w:tooltip="4.10 PSD-Compositor und Ebenenzusammenführung">
             <w:r>
               <w:rPr>
                 <w:rStyle w:val="Verzeichnissprung"/>
@@ -915,7 +915,7 @@
             </w:tabs>
             <w:rPr/>
           </w:pPr>
-          <w:hyperlink w:anchor="__RefHeading___Toc5146_3385418132" w:tooltip="4.10.1 Nachgebildete Fülloptionen (Layer Styles)">
+          <w:hyperlink w:anchor="__RefHeading___Toc5146_1482924693" w:tooltip="4.10.1 Nachgebildete Fülloptionen (Layer Styles)">
             <w:r>
               <w:rPr>
                 <w:rStyle w:val="Verzeichnissprung"/>
@@ -935,7 +935,7 @@
             </w:tabs>
             <w:rPr/>
           </w:pPr>
-          <w:hyperlink w:anchor="__RefHeading___Toc5148_3385418132" w:tooltip="4.10.2 Stilübertragung (ButtonAndIconCreator) vs. Ebenenverknüpfung">
+          <w:hyperlink w:anchor="__RefHeading___Toc5148_1482924693" w:tooltip="4.10.2 Stilübertragung (ButtonAndIconCreator) vs. Ebenenverknüpfung">
             <w:r>
               <w:rPr>
                 <w:rStyle w:val="Verzeichnissprung"/>
@@ -955,7 +955,7 @@
             </w:tabs>
             <w:rPr/>
           </w:pPr>
-          <w:hyperlink w:anchor="__RefHeading___Toc5150_3385418132" w:tooltip="4.10.3 Deckkraft-Modell (drei getrennte Stellschrauben)">
+          <w:hyperlink w:anchor="__RefHeading___Toc5150_1482924693" w:tooltip="4.10.3 Deckkraft-Modell (drei getrennte Stellschrauben)">
             <w:r>
               <w:rPr>
                 <w:rStyle w:val="Verzeichnissprung"/>
@@ -975,7 +975,7 @@
             </w:tabs>
             <w:rPr/>
           </w:pPr>
-          <w:hyperlink w:anchor="__RefHeading___Toc5152_3385418132" w:tooltip="4.10.4 Referenz-PSD und Adobe-Ground-Truth">
+          <w:hyperlink w:anchor="__RefHeading___Toc5152_1482924693" w:tooltip="4.10.4 Referenz-PSD und Adobe-Ground-Truth">
             <w:r>
               <w:rPr>
                 <w:rStyle w:val="Verzeichnissprung"/>
@@ -995,7 +995,7 @@
             </w:tabs>
             <w:rPr/>
           </w:pPr>
-          <w:hyperlink w:anchor="__RefHeading___Toc5154_3385418132" w:tooltip="4.10.5 Werkzeuge (µPS-Entwicklung)">
+          <w:hyperlink w:anchor="__RefHeading___Toc5154_1482924693" w:tooltip="4.10.5 Werkzeuge (µPS-Entwicklung)">
             <w:r>
               <w:rPr>
                 <w:rStyle w:val="Verzeichnissprung"/>
@@ -1015,7 +1015,7 @@
             </w:tabs>
             <w:rPr/>
           </w:pPr>
-          <w:hyperlink w:anchor="__RefHeading___Toc5156_3385418132" w:tooltip="4.11 Draft-Workflow (Authoring + Watch)">
+          <w:hyperlink w:anchor="__RefHeading___Toc5156_1482924693" w:tooltip="4.11 Draft-Workflow (Authoring + Watch)">
             <w:r>
               <w:rPr>
                 <w:rStyle w:val="Verzeichnissprung"/>
@@ -1035,7 +1035,7 @@
             </w:tabs>
             <w:rPr/>
           </w:pPr>
-          <w:hyperlink w:anchor="__RefHeading___Toc5158_3385418132" w:tooltip="4.11.1 Zwischenschritte raw → final (`outputBase`)">
+          <w:hyperlink w:anchor="__RefHeading___Toc5158_1482924693" w:tooltip="4.11.1 Zwischenschritte raw → final (`outputBase`)">
             <w:r>
               <w:rPr>
                 <w:rStyle w:val="Verzeichnissprung"/>
@@ -1055,7 +1055,7 @@
             </w:tabs>
             <w:rPr/>
           </w:pPr>
-          <w:hyperlink w:anchor="__RefHeading___Toc5160_3385418132" w:tooltip="5 microAU (µAU) — Sound-Atlas">
+          <w:hyperlink w:anchor="__RefHeading___Toc5160_1482924693" w:tooltip="5 microAU (µAU) — Sound-Atlas">
             <w:r>
               <w:rPr>
                 <w:rStyle w:val="Verzeichnissprung"/>
@@ -1075,7 +1075,7 @@
             </w:tabs>
             <w:rPr/>
           </w:pPr>
-          <w:hyperlink w:anchor="__RefHeading___Toc5162_3385418132" w:tooltip="5.1 API-Übersicht">
+          <w:hyperlink w:anchor="__RefHeading___Toc5162_1482924693" w:tooltip="5.1 API-Übersicht">
             <w:r>
               <w:rPr>
                 <w:rStyle w:val="Verzeichnissprung"/>
@@ -1095,7 +1095,7 @@
             </w:tabs>
             <w:rPr/>
           </w:pPr>
-          <w:hyperlink w:anchor="__RefHeading___Toc5164_3385418132" w:tooltip="5.2 SoundAtlasMaker">
+          <w:hyperlink w:anchor="__RefHeading___Toc5164_1482924693" w:tooltip="5.2 SoundAtlasMaker">
             <w:r>
               <w:rPr>
                 <w:rStyle w:val="Verzeichnissprung"/>
@@ -1115,7 +1115,7 @@
             </w:tabs>
             <w:rPr/>
           </w:pPr>
-          <w:hyperlink w:anchor="__RefHeading___Toc5166_3385418132" w:tooltip="5.2.1 Loop-Punkte im Dateinamen">
+          <w:hyperlink w:anchor="__RefHeading___Toc5166_1482924693" w:tooltip="5.2.1 Loop-Punkte im Dateinamen">
             <w:r>
               <w:rPr>
                 <w:rStyle w:val="Verzeichnissprung"/>
@@ -1135,7 +1135,7 @@
             </w:tabs>
             <w:rPr/>
           </w:pPr>
-          <w:hyperlink w:anchor="__RefHeading___Toc5168_3385418132" w:tooltip="5.2.2 JSON-Format">
+          <w:hyperlink w:anchor="__RefHeading___Toc5168_1482924693" w:tooltip="5.2.2 JSON-Format">
             <w:r>
               <w:rPr>
                 <w:rStyle w:val="Verzeichnissprung"/>
@@ -1155,7 +1155,7 @@
             </w:tabs>
             <w:rPr/>
           </w:pPr>
-          <w:hyperlink w:anchor="__RefHeading___Toc5170_3385418132" w:tooltip="5.2.3 MP3-Eingaben">
+          <w:hyperlink w:anchor="__RefHeading___Toc5170_1482924693" w:tooltip="5.2.3 MP3-Eingaben">
             <w:r>
               <w:rPr>
                 <w:rStyle w:val="Verzeichnissprung"/>
@@ -1175,12 +1175,12 @@
             </w:tabs>
             <w:rPr/>
           </w:pPr>
-          <w:hyperlink w:anchor="__RefHeading___Toc5172_3385418132" w:tooltip="5.3 Anbindung an µCSS (Manifest `sounds`)">
+          <w:hyperlink w:anchor="__RefHeading___Toc5172_1482924693" w:tooltip="5.3 Anbindung an µCSS™ (Manifest `sounds`)">
             <w:r>
               <w:rPr>
                 <w:rStyle w:val="Verzeichnissprung"/>
               </w:rPr>
-              <w:t>5.3 Anbindung an µCSS (Manifest `sounds`)</w:t>
+              <w:t>5.3 Anbindung an µCSS™ (Manifest `sounds`)</w:t>
               <w:tab/>
               <w:t>28</w:t>
             </w:r>
@@ -1195,7 +1195,7 @@
             </w:tabs>
             <w:rPr/>
           </w:pPr>
-          <w:hyperlink w:anchor="__RefHeading___Toc5174_3385418132" w:tooltip="5.3.1 Geplant: CSS-Sounds, Auto-Wiring &amp; Handler-Overrides">
+          <w:hyperlink w:anchor="__RefHeading___Toc5174_1482924693" w:tooltip="5.3.1 Geplant: CSS-Sounds, Auto-Wiring &amp; Handler-Overrides">
             <w:r>
               <w:rPr>
                 <w:rStyle w:val="Verzeichnissprung"/>
@@ -1215,7 +1215,7 @@
             </w:tabs>
             <w:rPr/>
           </w:pPr>
-          <w:hyperlink w:anchor="__RefHeading___Toc5176_3385418132" w:tooltip="6 microFT (µFT) — Icon-Font">
+          <w:hyperlink w:anchor="__RefHeading___Toc5176_1482924693" w:tooltip="6 microFT (µFT) — Icon-Font">
             <w:r>
               <w:rPr>
                 <w:rStyle w:val="Verzeichnissprung"/>
@@ -1235,7 +1235,7 @@
             </w:tabs>
             <w:rPr/>
           </w:pPr>
-          <w:hyperlink w:anchor="__RefHeading___Toc5178_3385418132" w:tooltip="6.1 Glyphen-Benennung">
+          <w:hyperlink w:anchor="__RefHeading___Toc5178_1482924693" w:tooltip="6.1 Glyphen-Benennung">
             <w:r>
               <w:rPr>
                 <w:rStyle w:val="Verzeichnissprung"/>
@@ -1255,7 +1255,7 @@
             </w:tabs>
             <w:rPr/>
           </w:pPr>
-          <w:hyperlink w:anchor="__RefHeading___Toc5180_3385418132" w:tooltip="6.2 FontGenerator">
+          <w:hyperlink w:anchor="__RefHeading___Toc5180_1482924693" w:tooltip="6.2 FontGenerator">
             <w:r>
               <w:rPr>
                 <w:rStyle w:val="Verzeichnissprung"/>
@@ -1275,7 +1275,7 @@
             </w:tabs>
             <w:rPr/>
           </w:pPr>
-          <w:hyperlink w:anchor="__RefHeading___Toc5182_3385418132" w:tooltip="6.3 API-Bausteine">
+          <w:hyperlink w:anchor="__RefHeading___Toc5182_1482924693" w:tooltip="6.3 API-Bausteine">
             <w:r>
               <w:rPr>
                 <w:rStyle w:val="Verzeichnissprung"/>
@@ -1295,12 +1295,12 @@
             </w:tabs>
             <w:rPr/>
           </w:pPr>
-          <w:hyperlink w:anchor="__RefHeading___Toc5184_3385418132" w:tooltip="6.4 Anbindung an µCSS">
+          <w:hyperlink w:anchor="__RefHeading___Toc5184_1482924693" w:tooltip="6.4 Anbindung an µCSS™">
             <w:r>
               <w:rPr>
                 <w:rStyle w:val="Verzeichnissprung"/>
               </w:rPr>
-              <w:t>6.4 Anbindung an µCSS</w:t>
+              <w:t>6.4 Anbindung an µCSS™</w:t>
               <w:tab/>
               <w:t>30</w:t>
             </w:r>
@@ -1315,7 +1315,7 @@
             </w:tabs>
             <w:rPr/>
           </w:pPr>
-          <w:hyperlink w:anchor="__RefHeading___Toc5186_3385418132" w:tooltip="7 Vue und Komponenten-Co-Location">
+          <w:hyperlink w:anchor="__RefHeading___Toc5186_1482924693" w:tooltip="7 Vue und Komponenten-Co-Location">
             <w:r>
               <w:rPr>
                 <w:rStyle w:val="Verzeichnissprung"/>
@@ -1335,7 +1335,7 @@
             </w:tabs>
             <w:rPr/>
           </w:pPr>
-          <w:hyperlink w:anchor="__RefHeading___Toc5188_3385418132" w:tooltip="7.1 Ablauf">
+          <w:hyperlink w:anchor="__RefHeading___Toc5188_1482924693" w:tooltip="7.1 Ablauf">
             <w:r>
               <w:rPr>
                 <w:rStyle w:val="Verzeichnissprung"/>
@@ -1355,7 +1355,7 @@
             </w:tabs>
             <w:rPr/>
           </w:pPr>
-          <w:hyperlink w:anchor="__RefHeading___Toc5190_3385418132" w:tooltip="7.2 Namespaces und globale State-Klassen">
+          <w:hyperlink w:anchor="__RefHeading___Toc5190_1482924693" w:tooltip="7.2 Namespaces und globale State-Klassen">
             <w:r>
               <w:rPr>
                 <w:rStyle w:val="Verzeichnissprung"/>
@@ -1375,7 +1375,7 @@
             </w:tabs>
             <w:rPr/>
           </w:pPr>
-          <w:hyperlink w:anchor="__RefHeading___Toc5192_3385418132" w:tooltip="7.3 Bestehende Vue-SFCs migrieren">
+          <w:hyperlink w:anchor="__RefHeading___Toc5192_1482924693" w:tooltip="7.3 Bestehende Vue-SFCs migrieren">
             <w:r>
               <w:rPr>
                 <w:rStyle w:val="Verzeichnissprung"/>
@@ -1395,12 +1395,12 @@
             </w:tabs>
             <w:rPr/>
           </w:pPr>
-          <w:hyperlink w:anchor="__RefHeading___Toc5194_3385418132" w:tooltip="8 Grundideen von µCSS">
+          <w:hyperlink w:anchor="__RefHeading___Toc5194_1482924693" w:tooltip="8 Grundideen von µCSS™">
             <w:r>
               <w:rPr>
                 <w:rStyle w:val="Verzeichnissprung"/>
               </w:rPr>
-              <w:t>8 Grundideen von µCSS</w:t>
+              <w:t>8 Grundideen von µCSS™</w:t>
               <w:tab/>
               <w:t>32</w:t>
             </w:r>
@@ -1415,7 +1415,7 @@
             </w:tabs>
             <w:rPr/>
           </w:pPr>
-          <w:hyperlink w:anchor="__RefHeading___Toc5196_3385418132" w:tooltip="8.1 Das .µ.css-Format">
+          <w:hyperlink w:anchor="__RefHeading___Toc5196_1482924693" w:tooltip="8.1 Das .µ.css-Format">
             <w:r>
               <w:rPr>
                 <w:rStyle w:val="Verzeichnissprung"/>
@@ -1435,7 +1435,7 @@
             </w:tabs>
             <w:rPr/>
           </w:pPr>
-          <w:hyperlink w:anchor="__RefHeading___Toc5198_3385418132" w:tooltip="8.2 Werte-Interpolation µ(Ausdruck)">
+          <w:hyperlink w:anchor="__RefHeading___Toc5198_1482924693" w:tooltip="8.2 Werte-Interpolation µ(Ausdruck)">
             <w:r>
               <w:rPr>
                 <w:rStyle w:val="Verzeichnissprung"/>
@@ -1455,7 +1455,7 @@
             </w:tabs>
             <w:rPr/>
           </w:pPr>
-          <w:hyperlink w:anchor="__RefHeading___Toc5200_3385418132" w:tooltip="8.3 Direktiven -µ: Ausdruck">
+          <w:hyperlink w:anchor="__RefHeading___Toc5200_1482924693" w:tooltip="8.3 Direktiven -µ: Ausdruck">
             <w:r>
               <w:rPr>
                 <w:rStyle w:val="Verzeichnissprung"/>
@@ -1475,7 +1475,7 @@
             </w:tabs>
             <w:rPr/>
           </w:pPr>
-          <w:hyperlink w:anchor="__RefHeading___Toc5202_3385418132" w:tooltip="8.4 Das Skin-Manifest">
+          <w:hyperlink w:anchor="__RefHeading___Toc5202_1482924693" w:tooltip="8.4 Das Skin-Manifest">
             <w:r>
               <w:rPr>
                 <w:rStyle w:val="Verzeichnissprung"/>
@@ -1495,7 +1495,7 @@
             </w:tabs>
             <w:rPr/>
           </w:pPr>
-          <w:hyperlink w:anchor="__RefHeading___Toc5204_3385418132" w:tooltip="8.5 JavaScript ohne Ersatzzeichen">
+          <w:hyperlink w:anchor="__RefHeading___Toc5204_1482924693" w:tooltip="8.5 JavaScript ohne Ersatzzeichen">
             <w:r>
               <w:rPr>
                 <w:rStyle w:val="Verzeichnissprung"/>
@@ -1515,7 +1515,7 @@
             </w:tabs>
             <w:rPr/>
           </w:pPr>
-          <w:hyperlink w:anchor="__RefHeading___Toc5206_3385418132" w:tooltip="9 Build-Ablauf und Gulp-Integration">
+          <w:hyperlink w:anchor="__RefHeading___Toc5206_1482924693" w:tooltip="9 Build-Ablauf und Gulp-Integration">
             <w:r>
               <w:rPr>
                 <w:rStyle w:val="Verzeichnissprung"/>
@@ -1535,7 +1535,7 @@
             </w:tabs>
             <w:rPr/>
           </w:pPr>
-          <w:hyperlink w:anchor="__RefHeading___Toc5208_3385418132" w:tooltip="9.1 Verzeichniskonventionen">
+          <w:hyperlink w:anchor="__RefHeading___Toc5208_1482924693" w:tooltip="9.1 Verzeichniskonventionen">
             <w:r>
               <w:rPr>
                 <w:rStyle w:val="Verzeichnissprung"/>
@@ -1555,7 +1555,7 @@
             </w:tabs>
             <w:rPr/>
           </w:pPr>
-          <w:hyperlink w:anchor="__RefHeading___Toc5210_3385418132" w:tooltip="9.2 Kompilierungs-Ablauf">
+          <w:hyperlink w:anchor="__RefHeading___Toc5210_1482924693" w:tooltip="9.2 Kompilierungs-Ablauf">
             <w:r>
               <w:rPr>
                 <w:rStyle w:val="Verzeichnissprung"/>
@@ -1575,7 +1575,7 @@
             </w:tabs>
             <w:rPr/>
           </w:pPr>
-          <w:hyperlink w:anchor="__RefHeading___Toc5212_3385418132" w:tooltip="9.3 Inkrementeller Build und Cache">
+          <w:hyperlink w:anchor="__RefHeading___Toc5212_1482924693" w:tooltip="9.3 Inkrementeller Build und Cache">
             <w:r>
               <w:rPr>
                 <w:rStyle w:val="Verzeichnissprung"/>
@@ -1595,7 +1595,7 @@
             </w:tabs>
             <w:rPr/>
           </w:pPr>
-          <w:hyperlink w:anchor="__RefHeading___Toc5214_3385418132" w:tooltip="9.4 Gulp-Tasks und Watch">
+          <w:hyperlink w:anchor="__RefHeading___Toc5214_1482924693" w:tooltip="9.4 Gulp-Tasks und Watch">
             <w:r>
               <w:rPr>
                 <w:rStyle w:val="Verzeichnissprung"/>
@@ -1615,7 +1615,7 @@
             </w:tabs>
             <w:rPr/>
           </w:pPr>
-          <w:hyperlink w:anchor="__RefHeading___Toc5216_3385418132" w:tooltip="10 Manifest-Referenz (DefineSkin)">
+          <w:hyperlink w:anchor="__RefHeading___Toc5216_1482924693" w:tooltip="10 Manifest-Referenz (DefineSkin)">
             <w:r>
               <w:rPr>
                 <w:rStyle w:val="Verzeichnissprung"/>
@@ -1635,7 +1635,7 @@
             </w:tabs>
             <w:rPr/>
           </w:pPr>
-          <w:hyperlink w:anchor="__RefHeading___Toc5218_3385418132" w:tooltip="10.1 vars">
+          <w:hyperlink w:anchor="__RefHeading___Toc5218_1482924693" w:tooltip="10.1 vars">
             <w:r>
               <w:rPr>
                 <w:rStyle w:val="Verzeichnissprung"/>
@@ -1655,7 +1655,7 @@
             </w:tabs>
             <w:rPr/>
           </w:pPr>
-          <w:hyperlink w:anchor="__RefHeading___Toc5220_3385418132" w:tooltip="10.2 helpers">
+          <w:hyperlink w:anchor="__RefHeading___Toc5220_1482924693" w:tooltip="10.2 helpers">
             <w:r>
               <w:rPr>
                 <w:rStyle w:val="Verzeichnissprung"/>
@@ -1675,7 +1675,7 @@
             </w:tabs>
             <w:rPr/>
           </w:pPr>
-          <w:hyperlink w:anchor="__RefHeading___Toc5222_3385418132" w:tooltip="10.3 cursors">
+          <w:hyperlink w:anchor="__RefHeading___Toc5222_1482924693" w:tooltip="10.3 cursors">
             <w:r>
               <w:rPr>
                 <w:rStyle w:val="Verzeichnissprung"/>
@@ -1695,7 +1695,7 @@
             </w:tabs>
             <w:rPr/>
           </w:pPr>
-          <w:hyperlink w:anchor="__RefHeading___Toc5224_3385418132" w:tooltip="10.4 media">
+          <w:hyperlink w:anchor="__RefHeading___Toc5224_1482924693" w:tooltip="10.4 media">
             <w:r>
               <w:rPr>
                 <w:rStyle w:val="Verzeichnissprung"/>
@@ -1715,7 +1715,7 @@
             </w:tabs>
             <w:rPr/>
           </w:pPr>
-          <w:hyperlink w:anchor="__RefHeading___Toc5226_3385418132" w:tooltip="10.5 imageFormat">
+          <w:hyperlink w:anchor="__RefHeading___Toc5226_1482924693" w:tooltip="10.5 imageFormat">
             <w:r>
               <w:rPr>
                 <w:rStyle w:val="Verzeichnissprung"/>
@@ -1735,7 +1735,7 @@
             </w:tabs>
             <w:rPr/>
           </w:pPr>
-          <w:hyperlink w:anchor="__RefHeading___Toc5228_3385418132" w:tooltip="10.6 sprites">
+          <w:hyperlink w:anchor="__RefHeading___Toc5228_1482924693" w:tooltip="10.6 sprites">
             <w:r>
               <w:rPr>
                 <w:rStyle w:val="Verzeichnissprung"/>
@@ -1755,7 +1755,7 @@
             </w:tabs>
             <w:rPr/>
           </w:pPr>
-          <w:hyperlink w:anchor="__RefHeading___Toc5230_3385418132" w:tooltip="10.7 minify">
+          <w:hyperlink w:anchor="__RefHeading___Toc5230_1482924693" w:tooltip="10.7 minify">
             <w:r>
               <w:rPr>
                 <w:rStyle w:val="Verzeichnissprung"/>
@@ -1775,7 +1775,7 @@
             </w:tabs>
             <w:rPr/>
           </w:pPr>
-          <w:hyperlink w:anchor="__RefHeading___Toc5232_3385418132" w:tooltip="10.8 sounds">
+          <w:hyperlink w:anchor="__RefHeading___Toc5232_1482924693" w:tooltip="10.8 sounds">
             <w:r>
               <w:rPr>
                 <w:rStyle w:val="Verzeichnissprung"/>
@@ -1795,7 +1795,7 @@
             </w:tabs>
             <w:rPr/>
           </w:pPr>
-          <w:hyperlink w:anchor="__RefHeading___Toc5234_3385418132" w:tooltip="10.9 font">
+          <w:hyperlink w:anchor="__RefHeading___Toc5234_1482924693" w:tooltip="10.9 font">
             <w:r>
               <w:rPr>
                 <w:rStyle w:val="Verzeichnissprung"/>
@@ -1815,7 +1815,7 @@
             </w:tabs>
             <w:rPr/>
           </w:pPr>
-          <w:hyperlink w:anchor="__RefHeading___Toc5236_3385418132" w:tooltip="10.10 files">
+          <w:hyperlink w:anchor="__RefHeading___Toc5236_1482924693" w:tooltip="10.10 files">
             <w:r>
               <w:rPr>
                 <w:rStyle w:val="Verzeichnissprung"/>
@@ -1835,7 +1835,7 @@
             </w:tabs>
             <w:rPr/>
           </w:pPr>
-          <w:hyperlink w:anchor="__RefHeading___Toc5238_3385418132" w:tooltip="11 µ-Auswertungskontext (Referenz)">
+          <w:hyperlink w:anchor="__RefHeading___Toc5238_1482924693" w:tooltip="11 µ-Auswertungskontext (Referenz)">
             <w:r>
               <w:rPr>
                 <w:rStyle w:val="Verzeichnissprung"/>
@@ -1855,7 +1855,7 @@
             </w:tabs>
             <w:rPr/>
           </w:pPr>
-          <w:hyperlink w:anchor="__RefHeading___Toc5240_3385418132" w:tooltip="11.1 Das $-Objekt">
+          <w:hyperlink w:anchor="__RefHeading___Toc5240_1482924693" w:tooltip="11.1 Das $-Objekt">
             <w:r>
               <w:rPr>
                 <w:rStyle w:val="Verzeichnissprung"/>
@@ -1875,7 +1875,7 @@
             </w:tabs>
             <w:rPr/>
           </w:pPr>
-          <w:hyperlink w:anchor="__RefHeading___Toc5242_3385418132" w:tooltip="11.2 Farb- und Wert-Funktionen">
+          <w:hyperlink w:anchor="__RefHeading___Toc5242_1482924693" w:tooltip="11.2 Farb- und Wert-Funktionen">
             <w:r>
               <w:rPr>
                 <w:rStyle w:val="Verzeichnissprung"/>
@@ -1895,7 +1895,7 @@
             </w:tabs>
             <w:rPr/>
           </w:pPr>
-          <w:hyperlink w:anchor="__RefHeading___Toc5244_3385418132" w:tooltip="11.3 Regel- und Dokument-Methoden">
+          <w:hyperlink w:anchor="__RefHeading___Toc5244_1482924693" w:tooltip="11.3 Regel- und Dokument-Methoden">
             <w:r>
               <w:rPr>
                 <w:rStyle w:val="Verzeichnissprung"/>
@@ -1915,7 +1915,7 @@
             </w:tabs>
             <w:rPr/>
           </w:pPr>
-          <w:hyperlink w:anchor="__RefHeading___Toc5246_3385418132" w:tooltip="11.4 Sprite()">
+          <w:hyperlink w:anchor="__RefHeading___Toc5246_1482924693" w:tooltip="11.4 Sprite()">
             <w:r>
               <w:rPr>
                 <w:rStyle w:val="Verzeichnissprung"/>
@@ -1935,7 +1935,7 @@
             </w:tabs>
             <w:rPr/>
           </w:pPr>
-          <w:hyperlink w:anchor="__RefHeading___Toc5248_3385418132" w:tooltip="11.5 Cursor()">
+          <w:hyperlink w:anchor="__RefHeading___Toc5248_1482924693" w:tooltip="11.5 Cursor()">
             <w:r>
               <w:rPr>
                 <w:rStyle w:val="Verzeichnissprung"/>
@@ -1955,7 +1955,7 @@
             </w:tabs>
             <w:rPr/>
           </w:pPr>
-          <w:hyperlink w:anchor="__RefHeading___Toc5250_3385418132" w:tooltip="11.6 Helper-Funktionen und this-Bindung">
+          <w:hyperlink w:anchor="__RefHeading___Toc5250_1482924693" w:tooltip="11.6 Helper-Funktionen und this-Bindung">
             <w:r>
               <w:rPr>
                 <w:rStyle w:val="Verzeichnissprung"/>
@@ -1975,7 +1975,7 @@
             </w:tabs>
             <w:rPr/>
           </w:pPr>
-          <w:hyperlink w:anchor="__RefHeading___Toc5252_3385418132" w:tooltip="11.7 afterWork-Hooks">
+          <w:hyperlink w:anchor="__RefHeading___Toc5252_1482924693" w:tooltip="11.7 afterWork-Hooks">
             <w:r>
               <w:rPr>
                 <w:rStyle w:val="Verzeichnissprung"/>
@@ -1995,7 +1995,7 @@
             </w:tabs>
             <w:rPr/>
           </w:pPr>
-          <w:hyperlink w:anchor="__RefHeading___Toc5254_3385418132" w:tooltip="12 Arbeiten mit Farben">
+          <w:hyperlink w:anchor="__RefHeading___Toc5254_1482924693" w:tooltip="12 Arbeiten mit Farben">
             <w:r>
               <w:rPr>
                 <w:rStyle w:val="Verzeichnissprung"/>
@@ -2015,7 +2015,7 @@
             </w:tabs>
             <w:rPr/>
           </w:pPr>
-          <w:hyperlink w:anchor="__RefHeading___Toc5256_3385418132" w:tooltip="12.1 Farben definieren">
+          <w:hyperlink w:anchor="__RefHeading___Toc5256_1482924693" w:tooltip="12.1 Farben definieren">
             <w:r>
               <w:rPr>
                 <w:rStyle w:val="Verzeichnissprung"/>
@@ -2035,7 +2035,7 @@
             </w:tabs>
             <w:rPr/>
           </w:pPr>
-          <w:hyperlink w:anchor="__RefHeading___Toc5258_3385418132" w:tooltip="12.2 Alpha-Werte">
+          <w:hyperlink w:anchor="__RefHeading___Toc5258_1482924693" w:tooltip="12.2 Alpha-Werte">
             <w:r>
               <w:rPr>
                 <w:rStyle w:val="Verzeichnissprung"/>
@@ -2055,7 +2055,7 @@
             </w:tabs>
             <w:rPr/>
           </w:pPr>
-          <w:hyperlink w:anchor="__RefHeading___Toc5260_3385418132" w:tooltip="12.3 Farbberechnungen">
+          <w:hyperlink w:anchor="__RefHeading___Toc5260_1482924693" w:tooltip="12.3 Farbberechnungen">
             <w:r>
               <w:rPr>
                 <w:rStyle w:val="Verzeichnissprung"/>
@@ -2075,7 +2075,7 @@
             </w:tabs>
             <w:rPr/>
           </w:pPr>
-          <w:hyperlink w:anchor="__RefHeading___Toc5262_3385418132" w:tooltip="13 Node-API">
+          <w:hyperlink w:anchor="__RefHeading___Toc5262_1482924693" w:tooltip="13 Node-API">
             <w:r>
               <w:rPr>
                 <w:rStyle w:val="Verzeichnissprung"/>
@@ -2095,7 +2095,7 @@
             </w:tabs>
             <w:rPr/>
           </w:pPr>
-          <w:hyperlink w:anchor="__RefHeading___Toc5264_3385418132" w:tooltip="14 Fehlerdiagnostik">
+          <w:hyperlink w:anchor="__RefHeading___Toc5264_1482924693" w:tooltip="14 Fehlerdiagnostik">
             <w:r>
               <w:rPr>
                 <w:rStyle w:val="Verzeichnissprung"/>
@@ -2115,12 +2115,12 @@
             </w:tabs>
             <w:rPr/>
           </w:pPr>
-          <w:hyperlink w:anchor="__RefHeading___Toc5266_3385418132" w:tooltip="15 Migration von µCSS">
+          <w:hyperlink w:anchor="__RefHeading___Toc5266_1482924693" w:tooltip="15 Migration von µCSS™">
             <w:r>
               <w:rPr>
                 <w:rStyle w:val="Verzeichnissprung"/>
               </w:rPr>
-              <w:t>15 Migration von µCSS</w:t>
+              <w:t>15 Migration von µCSS™</w:t>
               <w:tab/>
               <w:t>48</w:t>
             </w:r>
@@ -2135,7 +2135,7 @@
             </w:tabs>
             <w:rPr/>
           </w:pPr>
-          <w:hyperlink w:anchor="__RefHeading___Toc5268_3385418132" w:tooltip="16 Versionshistorie">
+          <w:hyperlink w:anchor="__RefHeading___Toc5268_1482924693" w:tooltip="16 Versionshistorie">
             <w:r>
               <w:rPr>
                 <w:rStyle w:val="Verzeichnissprung"/>
@@ -2155,7 +2155,7 @@
             </w:tabs>
             <w:rPr/>
           </w:pPr>
-          <w:hyperlink w:anchor="__RefHeading___Toc5270_3385418132" w:tooltip="17 Rechtliches">
+          <w:hyperlink w:anchor="__RefHeading___Toc5270_1482924693" w:tooltip="17 Rechtliches">
             <w:r>
               <w:rPr>
                 <w:rStyle w:val="Verzeichnissprung"/>
@@ -2175,7 +2175,7 @@
             </w:tabs>
             <w:rPr/>
           </w:pPr>
-          <w:hyperlink w:anchor="__RefHeading___Toc5272_3385418132" w:tooltip="17.1 MIT-Lizenz (Originaltext)">
+          <w:hyperlink w:anchor="__RefHeading___Toc5272_1482924693" w:tooltip="17.1 MIT-Lizenz (Originaltext)">
             <w:r>
               <w:rPr>
                 <w:rStyle w:val="Verzeichnissprung"/>
@@ -2195,7 +2195,7 @@
             </w:tabs>
             <w:rPr/>
           </w:pPr>
-          <w:hyperlink w:anchor="__RefHeading___Toc5274_3385418132" w:tooltip="17.2 Marken">
+          <w:hyperlink w:anchor="__RefHeading___Toc5274_1482924693" w:tooltip="17.2 Marken">
             <w:r>
               <w:rPr>
                 <w:rStyle w:val="Verzeichnissprung"/>
@@ -2215,7 +2215,7 @@
             </w:tabs>
             <w:rPr/>
           </w:pPr>
-          <w:hyperlink w:anchor="__RefHeading___Toc5276_3385418132" w:tooltip="17.3 Verwendete Bibliotheken">
+          <w:hyperlink w:anchor="__RefHeading___Toc5276_1482924693" w:tooltip="17.3 Verwendete Bibliotheken">
             <w:r>
               <w:rPr>
                 <w:rStyle w:val="Verzeichnissprung"/>
@@ -2266,7 +2266,7 @@
         <w:outlineLvl w:val="0"/>
         <w:rPr/>
       </w:pPr>
-      <w:bookmarkStart w:id="0" w:name="__RefHeading___Toc5076_3385418132"/>
+      <w:bookmarkStart w:id="0" w:name="__RefHeading___Toc5076_1482924693"/>
       <w:bookmarkEnd w:id="0"/>
       <w:r>
         <w:rPr/>
@@ -2282,7 +2282,7 @@
       </w:pPr>
       <w:r>
         <w:rPr/>
-        <w:t>&lt;p align="center"&gt;   &lt;img src="imgs/logo.png" alt="µCSS logo" width="200"&gt; &lt;/p&gt;</w:t>
+        <w:t>&lt;p align="center"&gt;   &lt;img src="imgs/logo.png" alt="µCSS™ logo" width="200"&gt; &lt;/p&gt;</w:t>
       </w:r>
     </w:p>
     <w:p>
@@ -2294,7 +2294,7 @@
       </w:pPr>
       <w:r>
         <w:rPr/>
-        <w:t>µCSS ist ein Node-Modul zur Verarbeitung von CSS-Dateien und zur Generierung von Web-Grafiken. Dieses Handbuch beschreibt die Version 2 — den Node-basierten Nachfolger des 2013 eingeführten, Adobe-Photoshop-basierten µCSS 1: Aus erweiterten Quell-Stylesheets (</w:t>
+        <w:t>µCSS™ ist ein Node-Modul zur Verarbeitung von CSS-Dateien und zur Generierung von Web-Grafiken. Dieses Handbuch beschreibt die Version 2 — den Node-basierten Nachfolger des 2013 eingeführten, Adobe-Photoshop-basierten µCSS™ 1: Aus erweiterten Quell-Stylesheets (</w:t>
       </w:r>
       <w:r>
         <w:rPr>
@@ -2345,7 +2345,7 @@
       </w:r>
       <w:r>
         <w:rPr/>
-        <w:t xml:space="preserve"> — µCSS und µPS sind die Anzeigenamen.</w:t>
+        <w:t xml:space="preserve"> — µCSS™ und µPS sind die Anzeigenamen.</w:t>
       </w:r>
     </w:p>
     <w:p>
@@ -2357,7 +2357,7 @@
       </w:pPr>
       <w:r>
         <w:rPr/>
-        <w:t>Die wichtigsten Eigenschaften von µCSS 2:</w:t>
+        <w:t>Die wichtigsten Eigenschaften von µCSS™ 2:</w:t>
       </w:r>
     </w:p>
     <w:p>
@@ -2645,7 +2645,7 @@
       </w:pPr>
       <w:r>
         <w:rPr/>
-        <w:t>Im Gegensatz zu µCSS 1 läuft Version 2 vollständig in Node.js (ab Version 18) und benötigt weder Photoshop noch andere Adobe-Produkte. Die Build-Steuerung erfolgt über Gulp oder direkt über die Node-API.</w:t>
+        <w:t>Im Gegensatz zu µCSS™ 1 läuft Version 2 vollständig in Node.js (ab Version 18) und benötigt weder Photoshop noch andere Adobe-Produkte. Die Build-Steuerung erfolgt über Gulp oder direkt über die Node-API.</w:t>
       </w:r>
     </w:p>
     <w:p>
@@ -2659,7 +2659,7 @@
         <w:outlineLvl w:val="1"/>
         <w:rPr/>
       </w:pPr>
-      <w:bookmarkStart w:id="1" w:name="__RefHeading___Toc5078_3385418132"/>
+      <w:bookmarkStart w:id="1" w:name="__RefHeading___Toc5078_1482924693"/>
       <w:bookmarkEnd w:id="1"/>
       <w:r>
         <w:rPr/>
@@ -2768,7 +2768,7 @@
       </w:r>
       <w:r>
         <w:rPr/>
-        <w:t>). Als PSD speichern; µPS liest dieselbe Ebenenstruktur. Bei µCSS 1 hingen Kompilierung und Bitmap-Erzeugung an einer lizenzierten Desktop-Bildbearbeitung — laufende Kosten, die für viele Teams entfallen.</w:t>
+        <w:t>). Als PSD speichern; µPS liest dieselbe Ebenenstruktur. Bei µCSS™ 1 hingen Kompilierung und Bitmap-Erzeugung an einer lizenzierten Desktop-Bildbearbeitung — laufende Kosten, die für viele Teams entfallen.</w:t>
       </w:r>
     </w:p>
     <w:p>
@@ -2782,7 +2782,7 @@
         <w:outlineLvl w:val="1"/>
         <w:rPr/>
       </w:pPr>
-      <w:bookmarkStart w:id="2" w:name="__RefHeading___Toc5080_3385418132"/>
+      <w:bookmarkStart w:id="2" w:name="__RefHeading___Toc5080_1482924693"/>
       <w:bookmarkEnd w:id="2"/>
       <w:r>
         <w:rPr/>
@@ -3752,7 +3752,7 @@
         <w:outlineLvl w:val="2"/>
         <w:rPr/>
       </w:pPr>
-      <w:bookmarkStart w:id="3" w:name="__RefHeading___Toc5082_3385418132"/>
+      <w:bookmarkStart w:id="3" w:name="__RefHeading___Toc5082_1482924693"/>
       <w:bookmarkEnd w:id="3"/>
       <w:r>
         <w:rPr/>
@@ -3992,11 +3992,11 @@
         <w:outlineLvl w:val="1"/>
         <w:rPr/>
       </w:pPr>
-      <w:bookmarkStart w:id="4" w:name="__RefHeading___Toc5084_3385418132"/>
+      <w:bookmarkStart w:id="4" w:name="__RefHeading___Toc5084_1482924693"/>
       <w:bookmarkEnd w:id="4"/>
       <w:r>
         <w:rPr/>
-        <w:t>1.3 Einordnung: Warum µCSS?</w:t>
+        <w:t>1.3 Einordnung: Warum µCSS™?</w:t>
       </w:r>
     </w:p>
     <w:p>
@@ -4008,7 +4008,7 @@
       </w:pPr>
       <w:r>
         <w:rPr/>
-        <w:t>Für fast jeden Teilaspekt von µCSS existiert ein etabliertes Einzelwerkzeug — aber kein System, das alles bündelt:</w:t>
+        <w:t>Für fast jeden Teilaspekt von µCSS™ existiert ein etabliertes Einzelwerkzeug — aber kein System, das alles bündelt:</w:t>
       </w:r>
     </w:p>
     <w:tbl>
@@ -4611,7 +4611,7 @@
       </w:pPr>
       <w:r>
         <w:rPr/>
-        <w:t xml:space="preserve">Ein Teil der ursprünglichen µCSS-Motivation von 2013 ist heute durch natives CSS gelöst (Custom Properties, </w:t>
+        <w:t xml:space="preserve">Ein Teil der ursprünglichen µCSS™-Motivation von 2013 ist heute durch natives CSS gelöst (Custom Properties, </w:t>
       </w:r>
       <w:r>
         <w:rPr>
@@ -4624,7 +4624,7 @@
       </w:r>
       <w:r>
         <w:rPr/>
-        <w:t>, Nesting) — deshalb verzichtet µCSS 2 bewusst auf LESS-Unterstützung und Vendor-Prefixes. Der verbleibende Kern ist konkurrenzlos: beliebige JavaScript-Ausdrücke im CSS plus Direktiven mit AST-Zugriff, gekoppelt mit Sprite-Atlas inklusive Retina, PSD-Render-Pipeline und inkrementellem Cache, gesteuert über ein Manifest pro Skin. Und da µCSS intern eine PostCSS-Pipeline ist, bleibt das gesamte PostCSS-Ökosystem (cssnano, Stylelint, …) andockbar, statt in Konkurrenz dazu zu stehen.</w:t>
+        <w:t>, Nesting) — deshalb verzichtet µCSS™ 2 bewusst auf LESS-Unterstützung und Vendor-Prefixes. Der verbleibende Kern ist konkurrenzlos: beliebige JavaScript-Ausdrücke im CSS plus Direktiven mit AST-Zugriff, gekoppelt mit Sprite-Atlas inklusive Retina, PSD-Render-Pipeline und inkrementellem Cache, gesteuert über ein Manifest pro Skin. Und da µCSS™ intern eine PostCSS-Pipeline ist, bleibt das gesamte PostCSS-Ökosystem (cssnano, Stylelint, …) andockbar, statt in Konkurrenz dazu zu stehen.</w:t>
       </w:r>
       <w:r>
         <w:br w:type="page"/>
@@ -4641,7 +4641,7 @@
         <w:outlineLvl w:val="0"/>
         <w:rPr/>
       </w:pPr>
-      <w:bookmarkStart w:id="5" w:name="__RefHeading___Toc5086_3385418132"/>
+      <w:bookmarkStart w:id="5" w:name="__RefHeading___Toc5086_1482924693"/>
       <w:bookmarkEnd w:id="5"/>
       <w:r>
         <w:rPr/>
@@ -4657,7 +4657,7 @@
       </w:pPr>
       <w:r>
         <w:rPr/>
-        <w:t xml:space="preserve">µCSS und µPS sind als npm-Module </w:t>
+        <w:t xml:space="preserve">µCSS™ und µPS sind als npm-Module </w:t>
       </w:r>
       <w:r>
         <w:rPr>
@@ -4711,7 +4711,7 @@
       </w:pPr>
       <w:r>
         <w:rPr/>
-        <w:t>µCSS hängt von µPS ab (Atlas- und Bilderzeugung) — nicht umgekehrt. Beide Module sind separat verwendbar.</w:t>
+        <w:t>µCSS™ hängt von µPS ab (Atlas- und Bilderzeugung) — nicht umgekehrt. Beide Module sind separat verwendbar.</w:t>
       </w:r>
     </w:p>
     <w:p>
@@ -4967,7 +4967,7 @@
         <w:outlineLvl w:val="0"/>
         <w:rPr/>
       </w:pPr>
-      <w:bookmarkStart w:id="6" w:name="__RefHeading___Toc5088_3385418132"/>
+      <w:bookmarkStart w:id="6" w:name="__RefHeading___Toc5088_1482924693"/>
       <w:bookmarkEnd w:id="6"/>
       <w:r>
         <w:rPr/>
@@ -4983,7 +4983,7 @@
       </w:pPr>
       <w:r>
         <w:rPr/>
-        <w:t>Die folgenden Abschnitte zeigen die typischen Einsatzszenarien — analog zu den Use Cases des alten µCSS-Handbuchs, aber in der neuen Syntax.</w:t>
+        <w:t>Die folgenden Abschnitte zeigen die typischen Einsatzszenarien — analog zu den Use Cases des alten µCSS™-Handbuchs, aber in der neuen Syntax.</w:t>
       </w:r>
     </w:p>
     <w:p>
@@ -4997,7 +4997,7 @@
         <w:outlineLvl w:val="1"/>
         <w:rPr/>
       </w:pPr>
-      <w:bookmarkStart w:id="7" w:name="__RefHeading___Toc5090_3385418132"/>
+      <w:bookmarkStart w:id="7" w:name="__RefHeading___Toc5090_1482924693"/>
       <w:bookmarkEnd w:id="7"/>
       <w:r>
         <w:rPr/>
@@ -5627,7 +5627,7 @@
       </w:pPr>
       <w:r>
         <w:rPr/>
-        <w:t xml:space="preserve">Anders als beim alten µCSS sind keine Platzhalter-Properties und keine </w:t>
+        <w:t xml:space="preserve">Anders als beim alten µCSS™ sind keine Platzhalter-Properties und keine </w:t>
       </w:r>
       <w:r>
         <w:rPr>
@@ -5654,7 +5654,7 @@
         <w:outlineLvl w:val="1"/>
         <w:rPr/>
       </w:pPr>
-      <w:bookmarkStart w:id="8" w:name="__RefHeading___Toc5092_3385418132"/>
+      <w:bookmarkStart w:id="8" w:name="__RefHeading___Toc5092_1482924693"/>
       <w:bookmarkEnd w:id="8"/>
       <w:r>
         <w:rPr/>
@@ -6032,7 +6032,7 @@
         <w:outlineLvl w:val="1"/>
         <w:rPr/>
       </w:pPr>
-      <w:bookmarkStart w:id="9" w:name="__RefHeading___Toc5094_3385418132"/>
+      <w:bookmarkStart w:id="9" w:name="__RefHeading___Toc5094_1482924693"/>
       <w:bookmarkEnd w:id="9"/>
       <w:r>
         <w:rPr/>
@@ -6350,7 +6350,7 @@
         <w:outlineLvl w:val="1"/>
         <w:rPr/>
       </w:pPr>
-      <w:bookmarkStart w:id="10" w:name="__RefHeading___Toc5096_3385418132"/>
+      <w:bookmarkStart w:id="10" w:name="__RefHeading___Toc5096_1482924693"/>
       <w:bookmarkEnd w:id="10"/>
       <w:r>
         <w:rPr/>
@@ -6366,7 +6366,7 @@
       </w:pPr>
       <w:r>
         <w:rPr/>
-        <w:t xml:space="preserve">Eines der Highlights von µCSS (in Version 1 wie in Version 2) ist die automatische Erzeugung von Sprite-Atlanten. Die Direktive </w:t>
+        <w:t xml:space="preserve">Eines der Highlights von µCSS™ (in Version 1 wie in Version 2) ist die automatische Erzeugung von Sprite-Atlanten. Die Direktive </w:t>
       </w:r>
       <w:r>
         <w:rPr>
@@ -6930,7 +6930,7 @@
       </w:r>
       <w:r>
         <w:rPr/>
-        <w:t xml:space="preserve"> werden automatisch gesetzt; vorhandene Deklarationen dieser Properties in der Regel werden ersetzt. Anders als beim alten µCSS entfallen die Vendor-Prefix-Varianten (</w:t>
+        <w:t xml:space="preserve"> werden automatisch gesetzt; vorhandene Deklarationen dieser Properties in der Regel werden ersetzt. Anders als beim alten µCSS™ entfallen die Vendor-Prefix-Varianten (</w:t>
       </w:r>
       <w:r>
         <w:rPr>
@@ -6982,7 +6982,7 @@
         <w:outlineLvl w:val="1"/>
         <w:rPr/>
       </w:pPr>
-      <w:bookmarkStart w:id="11" w:name="__RefHeading___Toc5098_3385418132"/>
+      <w:bookmarkStart w:id="11" w:name="__RefHeading___Toc5098_1482924693"/>
       <w:bookmarkEnd w:id="11"/>
       <w:r>
         <w:rPr/>
@@ -6998,7 +6998,7 @@
       </w:pPr>
       <w:r>
         <w:rPr/>
-        <w:t xml:space="preserve">Wichtige Bilder (z. B. Hover-Zustände und Cursor) können beim Laden der Seite vorab geladen werden. µCSS sammelt die Bild-URLs und erzeugt eine Preload-Regel, wenn die Manifest-Option </w:t>
+        <w:t xml:space="preserve">Wichtige Bilder (z. B. Hover-Zustände und Cursor) können beim Laden der Seite vorab geladen werden. µCSS™ sammelt die Bild-URLs und erzeugt eine Preload-Regel, wenn die Manifest-Option </w:t>
       </w:r>
       <w:r>
         <w:rPr>
@@ -7158,7 +7158,7 @@
         <w:outlineLvl w:val="1"/>
         <w:rPr/>
       </w:pPr>
-      <w:bookmarkStart w:id="12" w:name="__RefHeading___Toc5100_3385418132"/>
+      <w:bookmarkStart w:id="12" w:name="__RefHeading___Toc5100_1482924693"/>
       <w:bookmarkEnd w:id="12"/>
       <w:r>
         <w:rPr/>
@@ -7523,7 +7523,7 @@
         <w:outlineLvl w:val="1"/>
         <w:rPr/>
       </w:pPr>
-      <w:bookmarkStart w:id="13" w:name="__RefHeading___Toc5102_3385418132"/>
+      <w:bookmarkStart w:id="13" w:name="__RefHeading___Toc5102_1482924693"/>
       <w:bookmarkEnd w:id="13"/>
       <w:r>
         <w:rPr/>
@@ -7539,7 +7539,7 @@
       </w:pPr>
       <w:r>
         <w:rPr/>
-        <w:t xml:space="preserve">Was früher die µCSS-Plugins (ButtonCreator, AppIconMaker, FileCopy) erledigt haben, übernehmen jetzt die </w:t>
+        <w:t xml:space="preserve">Was früher die µCSS™-Plugins (ButtonCreator, AppIconMaker, FileCopy) erledigt haben, übernehmen jetzt die </w:t>
       </w:r>
       <w:r>
         <w:rPr>
@@ -7742,7 +7742,7 @@
         <w:outlineLvl w:val="2"/>
         <w:rPr/>
       </w:pPr>
-      <w:bookmarkStart w:id="14" w:name="__RefHeading___Toc5104_3385418132"/>
+      <w:bookmarkStart w:id="14" w:name="__RefHeading___Toc5104_1482924693"/>
       <w:bookmarkEnd w:id="14"/>
       <w:r>
         <w:rPr/>
@@ -7758,7 +7758,7 @@
       </w:pPr>
       <w:r>
         <w:rPr/>
-        <w:t xml:space="preserve">Eingebaute Steps ersetzen die Legacy-µCSS-Plugins. Für projektspezifische Generatoren (analog ButtonAndIconCreator) Handler </w:t>
+        <w:t xml:space="preserve">Eingebaute Steps ersetzen die Legacy-µCSS™-Plugins. Für projektspezifische Generatoren (analog ButtonAndIconCreator) Handler </w:t>
       </w:r>
       <w:r>
         <w:rPr>
@@ -8587,7 +8587,7 @@
         <w:outlineLvl w:val="0"/>
         <w:rPr/>
       </w:pPr>
-      <w:bookmarkStart w:id="15" w:name="__RefHeading___Toc5106_3385418132"/>
+      <w:bookmarkStart w:id="15" w:name="__RefHeading___Toc5106_1482924693"/>
       <w:bookmarkEnd w:id="15"/>
       <w:r>
         <w:rPr/>
@@ -8649,7 +8649,7 @@
       </w:r>
       <w:r>
         <w:rPr/>
-        <w:t xml:space="preserve">. µCSS bindet µPS über </w:t>
+        <w:t xml:space="preserve">. µCSS™ bindet µPS über </w:t>
       </w:r>
       <w:r>
         <w:rPr>
@@ -8782,7 +8782,7 @@
         <w:outlineLvl w:val="1"/>
         <w:rPr/>
       </w:pPr>
-      <w:bookmarkStart w:id="16" w:name="__RefHeading___Toc5108_3385418132"/>
+      <w:bookmarkStart w:id="16" w:name="__RefHeading___Toc5108_1482924693"/>
       <w:bookmarkEnd w:id="16"/>
       <w:r>
         <w:rPr/>
@@ -10094,7 +10094,7 @@
         <w:outlineLvl w:val="1"/>
         <w:rPr/>
       </w:pPr>
-      <w:bookmarkStart w:id="17" w:name="__RefHeading___Toc5110_3385418132"/>
+      <w:bookmarkStart w:id="17" w:name="__RefHeading___Toc5110_1482924693"/>
       <w:bookmarkEnd w:id="17"/>
       <w:r>
         <w:rPr/>
@@ -11251,7 +11251,7 @@
         <w:outlineLvl w:val="2"/>
         <w:rPr/>
       </w:pPr>
-      <w:bookmarkStart w:id="18" w:name="__RefHeading___Toc5112_3385418132"/>
+      <w:bookmarkStart w:id="18" w:name="__RefHeading___Toc5112_1482924693"/>
       <w:bookmarkEnd w:id="18"/>
       <w:r>
         <w:rPr/>
@@ -11490,7 +11490,7 @@
         <w:outlineLvl w:val="1"/>
         <w:rPr/>
       </w:pPr>
-      <w:bookmarkStart w:id="19" w:name="__RefHeading___Toc5114_3385418132"/>
+      <w:bookmarkStart w:id="19" w:name="__RefHeading___Toc5114_1482924693"/>
       <w:bookmarkEnd w:id="19"/>
       <w:r>
         <w:rPr/>
@@ -12116,7 +12116,7 @@
         <w:outlineLvl w:val="1"/>
         <w:rPr/>
       </w:pPr>
-      <w:bookmarkStart w:id="20" w:name="__RefHeading___Toc5116_3385418132"/>
+      <w:bookmarkStart w:id="20" w:name="__RefHeading___Toc5116_1482924693"/>
       <w:bookmarkEnd w:id="20"/>
       <w:r>
         <w:rPr/>
@@ -12181,7 +12181,7 @@
         <w:outlineLvl w:val="1"/>
         <w:rPr/>
       </w:pPr>
-      <w:bookmarkStart w:id="21" w:name="__RefHeading___Toc5118_3385418132"/>
+      <w:bookmarkStart w:id="21" w:name="__RefHeading___Toc5118_1482924693"/>
       <w:bookmarkEnd w:id="21"/>
       <w:r>
         <w:rPr/>
@@ -12590,7 +12590,7 @@
         <w:outlineLvl w:val="2"/>
         <w:rPr/>
       </w:pPr>
-      <w:bookmarkStart w:id="22" w:name="__RefHeading___Toc5120_3385418132"/>
+      <w:bookmarkStart w:id="22" w:name="__RefHeading___Toc5120_1482924693"/>
       <w:bookmarkEnd w:id="22"/>
       <w:r>
         <w:rPr/>
@@ -12888,7 +12888,7 @@
         <w:outlineLvl w:val="2"/>
         <w:rPr/>
       </w:pPr>
-      <w:bookmarkStart w:id="23" w:name="__RefHeading___Toc5122_3385418132"/>
+      <w:bookmarkStart w:id="23" w:name="__RefHeading___Toc5122_1482924693"/>
       <w:bookmarkEnd w:id="23"/>
       <w:r>
         <w:rPr/>
@@ -13052,7 +13052,7 @@
         <w:outlineLvl w:val="1"/>
         <w:rPr/>
       </w:pPr>
-      <w:bookmarkStart w:id="24" w:name="__RefHeading___Toc5124_3385418132"/>
+      <w:bookmarkStart w:id="24" w:name="__RefHeading___Toc5124_1482924693"/>
       <w:bookmarkEnd w:id="24"/>
       <w:r>
         <w:rPr/>
@@ -13986,7 +13986,7 @@
         <w:outlineLvl w:val="1"/>
         <w:rPr/>
       </w:pPr>
-      <w:bookmarkStart w:id="25" w:name="__RefHeading___Toc5126_3385418132"/>
+      <w:bookmarkStart w:id="25" w:name="__RefHeading___Toc5126_1482924693"/>
       <w:bookmarkEnd w:id="25"/>
       <w:r>
         <w:rPr/>
@@ -14038,7 +14038,7 @@
         <w:outlineLvl w:val="2"/>
         <w:rPr/>
       </w:pPr>
-      <w:bookmarkStart w:id="26" w:name="__RefHeading___Toc5128_3385418132"/>
+      <w:bookmarkStart w:id="26" w:name="__RefHeading___Toc5128_1482924693"/>
       <w:bookmarkEnd w:id="26"/>
       <w:r>
         <w:rPr/>
@@ -14361,7 +14361,7 @@
         <w:outlineLvl w:val="2"/>
         <w:rPr/>
       </w:pPr>
-      <w:bookmarkStart w:id="27" w:name="__RefHeading___Toc5130_3385418132"/>
+      <w:bookmarkStart w:id="27" w:name="__RefHeading___Toc5130_1482924693"/>
       <w:bookmarkEnd w:id="27"/>
       <w:r>
         <w:rPr/>
@@ -15002,7 +15002,7 @@
         <w:outlineLvl w:val="2"/>
         <w:rPr/>
       </w:pPr>
-      <w:bookmarkStart w:id="28" w:name="__RefHeading___Toc5132_3385418132"/>
+      <w:bookmarkStart w:id="28" w:name="__RefHeading___Toc5132_1482924693"/>
       <w:bookmarkEnd w:id="28"/>
       <w:r>
         <w:rPr/>
@@ -15476,7 +15476,7 @@
         <w:outlineLvl w:val="2"/>
         <w:rPr/>
       </w:pPr>
-      <w:bookmarkStart w:id="29" w:name="__RefHeading___Toc5134_3385418132"/>
+      <w:bookmarkStart w:id="29" w:name="__RefHeading___Toc5134_1482924693"/>
       <w:bookmarkEnd w:id="29"/>
       <w:r>
         <w:rPr/>
@@ -15851,7 +15851,7 @@
         <w:outlineLvl w:val="2"/>
         <w:rPr/>
       </w:pPr>
-      <w:bookmarkStart w:id="30" w:name="__RefHeading___Toc5136_3385418132"/>
+      <w:bookmarkStart w:id="30" w:name="__RefHeading___Toc5136_1482924693"/>
       <w:bookmarkEnd w:id="30"/>
       <w:r>
         <w:rPr/>
@@ -16242,7 +16242,7 @@
         <w:outlineLvl w:val="2"/>
         <w:rPr/>
       </w:pPr>
-      <w:bookmarkStart w:id="31" w:name="__RefHeading___Toc5138_3385418132"/>
+      <w:bookmarkStart w:id="31" w:name="__RefHeading___Toc5138_1482924693"/>
       <w:bookmarkEnd w:id="31"/>
       <w:r>
         <w:rPr/>
@@ -16639,7 +16639,7 @@
         <w:outlineLvl w:val="1"/>
         <w:rPr/>
       </w:pPr>
-      <w:bookmarkStart w:id="32" w:name="__RefHeading___Toc5140_3385418132"/>
+      <w:bookmarkStart w:id="32" w:name="__RefHeading___Toc5140_1482924693"/>
       <w:bookmarkEnd w:id="32"/>
       <w:r>
         <w:rPr/>
@@ -17695,7 +17695,7 @@
         <w:outlineLvl w:val="1"/>
         <w:rPr/>
       </w:pPr>
-      <w:bookmarkStart w:id="33" w:name="__RefHeading___Toc5142_3385418132"/>
+      <w:bookmarkStart w:id="33" w:name="__RefHeading___Toc5142_1482924693"/>
       <w:bookmarkEnd w:id="33"/>
       <w:r>
         <w:rPr/>
@@ -18898,7 +18898,7 @@
         <w:outlineLvl w:val="1"/>
         <w:rPr/>
       </w:pPr>
-      <w:bookmarkStart w:id="34" w:name="__RefHeading___Toc5144_3385418132"/>
+      <w:bookmarkStart w:id="34" w:name="__RefHeading___Toc5144_1482924693"/>
       <w:bookmarkEnd w:id="34"/>
       <w:r>
         <w:rPr/>
@@ -19027,7 +19027,7 @@
         <w:outlineLvl w:val="2"/>
         <w:rPr/>
       </w:pPr>
-      <w:bookmarkStart w:id="35" w:name="__RefHeading___Toc5146_3385418132"/>
+      <w:bookmarkStart w:id="35" w:name="__RefHeading___Toc5146_1482924693"/>
       <w:bookmarkEnd w:id="35"/>
       <w:r>
         <w:rPr/>
@@ -21652,7 +21652,7 @@
         <w:outlineLvl w:val="2"/>
         <w:rPr/>
       </w:pPr>
-      <w:bookmarkStart w:id="36" w:name="__RefHeading___Toc5148_3385418132"/>
+      <w:bookmarkStart w:id="36" w:name="__RefHeading___Toc5148_1482924693"/>
       <w:bookmarkEnd w:id="36"/>
       <w:r>
         <w:rPr/>
@@ -22124,7 +22124,7 @@
         <w:outlineLvl w:val="2"/>
         <w:rPr/>
       </w:pPr>
-      <w:bookmarkStart w:id="37" w:name="__RefHeading___Toc5150_3385418132"/>
+      <w:bookmarkStart w:id="37" w:name="__RefHeading___Toc5150_1482924693"/>
       <w:bookmarkEnd w:id="37"/>
       <w:r>
         <w:rPr/>
@@ -22557,7 +22557,7 @@
         <w:outlineLvl w:val="2"/>
         <w:rPr/>
       </w:pPr>
-      <w:bookmarkStart w:id="38" w:name="__RefHeading___Toc5152_3385418132"/>
+      <w:bookmarkStart w:id="38" w:name="__RefHeading___Toc5152_1482924693"/>
       <w:bookmarkEnd w:id="38"/>
       <w:r>
         <w:rPr/>
@@ -23531,7 +23531,7 @@
         <w:outlineLvl w:val="2"/>
         <w:rPr/>
       </w:pPr>
-      <w:bookmarkStart w:id="39" w:name="__RefHeading___Toc5154_3385418132"/>
+      <w:bookmarkStart w:id="39" w:name="__RefHeading___Toc5154_1482924693"/>
       <w:bookmarkEnd w:id="39"/>
       <w:r>
         <w:rPr/>
@@ -23634,7 +23634,7 @@
         <w:outlineLvl w:val="1"/>
         <w:rPr/>
       </w:pPr>
-      <w:bookmarkStart w:id="40" w:name="__RefHeading___Toc5156_3385418132"/>
+      <w:bookmarkStart w:id="40" w:name="__RefHeading___Toc5156_1482924693"/>
       <w:bookmarkEnd w:id="40"/>
       <w:r>
         <w:rPr/>
@@ -23751,7 +23751,7 @@
       </w:r>
       <w:r>
         <w:rPr/>
-        <w:t>µPS rendert headless; µCSS-Build läuft bei Bedarf mit.</w:t>
+        <w:t>µPS rendert headless; µCSS™-Build läuft bei Bedarf mit.</w:t>
       </w:r>
     </w:p>
     <w:p>
@@ -23936,7 +23936,7 @@
         <w:outlineLvl w:val="2"/>
         <w:rPr/>
       </w:pPr>
-      <w:bookmarkStart w:id="41" w:name="__RefHeading___Toc5158_3385418132"/>
+      <w:bookmarkStart w:id="41" w:name="__RefHeading___Toc5158_1482924693"/>
       <w:bookmarkEnd w:id="41"/>
       <w:r>
         <w:rPr/>
@@ -24168,7 +24168,7 @@
       </w:r>
       <w:r>
         <w:rPr/>
-        <w:t xml:space="preserve">: Generiert wird nur, wenn das Ergebnis fehlt oder sich Konfiguration bzw. Quellen (mtime/Größe) geändert haben. Alternativ kann der raw-→-final-Schritt natürlich weiterhin als eigener Gulp-Task vor dem µCSS-Build laufen — </w:t>
+        <w:t xml:space="preserve">: Generiert wird nur, wenn das Ergebnis fehlt oder sich Konfiguration bzw. Quellen (mtime/Größe) geändert haben. Alternativ kann der raw-→-final-Schritt natürlich weiterhin als eigener Gulp-Task vor dem µCSS™-Build laufen — </w:t>
       </w:r>
       <w:r>
         <w:rPr>
@@ -24198,7 +24198,7 @@
         <w:outlineLvl w:val="0"/>
         <w:rPr/>
       </w:pPr>
-      <w:bookmarkStart w:id="42" w:name="__RefHeading___Toc5160_3385418132"/>
+      <w:bookmarkStart w:id="42" w:name="__RefHeading___Toc5160_1482924693"/>
       <w:bookmarkEnd w:id="42"/>
       <w:r>
         <w:rPr/>
@@ -24292,7 +24292,7 @@
       </w:r>
       <w:r>
         <w:rPr/>
-        <w:t>. Referenzieren von Sounds *aus der CSS* (µCSS-Sound-Direktive) und Browser-Runtime/Sprachausgabe folgen später.</w:t>
+        <w:t>. Referenzieren von Sounds *aus der CSS* (µCSS™-Sound-Direktive) und Browser-Runtime/Sprachausgabe folgen später.</w:t>
       </w:r>
     </w:p>
     <w:p>
@@ -24344,7 +24344,7 @@
         <w:outlineLvl w:val="1"/>
         <w:rPr/>
       </w:pPr>
-      <w:bookmarkStart w:id="43" w:name="__RefHeading___Toc5162_3385418132"/>
+      <w:bookmarkStart w:id="43" w:name="__RefHeading___Toc5162_1482924693"/>
       <w:bookmarkEnd w:id="43"/>
       <w:r>
         <w:rPr/>
@@ -24629,7 +24629,7 @@
         <w:outlineLvl w:val="1"/>
         <w:rPr/>
       </w:pPr>
-      <w:bookmarkStart w:id="44" w:name="__RefHeading___Toc5164_3385418132"/>
+      <w:bookmarkStart w:id="44" w:name="__RefHeading___Toc5164_1482924693"/>
       <w:bookmarkEnd w:id="44"/>
       <w:r>
         <w:rPr/>
@@ -25662,7 +25662,7 @@
         <w:outlineLvl w:val="2"/>
         <w:rPr/>
       </w:pPr>
-      <w:bookmarkStart w:id="45" w:name="__RefHeading___Toc5166_3385418132"/>
+      <w:bookmarkStart w:id="45" w:name="__RefHeading___Toc5166_1482924693"/>
       <w:bookmarkEnd w:id="45"/>
       <w:r>
         <w:rPr/>
@@ -25727,7 +25727,7 @@
         <w:outlineLvl w:val="2"/>
         <w:rPr/>
       </w:pPr>
-      <w:bookmarkStart w:id="46" w:name="__RefHeading___Toc5168_3385418132"/>
+      <w:bookmarkStart w:id="46" w:name="__RefHeading___Toc5168_1482924693"/>
       <w:bookmarkEnd w:id="46"/>
       <w:r>
         <w:rPr/>
@@ -25821,7 +25821,7 @@
         <w:outlineLvl w:val="2"/>
         <w:rPr/>
       </w:pPr>
-      <w:bookmarkStart w:id="47" w:name="__RefHeading___Toc5170_3385418132"/>
+      <w:bookmarkStart w:id="47" w:name="__RefHeading___Toc5170_1482924693"/>
       <w:bookmarkEnd w:id="47"/>
       <w:r>
         <w:rPr/>
@@ -25888,11 +25888,11 @@
         <w:outlineLvl w:val="1"/>
         <w:rPr/>
       </w:pPr>
-      <w:bookmarkStart w:id="48" w:name="__RefHeading___Toc5172_3385418132"/>
+      <w:bookmarkStart w:id="48" w:name="__RefHeading___Toc5172_1482924693"/>
       <w:bookmarkEnd w:id="48"/>
       <w:r>
         <w:rPr/>
-        <w:t>5.3 Anbindung an µCSS (Manifest `sounds`)</w:t>
+        <w:t>5.3 Anbindung an µCSS™ (Manifest `sounds`)</w:t>
       </w:r>
     </w:p>
     <w:p>
@@ -25904,7 +25904,7 @@
       </w:pPr>
       <w:r>
         <w:rPr/>
-        <w:t xml:space="preserve">µCSS ruft µAU über einen optionalen </w:t>
+        <w:t xml:space="preserve">µCSS™ ruft µAU über einen optionalen </w:t>
       </w:r>
       <w:r>
         <w:rPr>
@@ -26224,7 +26224,7 @@
         <w:outlineLvl w:val="2"/>
         <w:rPr/>
       </w:pPr>
-      <w:bookmarkStart w:id="49" w:name="__RefHeading___Toc5174_3385418132"/>
+      <w:bookmarkStart w:id="49" w:name="__RefHeading___Toc5174_1482924693"/>
       <w:bookmarkEnd w:id="49"/>
       <w:r>
         <w:rPr/>
@@ -26917,7 +26917,7 @@
         <w:outlineLvl w:val="0"/>
         <w:rPr/>
       </w:pPr>
-      <w:bookmarkStart w:id="50" w:name="__RefHeading___Toc5176_3385418132"/>
+      <w:bookmarkStart w:id="50" w:name="__RefHeading___Toc5176_1482924693"/>
       <w:bookmarkEnd w:id="50"/>
       <w:r>
         <w:rPr/>
@@ -27053,7 +27053,7 @@
         <w:outlineLvl w:val="1"/>
         <w:rPr/>
       </w:pPr>
-      <w:bookmarkStart w:id="51" w:name="__RefHeading___Toc5178_3385418132"/>
+      <w:bookmarkStart w:id="51" w:name="__RefHeading___Toc5178_1482924693"/>
       <w:bookmarkEnd w:id="51"/>
       <w:r>
         <w:rPr/>
@@ -27207,7 +27207,7 @@
         <w:outlineLvl w:val="1"/>
         <w:rPr/>
       </w:pPr>
-      <w:bookmarkStart w:id="52" w:name="__RefHeading___Toc5180_3385418132"/>
+      <w:bookmarkStart w:id="52" w:name="__RefHeading___Toc5180_1482924693"/>
       <w:bookmarkEnd w:id="52"/>
       <w:r>
         <w:rPr/>
@@ -28657,7 +28657,7 @@
         <w:outlineLvl w:val="1"/>
         <w:rPr/>
       </w:pPr>
-      <w:bookmarkStart w:id="53" w:name="__RefHeading___Toc5182_3385418132"/>
+      <w:bookmarkStart w:id="53" w:name="__RefHeading___Toc5182_1482924693"/>
       <w:bookmarkEnd w:id="53"/>
       <w:r>
         <w:rPr/>
@@ -29020,11 +29020,11 @@
         <w:outlineLvl w:val="1"/>
         <w:rPr/>
       </w:pPr>
-      <w:bookmarkStart w:id="54" w:name="__RefHeading___Toc5184_3385418132"/>
+      <w:bookmarkStart w:id="54" w:name="__RefHeading___Toc5184_1482924693"/>
       <w:bookmarkEnd w:id="54"/>
       <w:r>
         <w:rPr/>
-        <w:t>6.4 Anbindung an µCSS</w:t>
+        <w:t>6.4 Anbindung an µCSS™</w:t>
       </w:r>
     </w:p>
     <w:p>
@@ -29316,7 +29316,7 @@
         <w:outlineLvl w:val="0"/>
         <w:rPr/>
       </w:pPr>
-      <w:bookmarkStart w:id="55" w:name="__RefHeading___Toc5186_3385418132"/>
+      <w:bookmarkStart w:id="55" w:name="__RefHeading___Toc5186_1482924693"/>
       <w:bookmarkEnd w:id="55"/>
       <w:r>
         <w:rPr/>
@@ -29383,7 +29383,7 @@
       </w:pPr>
       <w:r>
         <w:rPr/>
-        <w:t xml:space="preserve">µCSS verfolgt einen anderen Ansatz: </w:t>
+        <w:t xml:space="preserve">µCSS™ verfolgt einen anderen Ansatz: </w:t>
       </w:r>
       <w:r>
         <w:rPr>
@@ -29431,7 +29431,7 @@
       </w:r>
       <w:r>
         <w:rPr/>
-        <w:t xml:space="preserve"> (griechisches Pi — Vite und Vue ignorieren sie). Ein Haupt-Stylesheet sammelt alles zur Build-Zeit ein; µCSS bündelt daraus eine einzige, statische CSS-Datei.</w:t>
+        <w:t xml:space="preserve"> (griechisches Pi — Vite und Vue ignorieren sie). Ein Haupt-Stylesheet sammelt alles zur Build-Zeit ein; µCSS™ bündelt daraus eine einzige, statische CSS-Datei.</w:t>
       </w:r>
     </w:p>
     <w:p>
@@ -29445,7 +29445,7 @@
         <w:outlineLvl w:val="1"/>
         <w:rPr/>
       </w:pPr>
-      <w:bookmarkStart w:id="56" w:name="__RefHeading___Toc5188_3385418132"/>
+      <w:bookmarkStart w:id="56" w:name="__RefHeading___Toc5188_1482924693"/>
       <w:bookmarkEnd w:id="56"/>
       <w:r>
         <w:rPr/>
@@ -29740,7 +29740,7 @@
         <w:outlineLvl w:val="1"/>
         <w:rPr/>
       </w:pPr>
-      <w:bookmarkStart w:id="57" w:name="__RefHeading___Toc5190_3385418132"/>
+      <w:bookmarkStart w:id="57" w:name="__RefHeading___Toc5190_1482924693"/>
       <w:bookmarkEnd w:id="57"/>
       <w:r>
         <w:rPr/>
@@ -29895,7 +29895,7 @@
         <w:outlineLvl w:val="1"/>
         <w:rPr/>
       </w:pPr>
-      <w:bookmarkStart w:id="58" w:name="__RefHeading___Toc5192_3385418132"/>
+      <w:bookmarkStart w:id="58" w:name="__RefHeading___Toc5192_1482924693"/>
       <w:bookmarkEnd w:id="58"/>
       <w:r>
         <w:rPr/>
@@ -30141,11 +30141,11 @@
         <w:outlineLvl w:val="0"/>
         <w:rPr/>
       </w:pPr>
-      <w:bookmarkStart w:id="59" w:name="__RefHeading___Toc5194_3385418132"/>
+      <w:bookmarkStart w:id="59" w:name="__RefHeading___Toc5194_1482924693"/>
       <w:bookmarkEnd w:id="59"/>
       <w:r>
         <w:rPr/>
-        <w:t>8 Grundideen von µCSS</w:t>
+        <w:t>8 Grundideen von µCSS™</w:t>
       </w:r>
     </w:p>
     <w:p>
@@ -30159,7 +30159,7 @@
         <w:outlineLvl w:val="1"/>
         <w:rPr/>
       </w:pPr>
-      <w:bookmarkStart w:id="60" w:name="__RefHeading___Toc5196_3385418132"/>
+      <w:bookmarkStart w:id="60" w:name="__RefHeading___Toc5196_1482924693"/>
       <w:bookmarkEnd w:id="60"/>
       <w:r>
         <w:rPr/>
@@ -30328,7 +30328,7 @@
       </w:pPr>
       <w:r>
         <w:rPr/>
-        <w:t xml:space="preserve">Anders als beim alten µCSS gibt es </w:t>
+        <w:t xml:space="preserve">Anders als beim alten µCSS™ gibt es </w:t>
       </w:r>
       <w:r>
         <w:rPr>
@@ -30366,7 +30366,7 @@
         <w:outlineLvl w:val="1"/>
         <w:rPr/>
       </w:pPr>
-      <w:bookmarkStart w:id="61" w:name="__RefHeading___Toc5198_3385418132"/>
+      <w:bookmarkStart w:id="61" w:name="__RefHeading___Toc5198_1482924693"/>
       <w:bookmarkEnd w:id="61"/>
       <w:r>
         <w:rPr/>
@@ -30573,7 +30573,7 @@
       </w:r>
       <w:r>
         <w:rPr/>
-        <w:t>-Familie des alten µCSS (</w:t>
+        <w:t>-Familie des alten µCSS™ (</w:t>
       </w:r>
       <w:r>
         <w:rPr>
@@ -30652,7 +30652,7 @@
         <w:outlineLvl w:val="1"/>
         <w:rPr/>
       </w:pPr>
-      <w:bookmarkStart w:id="62" w:name="__RefHeading___Toc5200_3385418132"/>
+      <w:bookmarkStart w:id="62" w:name="__RefHeading___Toc5200_1482924693"/>
       <w:bookmarkEnd w:id="62"/>
       <w:r>
         <w:rPr/>
@@ -30911,7 +30911,7 @@
       </w:r>
       <w:r>
         <w:rPr/>
-        <w:t>-Präfix des alten µCSS entfällt — der Kontext ist implizit. Direktiven werden in Dokumentreihenfolge ausgewertet.</w:t>
+        <w:t>-Präfix des alten µCSS™ entfällt — der Kontext ist implizit. Direktiven werden in Dokumentreihenfolge ausgewertet.</w:t>
       </w:r>
     </w:p>
     <w:p>
@@ -30925,7 +30925,7 @@
         <w:outlineLvl w:val="1"/>
         <w:rPr/>
       </w:pPr>
-      <w:bookmarkStart w:id="63" w:name="__RefHeading___Toc5202_3385418132"/>
+      <w:bookmarkStart w:id="63" w:name="__RefHeading___Toc5202_1482924693"/>
       <w:bookmarkEnd w:id="63"/>
       <w:r>
         <w:rPr/>
@@ -30980,7 +30980,7 @@
       </w:r>
       <w:r>
         <w:rPr/>
-        <w:t>) kennzeichnet die Datei eindeutig als µCSS-Skin-Manifest, damit sie nicht mit einem gewöhnlichen Modul oder Gulpfile verwechselt wird; der Skin-Name ergibt sich aus dem Teil davor (</w:t>
+        <w:t>) kennzeichnet die Datei eindeutig als µCSS™-Skin-Manifest, damit sie nicht mit einem gewöhnlichen Modul oder Gulpfile verwechselt wird; der Skin-Name ergibt sich aus dem Teil davor (</w:t>
       </w:r>
       <w:r>
         <w:rPr>
@@ -31597,7 +31597,7 @@
         <w:outlineLvl w:val="1"/>
         <w:rPr/>
       </w:pPr>
-      <w:bookmarkStart w:id="64" w:name="__RefHeading___Toc5204_3385418132"/>
+      <w:bookmarkStart w:id="64" w:name="__RefHeading___Toc5204_1482924693"/>
       <w:bookmarkEnd w:id="64"/>
       <w:r>
         <w:rPr/>
@@ -31613,7 +31613,7 @@
       </w:pPr>
       <w:r>
         <w:rPr/>
-        <w:t xml:space="preserve">Bei µCSS 1 mussten die Zeichen </w:t>
+        <w:t xml:space="preserve">Bei µCSS™ 1 mussten die Zeichen </w:t>
       </w:r>
       <w:r>
         <w:rPr>
@@ -31808,7 +31808,7 @@
         <w:outlineLvl w:val="0"/>
         <w:rPr/>
       </w:pPr>
-      <w:bookmarkStart w:id="65" w:name="__RefHeading___Toc5206_3385418132"/>
+      <w:bookmarkStart w:id="65" w:name="__RefHeading___Toc5206_1482924693"/>
       <w:bookmarkEnd w:id="65"/>
       <w:r>
         <w:rPr/>
@@ -31824,7 +31824,7 @@
       </w:pPr>
       <w:r>
         <w:rPr/>
-        <w:t xml:space="preserve">Das alte µCSS wurde über ein modales Dialogfenster in Photoshop bedient. An dessen Stelle treten </w:t>
+        <w:t xml:space="preserve">Das alte µCSS™ wurde über ein modales Dialogfenster in Photoshop bedient. An dessen Stelle treten </w:t>
       </w:r>
       <w:r>
         <w:rPr>
@@ -31851,7 +31851,7 @@
         <w:outlineLvl w:val="1"/>
         <w:rPr/>
       </w:pPr>
-      <w:bookmarkStart w:id="66" w:name="__RefHeading___Toc5208_3385418132"/>
+      <w:bookmarkStart w:id="66" w:name="__RefHeading___Toc5208_1482924693"/>
       <w:bookmarkEnd w:id="66"/>
       <w:r>
         <w:rPr/>
@@ -32251,7 +32251,7 @@
         <w:outlineLvl w:val="1"/>
         <w:rPr/>
       </w:pPr>
-      <w:bookmarkStart w:id="67" w:name="__RefHeading___Toc5210_3385418132"/>
+      <w:bookmarkStart w:id="67" w:name="__RefHeading___Toc5210_1482924693"/>
       <w:bookmarkEnd w:id="67"/>
       <w:r>
         <w:rPr/>
@@ -32467,7 +32467,7 @@
         <w:outlineLvl w:val="1"/>
         <w:rPr/>
       </w:pPr>
-      <w:bookmarkStart w:id="68" w:name="__RefHeading___Toc5212_3385418132"/>
+      <w:bookmarkStart w:id="68" w:name="__RefHeading___Toc5212_1482924693"/>
       <w:bookmarkEnd w:id="68"/>
       <w:r>
         <w:rPr/>
@@ -32683,7 +32683,7 @@
       </w:r>
       <w:r>
         <w:rPr/>
-        <w:t xml:space="preserve"> und trägt die Versionsnummern von µCSS und das Cache-Schema; bei Abweichung wird er verworfen (Vollbuild). </w:t>
+        <w:t xml:space="preserve"> und trägt die Versionsnummern von µCSS™ und das Cache-Schema; bei Abweichung wird er verworfen (Vollbuild). </w:t>
       </w:r>
       <w:r>
         <w:rPr>
@@ -32723,7 +32723,7 @@
         <w:outlineLvl w:val="1"/>
         <w:rPr/>
       </w:pPr>
-      <w:bookmarkStart w:id="69" w:name="__RefHeading___Toc5214_3385418132"/>
+      <w:bookmarkStart w:id="69" w:name="__RefHeading___Toc5214_1482924693"/>
       <w:bookmarkEnd w:id="69"/>
       <w:r>
         <w:rPr/>
@@ -33173,7 +33173,7 @@
         <w:outlineLvl w:val="0"/>
         <w:rPr/>
       </w:pPr>
-      <w:bookmarkStart w:id="70" w:name="__RefHeading___Toc5216_3385418132"/>
+      <w:bookmarkStart w:id="70" w:name="__RefHeading___Toc5216_1482924693"/>
       <w:bookmarkEnd w:id="70"/>
       <w:r>
         <w:rPr/>
@@ -33212,7 +33212,7 @@
         <w:outlineLvl w:val="1"/>
         <w:rPr/>
       </w:pPr>
-      <w:bookmarkStart w:id="71" w:name="__RefHeading___Toc5218_3385418132"/>
+      <w:bookmarkStart w:id="71" w:name="__RefHeading___Toc5218_1482924693"/>
       <w:bookmarkEnd w:id="71"/>
       <w:r>
         <w:rPr/>
@@ -33310,7 +33310,7 @@
         <w:outlineLvl w:val="1"/>
         <w:rPr/>
       </w:pPr>
-      <w:bookmarkStart w:id="72" w:name="__RefHeading___Toc5220_3385418132"/>
+      <w:bookmarkStart w:id="72" w:name="__RefHeading___Toc5220_1482924693"/>
       <w:bookmarkEnd w:id="72"/>
       <w:r>
         <w:rPr/>
@@ -33483,7 +33483,7 @@
         <w:outlineLvl w:val="1"/>
         <w:rPr/>
       </w:pPr>
-      <w:bookmarkStart w:id="73" w:name="__RefHeading___Toc5222_3385418132"/>
+      <w:bookmarkStart w:id="73" w:name="__RefHeading___Toc5222_1482924693"/>
       <w:bookmarkEnd w:id="73"/>
       <w:r>
         <w:rPr/>
@@ -34100,7 +34100,7 @@
         <w:outlineLvl w:val="1"/>
         <w:rPr/>
       </w:pPr>
-      <w:bookmarkStart w:id="74" w:name="__RefHeading___Toc5224_3385418132"/>
+      <w:bookmarkStart w:id="74" w:name="__RefHeading___Toc5224_1482924693"/>
       <w:bookmarkEnd w:id="74"/>
       <w:r>
         <w:rPr/>
@@ -35124,7 +35124,7 @@
         <w:outlineLvl w:val="1"/>
         <w:rPr/>
       </w:pPr>
-      <w:bookmarkStart w:id="75" w:name="__RefHeading___Toc5226_3385418132"/>
+      <w:bookmarkStart w:id="75" w:name="__RefHeading___Toc5226_1482924693"/>
       <w:bookmarkEnd w:id="75"/>
       <w:r>
         <w:rPr/>
@@ -35497,7 +35497,7 @@
         <w:outlineLvl w:val="1"/>
         <w:rPr/>
       </w:pPr>
-      <w:bookmarkStart w:id="76" w:name="__RefHeading___Toc5228_3385418132"/>
+      <w:bookmarkStart w:id="76" w:name="__RefHeading___Toc5228_1482924693"/>
       <w:bookmarkEnd w:id="76"/>
       <w:r>
         <w:rPr/>
@@ -36696,7 +36696,7 @@
         <w:outlineLvl w:val="1"/>
         <w:rPr/>
       </w:pPr>
-      <w:bookmarkStart w:id="77" w:name="__RefHeading___Toc5230_3385418132"/>
+      <w:bookmarkStart w:id="77" w:name="__RefHeading___Toc5230_1482924693"/>
       <w:bookmarkEnd w:id="77"/>
       <w:r>
         <w:rPr/>
@@ -36931,7 +36931,7 @@
             </w:r>
             <w:r>
               <w:rPr/>
-              <w:t xml:space="preserve"> (Lieferumfang von µCSS).</w:t>
+              <w:t xml:space="preserve"> (Lieferumfang von µCSS™).</w:t>
             </w:r>
           </w:p>
         </w:tc>
@@ -37258,7 +37258,7 @@
         <w:outlineLvl w:val="1"/>
         <w:rPr/>
       </w:pPr>
-      <w:bookmarkStart w:id="78" w:name="__RefHeading___Toc5232_3385418132"/>
+      <w:bookmarkStart w:id="78" w:name="__RefHeading___Toc5232_1482924693"/>
       <w:bookmarkEnd w:id="78"/>
       <w:r>
         <w:rPr/>
@@ -38020,7 +38020,7 @@
         <w:outlineLvl w:val="1"/>
         <w:rPr/>
       </w:pPr>
-      <w:bookmarkStart w:id="79" w:name="__RefHeading___Toc5234_3385418132"/>
+      <w:bookmarkStart w:id="79" w:name="__RefHeading___Toc5234_1482924693"/>
       <w:bookmarkEnd w:id="79"/>
       <w:r>
         <w:rPr/>
@@ -39497,7 +39497,7 @@
         <w:outlineLvl w:val="1"/>
         <w:rPr/>
       </w:pPr>
-      <w:bookmarkStart w:id="80" w:name="__RefHeading___Toc5236_3385418132"/>
+      <w:bookmarkStart w:id="80" w:name="__RefHeading___Toc5236_1482924693"/>
       <w:bookmarkEnd w:id="80"/>
       <w:r>
         <w:rPr/>
@@ -39661,7 +39661,7 @@
         <w:outlineLvl w:val="0"/>
         <w:rPr/>
       </w:pPr>
-      <w:bookmarkStart w:id="81" w:name="__RefHeading___Toc5238_3385418132"/>
+      <w:bookmarkStart w:id="81" w:name="__RefHeading___Toc5238_1482924693"/>
       <w:bookmarkEnd w:id="81"/>
       <w:r>
         <w:rPr/>
@@ -39730,7 +39730,7 @@
         <w:outlineLvl w:val="1"/>
         <w:rPr/>
       </w:pPr>
-      <w:bookmarkStart w:id="82" w:name="__RefHeading___Toc5240_3385418132"/>
+      <w:bookmarkStart w:id="82" w:name="__RefHeading___Toc5240_1482924693"/>
       <w:bookmarkEnd w:id="82"/>
       <w:r>
         <w:rPr/>
@@ -39811,7 +39811,7 @@
         <w:outlineLvl w:val="1"/>
         <w:rPr/>
       </w:pPr>
-      <w:bookmarkStart w:id="83" w:name="__RefHeading___Toc5242_3385418132"/>
+      <w:bookmarkStart w:id="83" w:name="__RefHeading___Toc5242_1482924693"/>
       <w:bookmarkEnd w:id="83"/>
       <w:r>
         <w:rPr/>
@@ -39991,7 +39991,7 @@
             </w:r>
             <w:r>
               <w:rPr/>
-              <w:t xml:space="preserve"> ist bitgenau zum alten µCSS; </w:t>
+              <w:t xml:space="preserve"> ist bitgenau zum alten µCSS™; </w:t>
             </w:r>
             <w:r>
               <w:rPr>
@@ -40421,7 +40421,7 @@
         <w:outlineLvl w:val="1"/>
         <w:rPr/>
       </w:pPr>
-      <w:bookmarkStart w:id="84" w:name="__RefHeading___Toc5244_3385418132"/>
+      <w:bookmarkStart w:id="84" w:name="__RefHeading___Toc5244_1482924693"/>
       <w:bookmarkEnd w:id="84"/>
       <w:r>
         <w:rPr/>
@@ -41004,7 +41004,7 @@
         <w:outlineLvl w:val="1"/>
         <w:rPr/>
       </w:pPr>
-      <w:bookmarkStart w:id="85" w:name="__RefHeading___Toc5246_3385418132"/>
+      <w:bookmarkStart w:id="85" w:name="__RefHeading___Toc5246_1482924693"/>
       <w:bookmarkEnd w:id="85"/>
       <w:r>
         <w:rPr/>
@@ -41785,7 +41785,7 @@
         <w:outlineLvl w:val="1"/>
         <w:rPr/>
       </w:pPr>
-      <w:bookmarkStart w:id="86" w:name="__RefHeading___Toc5248_3385418132"/>
+      <w:bookmarkStart w:id="86" w:name="__RefHeading___Toc5248_1482924693"/>
       <w:bookmarkEnd w:id="86"/>
       <w:r>
         <w:rPr/>
@@ -41880,7 +41880,7 @@
         <w:outlineLvl w:val="1"/>
         <w:rPr/>
       </w:pPr>
-      <w:bookmarkStart w:id="87" w:name="__RefHeading___Toc5250_3385418132"/>
+      <w:bookmarkStart w:id="87" w:name="__RefHeading___Toc5250_1482924693"/>
       <w:bookmarkEnd w:id="87"/>
       <w:r>
         <w:rPr/>
@@ -42317,7 +42317,7 @@
       </w:r>
       <w:r>
         <w:rPr/>
-        <w:t xml:space="preserve">) liegen im µCSS-Repository unter </w:t>
+        <w:t xml:space="preserve">) liegen im µCSS™-Repository unter </w:t>
       </w:r>
       <w:r>
         <w:rPr>
@@ -42344,7 +42344,7 @@
         <w:outlineLvl w:val="1"/>
         <w:rPr/>
       </w:pPr>
-      <w:bookmarkStart w:id="88" w:name="__RefHeading___Toc5252_3385418132"/>
+      <w:bookmarkStart w:id="88" w:name="__RefHeading___Toc5252_1482924693"/>
       <w:bookmarkEnd w:id="88"/>
       <w:r>
         <w:rPr/>
@@ -42882,7 +42882,7 @@
         <w:outlineLvl w:val="0"/>
         <w:rPr/>
       </w:pPr>
-      <w:bookmarkStart w:id="89" w:name="__RefHeading___Toc5254_3385418132"/>
+      <w:bookmarkStart w:id="89" w:name="__RefHeading___Toc5254_1482924693"/>
       <w:bookmarkEnd w:id="89"/>
       <w:r>
         <w:rPr/>
@@ -42900,7 +42900,7 @@
         <w:outlineLvl w:val="1"/>
         <w:rPr/>
       </w:pPr>
-      <w:bookmarkStart w:id="90" w:name="__RefHeading___Toc5256_3385418132"/>
+      <w:bookmarkStart w:id="90" w:name="__RefHeading___Toc5256_1482924693"/>
       <w:bookmarkEnd w:id="90"/>
       <w:r>
         <w:rPr/>
@@ -43321,7 +43321,7 @@
         <w:outlineLvl w:val="1"/>
         <w:rPr/>
       </w:pPr>
-      <w:bookmarkStart w:id="91" w:name="__RefHeading___Toc5258_3385418132"/>
+      <w:bookmarkStart w:id="91" w:name="__RefHeading___Toc5258_1482924693"/>
       <w:bookmarkEnd w:id="91"/>
       <w:r>
         <w:rPr/>
@@ -43604,7 +43604,7 @@
         <w:outlineLvl w:val="1"/>
         <w:rPr/>
       </w:pPr>
-      <w:bookmarkStart w:id="92" w:name="__RefHeading___Toc5260_3385418132"/>
+      <w:bookmarkStart w:id="92" w:name="__RefHeading___Toc5260_1482924693"/>
       <w:bookmarkEnd w:id="92"/>
       <w:r>
         <w:rPr/>
@@ -43685,7 +43685,7 @@
       </w:r>
       <w:r>
         <w:rPr/>
-        <w:t xml:space="preserve"> mit drei Alpha-Nachkommastellen — identisch zum alten µCSS.</w:t>
+        <w:t xml:space="preserve"> mit drei Alpha-Nachkommastellen — identisch zum alten µCSS™.</w:t>
       </w:r>
     </w:p>
     <w:p>
@@ -43857,7 +43857,7 @@
         <w:outlineLvl w:val="0"/>
         <w:rPr/>
       </w:pPr>
-      <w:bookmarkStart w:id="93" w:name="__RefHeading___Toc5262_3385418132"/>
+      <w:bookmarkStart w:id="93" w:name="__RefHeading___Toc5262_1482924693"/>
       <w:bookmarkEnd w:id="93"/>
       <w:r>
         <w:rPr/>
@@ -43873,7 +43873,7 @@
       </w:pPr>
       <w:r>
         <w:rPr/>
-        <w:t>Neben dem Manifest-Workflow ist jede Schicht von µCSS auch direkt als Node-API nutzbar — etwa für eigene Gulp-Transformationen oder Tests.</w:t>
+        <w:t>Neben dem Manifest-Workflow ist jede Schicht von µCSS™ auch direkt als Node-API nutzbar — etwa für eigene Gulp-Transformationen oder Tests.</w:t>
       </w:r>
     </w:p>
     <w:tbl>
@@ -45074,7 +45074,7 @@
         <w:outlineLvl w:val="0"/>
         <w:rPr/>
       </w:pPr>
-      <w:bookmarkStart w:id="94" w:name="__RefHeading___Toc5264_3385418132"/>
+      <w:bookmarkStart w:id="94" w:name="__RefHeading___Toc5264_1482924693"/>
       <w:bookmarkEnd w:id="94"/>
       <w:r>
         <w:rPr/>
@@ -45590,11 +45590,11 @@
         <w:outlineLvl w:val="0"/>
         <w:rPr/>
       </w:pPr>
-      <w:bookmarkStart w:id="95" w:name="__RefHeading___Toc5266_3385418132"/>
+      <w:bookmarkStart w:id="95" w:name="__RefHeading___Toc5266_1482924693"/>
       <w:bookmarkEnd w:id="95"/>
       <w:r>
         <w:rPr/>
-        <w:t>15 Migration von µCSS</w:t>
+        <w:t>15 Migration von µCSS™</w:t>
       </w:r>
     </w:p>
     <w:p>
@@ -45619,7 +45619,7 @@
       </w:r>
       <w:r>
         <w:rPr/>
-        <w:t xml:space="preserve"> im µCSS-Repository), das die alte Syntax mechanisch übersetzt:</w:t>
+        <w:t xml:space="preserve"> im µCSS™-Repository), das die alte Syntax mechanisch übersetzt:</w:t>
       </w:r>
     </w:p>
     <w:tbl>
@@ -45665,7 +45665,7 @@
                 <w:b/>
                 <w:bCs/>
               </w:rPr>
-              <w:t>Alt (µCSS 1)</w:t>
+              <w:t>Alt (µCSS™ 1)</w:t>
             </w:r>
           </w:p>
         </w:tc>
@@ -45691,7 +45691,7 @@
                 <w:b/>
                 <w:bCs/>
               </w:rPr>
-              <w:t>Neu (µCSS 2)</w:t>
+              <w:t>Neu (µCSS™ 2)</w:t>
             </w:r>
           </w:p>
         </w:tc>
@@ -46393,7 +46393,7 @@
       </w:r>
       <w:r>
         <w:rPr/>
-        <w:t xml:space="preserve"> Das alte µCSS kopierte nur die bereits fertig erzeugten </w:t>
+        <w:t xml:space="preserve"> Das alte µCSS™ kopierte nur die bereits fertig erzeugten </w:t>
       </w:r>
       <w:r>
         <w:rPr>
@@ -46609,7 +46609,7 @@
       </w:pPr>
       <w:r>
         <w:rPr/>
-        <w:t>Der Konverter wurde an einem vollständigen Legacy-µCSS-1-Bestand validiert: Ein Vergleichswerkzeug (</w:t>
+        <w:t>Der Konverter wurde an einem vollständigen Legacy-µCSS™-1-Bestand validiert: Ein Vergleichswerkzeug (</w:t>
       </w:r>
       <w:r>
         <w:rPr>
@@ -46622,7 +46622,7 @@
       </w:r>
       <w:r>
         <w:rPr/>
-        <w:t>, nur Repository) baut den konvertierten Skin und vergleicht ihn regel- und property-weise gegen die alte kompilierte Ausgabe — Ergebnis: 2 951 Regeln, 0 unerwartete Differenzen (53 dokumentierte Drift-Fälle, z. B. nach dem letzten µCSS-Lauf editierte Quellen).</w:t>
+        <w:t>, nur Repository) baut den konvertierten Skin und vergleicht ihn regel- und property-weise gegen die alte kompilierte Ausgabe — Ergebnis: 2 951 Regeln, 0 unerwartete Differenzen (53 dokumentierte Drift-Fälle, z. B. nach dem letzten µCSS™-Lauf editierte Quellen).</w:t>
       </w:r>
     </w:p>
     <w:p>
@@ -46645,7 +46645,7 @@
       </w:r>
       <w:r>
         <w:rPr/>
-        <w:t xml:space="preserve"> übernommen wurden aus dem alten µCSS:</w:t>
+        <w:t xml:space="preserve"> übernommen wurden aus dem alten µCSS™:</w:t>
       </w:r>
     </w:p>
     <w:p>
@@ -46813,7 +46813,7 @@
         <w:outlineLvl w:val="0"/>
         <w:rPr/>
       </w:pPr>
-      <w:bookmarkStart w:id="96" w:name="__RefHeading___Toc5268_3385418132"/>
+      <w:bookmarkStart w:id="96" w:name="__RefHeading___Toc5268_1482924693"/>
       <w:bookmarkEnd w:id="96"/>
       <w:r>
         <w:rPr/>
@@ -46985,7 +46985,7 @@
             </w:pPr>
             <w:r>
               <w:rPr/>
-              <w:t xml:space="preserve">Ursprüngliches µCSS als Adobe-Photoshop-Script: </w:t>
+              <w:t xml:space="preserve">Ursprüngliches µCSS™ als Adobe-Photoshop-Script: </w:t>
             </w:r>
             <w:r>
               <w:rPr>
@@ -48626,7 +48626,7 @@
         <w:outlineLvl w:val="0"/>
         <w:rPr/>
       </w:pPr>
-      <w:bookmarkStart w:id="97" w:name="__RefHeading___Toc5270_3385418132"/>
+      <w:bookmarkStart w:id="97" w:name="__RefHeading___Toc5270_1482924693"/>
       <w:bookmarkEnd w:id="97"/>
       <w:r>
         <w:rPr/>
@@ -48668,7 +48668,7 @@
         <w:outlineLvl w:val="1"/>
         <w:rPr/>
       </w:pPr>
-      <w:bookmarkStart w:id="98" w:name="__RefHeading___Toc5272_3385418132"/>
+      <w:bookmarkStart w:id="98" w:name="__RefHeading___Toc5272_1482924693"/>
       <w:bookmarkEnd w:id="98"/>
       <w:r>
         <w:rPr/>
@@ -48722,7 +48722,7 @@
         <w:outlineLvl w:val="1"/>
         <w:rPr/>
       </w:pPr>
-      <w:bookmarkStart w:id="99" w:name="__RefHeading___Toc5274_3385418132"/>
+      <w:bookmarkStart w:id="99" w:name="__RefHeading___Toc5274_1482924693"/>
       <w:bookmarkEnd w:id="99"/>
       <w:r>
         <w:rPr/>
@@ -48752,7 +48752,7 @@
         <w:outlineLvl w:val="1"/>
         <w:rPr/>
       </w:pPr>
-      <w:bookmarkStart w:id="100" w:name="__RefHeading___Toc5276_3385418132"/>
+      <w:bookmarkStart w:id="100" w:name="__RefHeading___Toc5276_1482924693"/>
       <w:bookmarkEnd w:id="100"/>
       <w:r>
         <w:rPr/>
@@ -48768,7 +48768,7 @@
       </w:pPr>
       <w:r>
         <w:rPr/>
-        <w:t>µCSS und µPS nutzen Open-Source-Bibliotheken Dritter, insbesondere PostCSS (CSS-Parser, MIT-Lizenz), sharp (Bildverarbeitung, Apache-2.0-Lizenz), ag-psd (PSD-Leser, MIT-Lizenz) und uglifycss (CSS-Minifizierung, MIT-Lizenz). Der Bin-Packer des Sprite-Atlas basiert auf node-bin-packing (©2011 Jake Gordon und Mitwirkende, MIT-Lizenz).</w:t>
+        <w:t>µCSS™ und µPS nutzen Open-Source-Bibliotheken Dritter, insbesondere PostCSS (CSS-Parser, MIT-Lizenz), sharp (Bildverarbeitung, Apache-2.0-Lizenz), ag-psd (PSD-Leser, MIT-Lizenz) und uglifycss (CSS-Minifizierung, MIT-Lizenz). Der Bin-Packer des Sprite-Atlas basiert auf node-bin-packing (©2011 Jake Gordon und Mitwirkende, MIT-Lizenz).</w:t>
       </w:r>
     </w:p>
     <w:sectPr>

</xml_diff>